<commit_message>
More template edits to track down an error.
</commit_message>
<xml_diff>
--- a/docassemble/MAEvictionDefense/data/templates/SummaryProcessDiscovery.docx
+++ b/docassemble/MAEvictionDefense/data/templates/SummaryProcessDiscovery.docx
@@ -146,7 +146,7 @@
         <w:pStyle w:val="BodyText"/>
         <w:spacing w:line="360" w:lineRule="auto"/>
         <w:rPr>
-          <w:rFonts w:ascii="Times New Roman;serif" w:hAnsi="Times New Roman;serif"/>
+          <w:rFonts w:ascii="Times New Roman;serif" w:hAnsi="Times New Roman;serif" w:hint="eastAsia"/>
         </w:rPr>
       </w:pPr>
       <w:r>
@@ -5027,6 +5027,7 @@
     <w:p>
       <w:pPr>
         <w:pStyle w:val="CenterTitle"/>
+        <w:spacing w:line="276" w:lineRule="auto"/>
         <w:rPr>
           <w:b w:val="0"/>
           <w:sz w:val="24"/>
@@ -5302,7 +5303,7 @@
     <w:p>
       <w:pPr>
         <w:pStyle w:val="CenterTitle"/>
-        <w:spacing w:line="360" w:lineRule="auto"/>
+        <w:spacing w:line="276" w:lineRule="auto"/>
         <w:rPr>
           <w:b w:val="0"/>
           <w:sz w:val="24"/>
@@ -5342,7 +5343,7 @@
     <w:p>
       <w:pPr>
         <w:pStyle w:val="CenterTitle"/>
-        <w:spacing w:line="360" w:lineRule="auto"/>
+        <w:spacing w:line="276" w:lineRule="auto"/>
         <w:rPr>
           <w:b w:val="0"/>
           <w:sz w:val="24"/>
@@ -5354,18 +5355,21 @@
       <w:pPr>
         <w:pStyle w:val="CenterTitle"/>
         <w:spacing w:line="360" w:lineRule="auto"/>
-      </w:pPr>
-      <w:r>
         <w:rPr>
           <w:rFonts w:ascii="Times New Roman;serif" w:hAnsi="Times New Roman;serif"/>
         </w:rPr>
+      </w:pPr>
+      <w:r>
+        <w:rPr>
+          <w:rFonts w:ascii="Times New Roman;serif" w:hAnsi="Times New Roman;serif"/>
+        </w:rPr>
         <w:t>Disability</w:t>
       </w:r>
     </w:p>
     <w:p>
       <w:pPr>
         <w:pStyle w:val="CenterTitle"/>
-        <w:spacing w:line="360" w:lineRule="auto"/>
+        <w:spacing w:line="276" w:lineRule="auto"/>
         <w:rPr>
           <w:b w:val="0"/>
           <w:sz w:val="24"/>
@@ -12243,6 +12247,7 @@
   <w:style w:type="character" w:default="1" w:styleId="DefaultParagraphFont">
     <w:name w:val="Default Paragraph Font"/>
     <w:uiPriority w:val="1"/>
+    <w:semiHidden/>
     <w:unhideWhenUsed/>
   </w:style>
   <w:style w:type="table" w:default="1" w:styleId="TableNormal">

</xml_diff>

<commit_message>
Updated the RAFT/assistance interrogatory under landlord and updated document request.
</commit_message>
<xml_diff>
--- a/docassemble/MAEvictionDefense/data/templates/SummaryProcessDiscovery.docx
+++ b/docassemble/MAEvictionDefense/data/templates/SummaryProcessDiscovery.docx
@@ -1,6 +1,6 @@
 
 <file path=word/document.xml><?xml version="1.0" encoding="utf-8"?>
-<w:document xmlns:wpc="http://schemas.microsoft.com/office/word/2010/wordprocessingCanvas" xmlns:cx="http://schemas.microsoft.com/office/drawing/2014/chartex" xmlns:cx1="http://schemas.microsoft.com/office/drawing/2015/9/8/chartex" xmlns:cx2="http://schemas.microsoft.com/office/drawing/2015/10/21/chartex" xmlns:cx3="http://schemas.microsoft.com/office/drawing/2016/5/9/chartex" xmlns:cx4="http://schemas.microsoft.com/office/drawing/2016/5/10/chartex" xmlns:cx5="http://schemas.microsoft.com/office/drawing/2016/5/11/chartex" xmlns:cx6="http://schemas.microsoft.com/office/drawing/2016/5/12/chartex" xmlns:cx7="http://schemas.microsoft.com/office/drawing/2016/5/13/chartex" xmlns:cx8="http://schemas.microsoft.com/office/drawing/2016/5/14/chartex" xmlns:mc="http://schemas.openxmlformats.org/markup-compatibility/2006" xmlns:aink="http://schemas.microsoft.com/office/drawing/2016/ink" xmlns:am3d="http://schemas.microsoft.com/office/drawing/2017/model3d" xmlns:o="urn:schemas-microsoft-com:office:office" xmlns:r="http://schemas.openxmlformats.org/officeDocument/2006/relationships" xmlns:m="http://schemas.openxmlformats.org/officeDocument/2006/math" xmlns:v="urn:schemas-microsoft-com:vml" xmlns:wp14="http://schemas.microsoft.com/office/word/2010/wordprocessingDrawing" xmlns:wp="http://schemas.openxmlformats.org/drawingml/2006/wordprocessingDrawing" xmlns:w10="urn:schemas-microsoft-com:office:word" xmlns:w="http://schemas.openxmlformats.org/wordprocessingml/2006/main" xmlns:w14="http://schemas.microsoft.com/office/word/2010/wordml" xmlns:w15="http://schemas.microsoft.com/office/word/2012/wordml" xmlns:w16cex="http://schemas.microsoft.com/office/word/2018/wordml/cex" xmlns:w16cid="http://schemas.microsoft.com/office/word/2016/wordml/cid" xmlns:w16="http://schemas.microsoft.com/office/word/2018/wordml" xmlns:w16sdtdh="http://schemas.microsoft.com/office/word/2020/wordml/sdtdatahash" xmlns:w16se="http://schemas.microsoft.com/office/word/2015/wordml/symex" xmlns:wpg="http://schemas.microsoft.com/office/word/2010/wordprocessingGroup" xmlns:wpi="http://schemas.microsoft.com/office/word/2010/wordprocessingInk" xmlns:wne="http://schemas.microsoft.com/office/word/2006/wordml" xmlns:wps="http://schemas.microsoft.com/office/word/2010/wordprocessingShape" mc:Ignorable="w14 w15 w16se w16cid w16 w16cex w16sdtdh wp14">
+<w:document xmlns:wpc="http://schemas.microsoft.com/office/word/2010/wordprocessingCanvas" xmlns:cx="http://schemas.microsoft.com/office/drawing/2014/chartex" xmlns:cx1="http://schemas.microsoft.com/office/drawing/2015/9/8/chartex" xmlns:cx2="http://schemas.microsoft.com/office/drawing/2015/10/21/chartex" xmlns:cx3="http://schemas.microsoft.com/office/drawing/2016/5/9/chartex" xmlns:cx4="http://schemas.microsoft.com/office/drawing/2016/5/10/chartex" xmlns:cx5="http://schemas.microsoft.com/office/drawing/2016/5/11/chartex" xmlns:cx6="http://schemas.microsoft.com/office/drawing/2016/5/12/chartex" xmlns:cx7="http://schemas.microsoft.com/office/drawing/2016/5/13/chartex" xmlns:cx8="http://schemas.microsoft.com/office/drawing/2016/5/14/chartex" xmlns:mc="http://schemas.openxmlformats.org/markup-compatibility/2006" xmlns:aink="http://schemas.microsoft.com/office/drawing/2016/ink" xmlns:am3d="http://schemas.microsoft.com/office/drawing/2017/model3d" xmlns:o="urn:schemas-microsoft-com:office:office" xmlns:oel="http://schemas.microsoft.com/office/2019/extlst" xmlns:r="http://schemas.openxmlformats.org/officeDocument/2006/relationships" xmlns:m="http://schemas.openxmlformats.org/officeDocument/2006/math" xmlns:v="urn:schemas-microsoft-com:vml" xmlns:wp14="http://schemas.microsoft.com/office/word/2010/wordprocessingDrawing" xmlns:wp="http://schemas.openxmlformats.org/drawingml/2006/wordprocessingDrawing" xmlns:w10="urn:schemas-microsoft-com:office:word" xmlns:w="http://schemas.openxmlformats.org/wordprocessingml/2006/main" xmlns:w14="http://schemas.microsoft.com/office/word/2010/wordml" xmlns:w15="http://schemas.microsoft.com/office/word/2012/wordml" xmlns:w16cex="http://schemas.microsoft.com/office/word/2018/wordml/cex" xmlns:w16cid="http://schemas.microsoft.com/office/word/2016/wordml/cid" xmlns:w16="http://schemas.microsoft.com/office/word/2018/wordml" xmlns:w16sdtdh="http://schemas.microsoft.com/office/word/2020/wordml/sdtdatahash" xmlns:w16se="http://schemas.microsoft.com/office/word/2015/wordml/symex" xmlns:wpg="http://schemas.microsoft.com/office/word/2010/wordprocessingGroup" xmlns:wpi="http://schemas.microsoft.com/office/word/2010/wordprocessingInk" xmlns:wne="http://schemas.microsoft.com/office/word/2006/wordml" xmlns:wps="http://schemas.microsoft.com/office/word/2010/wordprocessingShape" mc:Ignorable="w14 w15 w16se w16cid w16 w16cex w16sdtdh wp14">
   <w:body>
     <w:p>
       <w:pPr>
@@ -1557,15 +1557,24 @@
       </w:pPr>
       <w:r>
         <w:lastRenderedPageBreak/>
-        <w:t xml:space="preserve">If the tenant has ever offered assistance from any third party or agency to pay the rent, please identify the agency or </w:t>
-      </w:r>
-      <w:proofErr w:type="gramStart"/>
-      <w:r>
-        <w:t>third party</w:t>
-      </w:r>
-      <w:proofErr w:type="gramEnd"/>
-      <w:r>
-        <w:t xml:space="preserve"> assistance offered by the tenant or anyone on his/her behalf, the substance of the offer, the date on which it was made, and your response.</w:t>
+        <w:t>Please describe in full and complete detail your communications with the tenant and/or any representative of a RAFT or other rental assistance or subsidy program related to the tenant's application for assistance, including for each communication, the date and substance of each conversation/communication (whether verbal or written) and persons involved.</w:t>
+      </w:r>
+    </w:p>
+    <w:p>
+      <w:pPr>
+        <w:pStyle w:val="BodyText"/>
+        <w:numPr>
+          <w:ilvl w:val="0"/>
+          <w:numId w:val="8"/>
+        </w:numPr>
+        <w:spacing w:after="144"/>
+        <w:contextualSpacing/>
+      </w:pPr>
+      <w:r>
+        <w:t>I</w:t>
+      </w:r>
+      <w:r>
+        <w:t>f you have refused to accept rental assistance from RAFT or any other rental assistance/subsidy program (or intend to refuse such assistance if approved), please describe in full and complete detail the reasons for such refusal.</w:t>
       </w:r>
     </w:p>
     <w:p>
@@ -2141,6 +2150,7 @@
         <w:contextualSpacing/>
       </w:pPr>
       <w:r>
+        <w:lastRenderedPageBreak/>
         <w:t>P</w:t>
       </w:r>
       <w:r>
@@ -2154,7 +2164,6 @@
         <w:contextualSpacing/>
       </w:pPr>
       <w:r>
-        <w:lastRenderedPageBreak/>
         <w:t>{%p endif %}</w:t>
       </w:r>
     </w:p>
@@ -2737,6 +2746,7 @@
         <w:contextualSpacing/>
       </w:pPr>
       <w:r>
+        <w:lastRenderedPageBreak/>
         <w:t>If you have requested an increase to the contract rent during the past twelve months, please describe any such request in full and complete detail, including, but not limited to:</w:t>
       </w:r>
     </w:p>
@@ -2808,7 +2818,6 @@
         <w:contextualSpacing/>
       </w:pPr>
       <w:r>
-        <w:lastRenderedPageBreak/>
         <w:t xml:space="preserve">The date and manner of the </w:t>
       </w:r>
       <w:proofErr w:type="gramStart"/>
@@ -3312,6 +3321,7 @@
         <w:contextualSpacing/>
       </w:pPr>
       <w:r>
+        <w:lastRenderedPageBreak/>
         <w:t>The date and substance of any communications with the inspector or other representatives of the agency; and</w:t>
       </w:r>
     </w:p>
@@ -3381,8 +3391,601 @@
         <w:contextualSpacing/>
       </w:pPr>
       <w:r>
+        <w:t>If the landlord before, at the time of, or immediately following the purchase or acquisition of the apartment or building, obtained any inspections, assessments or evaluations of the apartment and/or building, for each such inspection, assessment or evaluation state:</w:t>
+      </w:r>
+    </w:p>
+    <w:p>
+      <w:pPr>
+        <w:pStyle w:val="BodyText"/>
+        <w:numPr>
+          <w:ilvl w:val="1"/>
+          <w:numId w:val="8"/>
+        </w:numPr>
+        <w:spacing w:after="144"/>
+        <w:contextualSpacing/>
+      </w:pPr>
+      <w:r>
+        <w:t xml:space="preserve">The </w:t>
+      </w:r>
+      <w:proofErr w:type="gramStart"/>
+      <w:r>
+        <w:t>date;</w:t>
+      </w:r>
+      <w:proofErr w:type="gramEnd"/>
+    </w:p>
+    <w:p>
+      <w:pPr>
+        <w:pStyle w:val="BodyText"/>
+        <w:numPr>
+          <w:ilvl w:val="1"/>
+          <w:numId w:val="8"/>
+        </w:numPr>
+        <w:spacing w:after="144"/>
+        <w:contextualSpacing/>
+      </w:pPr>
+      <w:r>
+        <w:t xml:space="preserve">The name, address, </w:t>
+      </w:r>
+      <w:r>
+        <w:t xml:space="preserve">email </w:t>
+      </w:r>
+      <w:r>
+        <w:t xml:space="preserve">and telephone number of the person or agency who/that performed </w:t>
+      </w:r>
+      <w:proofErr w:type="gramStart"/>
+      <w:r>
+        <w:t>it;</w:t>
+      </w:r>
+      <w:proofErr w:type="gramEnd"/>
+    </w:p>
+    <w:p>
+      <w:pPr>
+        <w:pStyle w:val="BodyText"/>
+        <w:numPr>
+          <w:ilvl w:val="1"/>
+          <w:numId w:val="8"/>
+        </w:numPr>
+        <w:spacing w:after="144"/>
+        <w:contextualSpacing/>
+      </w:pPr>
+      <w:r>
+        <w:t xml:space="preserve">When you received or became aware of the inspection, assessment or </w:t>
+      </w:r>
+      <w:proofErr w:type="gramStart"/>
+      <w:r>
+        <w:t>evaluation;</w:t>
+      </w:r>
+      <w:proofErr w:type="gramEnd"/>
+    </w:p>
+    <w:p>
+      <w:pPr>
+        <w:pStyle w:val="BodyText"/>
+        <w:numPr>
+          <w:ilvl w:val="1"/>
+          <w:numId w:val="8"/>
+        </w:numPr>
+        <w:spacing w:after="144"/>
+        <w:contextualSpacing/>
+      </w:pPr>
+      <w:r>
+        <w:t>The contents thereof, stating specifically what problems or conditions were noted; and</w:t>
+      </w:r>
+    </w:p>
+    <w:p>
+      <w:pPr>
+        <w:pStyle w:val="BodyText"/>
+        <w:numPr>
+          <w:ilvl w:val="1"/>
+          <w:numId w:val="8"/>
+        </w:numPr>
+        <w:spacing w:after="144"/>
+        <w:contextualSpacing/>
+      </w:pPr>
+      <w:r>
+        <w:t>What, if anything, you did in response to such inspection, assessment, or evaluation.</w:t>
+      </w:r>
+    </w:p>
+    <w:p>
+      <w:pPr>
+        <w:pStyle w:val="BodyText"/>
+        <w:spacing w:after="144"/>
+        <w:contextualSpacing/>
+      </w:pPr>
+      <w:r>
+        <w:t>{%p endif %}</w:t>
+      </w:r>
+    </w:p>
+    <w:p>
+      <w:pPr>
+        <w:pStyle w:val="BodyText"/>
+        <w:numPr>
+          <w:ilvl w:val="0"/>
+          <w:numId w:val="8"/>
+        </w:numPr>
+        <w:spacing w:after="144"/>
+        <w:contextualSpacing/>
+      </w:pPr>
+      <w:r>
+        <w:t xml:space="preserve">{%p if </w:t>
+      </w:r>
+      <w:proofErr w:type="spellStart"/>
+      <w:r>
+        <w:t>ints.get</w:t>
+      </w:r>
+      <w:proofErr w:type="spellEnd"/>
+      <w:r>
+        <w:t>('</w:t>
+      </w:r>
+      <w:r>
+        <w:t>bad_conditions_attempted_repairs</w:t>
+      </w:r>
+      <w:proofErr w:type="gramStart"/>
+      <w:r>
+        <w:t>',</w:t>
+      </w:r>
+      <w:proofErr w:type="spellStart"/>
+      <w:r>
+        <w:t>DAEmpty</w:t>
+      </w:r>
+      <w:proofErr w:type="spellEnd"/>
+      <w:proofErr w:type="gramEnd"/>
+      <w:r>
+        <w:t>()).checked</w:t>
+      </w:r>
+      <w:r>
+        <w:t xml:space="preserve"> %}</w:t>
+      </w:r>
+    </w:p>
+    <w:p>
+      <w:pPr>
+        <w:pStyle w:val="BodyText"/>
+        <w:numPr>
+          <w:ilvl w:val="0"/>
+          <w:numId w:val="8"/>
+        </w:numPr>
+        <w:spacing w:after="144"/>
+        <w:contextualSpacing/>
+      </w:pPr>
+      <w:r>
+        <w:t>If the landlord has made or attempted to make inspections and/or repairs (including exterminations) to the tenant’s apartment and/or common areas and systems of the building</w:t>
+      </w:r>
+      <w:r>
+        <w:t xml:space="preserve"> </w:t>
+      </w:r>
+      <w:r>
+        <w:t>within the most recent 6 years of the tenant’s tenancy</w:t>
+      </w:r>
+      <w:r>
+        <w:t>, for each such inspection and/or repair (or attempt), including extermination, please state:</w:t>
+      </w:r>
+    </w:p>
+    <w:p>
+      <w:pPr>
+        <w:pStyle w:val="BodyText"/>
+        <w:numPr>
+          <w:ilvl w:val="1"/>
+          <w:numId w:val="8"/>
+        </w:numPr>
+        <w:spacing w:after="144"/>
+        <w:contextualSpacing/>
+      </w:pPr>
+      <w:r>
+        <w:t xml:space="preserve">A description of each inspection and/or </w:t>
+      </w:r>
+      <w:proofErr w:type="gramStart"/>
+      <w:r>
+        <w:t>repair;</w:t>
+      </w:r>
+      <w:proofErr w:type="gramEnd"/>
+    </w:p>
+    <w:p>
+      <w:pPr>
+        <w:pStyle w:val="BodyText"/>
+        <w:numPr>
+          <w:ilvl w:val="1"/>
+          <w:numId w:val="8"/>
+        </w:numPr>
+        <w:spacing w:after="144"/>
+        <w:contextualSpacing/>
+      </w:pPr>
+      <w:r>
+        <w:t>How and when you let the tenant know of your plan to inspect and/or to repair (including whether there was written notice to the tenant</w:t>
+      </w:r>
+      <w:proofErr w:type="gramStart"/>
+      <w:r>
+        <w:t>);</w:t>
+      </w:r>
+      <w:proofErr w:type="gramEnd"/>
+    </w:p>
+    <w:p>
+      <w:pPr>
+        <w:pStyle w:val="BodyText"/>
+        <w:numPr>
+          <w:ilvl w:val="1"/>
+          <w:numId w:val="8"/>
+        </w:numPr>
+        <w:spacing w:after="144"/>
+        <w:contextualSpacing/>
+      </w:pPr>
+      <w:r>
+        <w:t xml:space="preserve">The date of each inspection and/or </w:t>
+      </w:r>
+      <w:proofErr w:type="gramStart"/>
+      <w:r>
+        <w:t>repair;</w:t>
+      </w:r>
+      <w:proofErr w:type="gramEnd"/>
+    </w:p>
+    <w:p>
+      <w:pPr>
+        <w:pStyle w:val="BodyText"/>
+        <w:numPr>
+          <w:ilvl w:val="1"/>
+          <w:numId w:val="8"/>
+        </w:numPr>
+        <w:spacing w:after="144"/>
+        <w:contextualSpacing/>
+      </w:pPr>
+      <w:r>
+        <w:t xml:space="preserve">The name, address, and </w:t>
+      </w:r>
+      <w:r>
+        <w:t xml:space="preserve">email and </w:t>
+      </w:r>
+      <w:r>
+        <w:t>telephone number of the company/person who made each inspection and/or repair; and</w:t>
+      </w:r>
+    </w:p>
+    <w:p>
+      <w:pPr>
+        <w:pStyle w:val="BodyText"/>
+        <w:numPr>
+          <w:ilvl w:val="1"/>
+          <w:numId w:val="8"/>
+        </w:numPr>
+        <w:spacing w:after="144"/>
+        <w:contextualSpacing/>
+      </w:pPr>
+      <w:r>
+        <w:t>The cost of each repair, if applicable.</w:t>
+      </w:r>
+    </w:p>
+    <w:p>
+      <w:pPr>
+        <w:pStyle w:val="BodyText"/>
+        <w:numPr>
+          <w:ilvl w:val="1"/>
+          <w:numId w:val="8"/>
+        </w:numPr>
+        <w:spacing w:after="144"/>
+        <w:contextualSpacing/>
+      </w:pPr>
+      <w:r>
+        <w:t>For repairs, how and when you first knew of the condition that needed to be repaired.</w:t>
+      </w:r>
+    </w:p>
+    <w:p>
+      <w:pPr>
+        <w:pStyle w:val="BodyText"/>
+        <w:spacing w:after="144"/>
+        <w:contextualSpacing/>
+      </w:pPr>
+      <w:r>
+        <w:t>{%p endif %}</w:t>
+      </w:r>
+    </w:p>
+    <w:p>
+      <w:pPr>
+        <w:pStyle w:val="BodyText"/>
+        <w:numPr>
+          <w:ilvl w:val="0"/>
+          <w:numId w:val="8"/>
+        </w:numPr>
+        <w:spacing w:after="144"/>
+        <w:contextualSpacing/>
+      </w:pPr>
+      <w:r>
+        <w:t xml:space="preserve">{%p if </w:t>
+      </w:r>
+      <w:proofErr w:type="spellStart"/>
+      <w:r>
+        <w:t>ints.get</w:t>
+      </w:r>
+      <w:proofErr w:type="spellEnd"/>
+      <w:r>
+        <w:t>('</w:t>
+      </w:r>
+      <w:r>
+        <w:t>lead_paint</w:t>
+      </w:r>
+      <w:proofErr w:type="gramStart"/>
+      <w:r>
+        <w:t>',</w:t>
+      </w:r>
+      <w:proofErr w:type="spellStart"/>
+      <w:r>
+        <w:t>DAEmpty</w:t>
+      </w:r>
+      <w:proofErr w:type="spellEnd"/>
+      <w:proofErr w:type="gramEnd"/>
+      <w:r>
+        <w:t>()).checked</w:t>
+      </w:r>
+      <w:r>
+        <w:t xml:space="preserve"> %}</w:t>
+      </w:r>
+    </w:p>
+    <w:p>
+      <w:pPr>
+        <w:pStyle w:val="BodyText"/>
+        <w:numPr>
+          <w:ilvl w:val="0"/>
+          <w:numId w:val="8"/>
+        </w:numPr>
+        <w:spacing w:after="144"/>
+        <w:contextualSpacing/>
+      </w:pPr>
+      <w:r>
+        <w:t>If you have ever learned of or tried to discover whether there is lead paint in the tenant’s apartment and/or building, please provide:</w:t>
+      </w:r>
+    </w:p>
+    <w:p>
+      <w:pPr>
+        <w:pStyle w:val="BodyText"/>
+        <w:numPr>
+          <w:ilvl w:val="1"/>
+          <w:numId w:val="8"/>
+        </w:numPr>
+        <w:spacing w:after="144"/>
+        <w:contextualSpacing/>
+      </w:pPr>
+      <w:r>
+        <w:t>A full and complete description of your investigation and/or knowledge/information regarding the presence (or absence) of lead paint in the apartment and/or building, including, but not limited to:</w:t>
+      </w:r>
+    </w:p>
+    <w:p>
+      <w:pPr>
+        <w:pStyle w:val="BodyText"/>
+        <w:numPr>
+          <w:ilvl w:val="2"/>
+          <w:numId w:val="8"/>
+        </w:numPr>
+        <w:spacing w:after="144"/>
+        <w:contextualSpacing/>
+      </w:pPr>
+      <w:r>
+        <w:t>The substance of any inspections, investigation or knowledge/</w:t>
+      </w:r>
+      <w:proofErr w:type="gramStart"/>
+      <w:r>
+        <w:t>information;</w:t>
+      </w:r>
+      <w:proofErr w:type="gramEnd"/>
+    </w:p>
+    <w:p>
+      <w:pPr>
+        <w:pStyle w:val="BodyText"/>
+        <w:numPr>
+          <w:ilvl w:val="2"/>
+          <w:numId w:val="8"/>
+        </w:numPr>
+        <w:spacing w:after="144"/>
+        <w:contextualSpacing/>
+      </w:pPr>
+      <w:r>
+        <w:t xml:space="preserve">The name, address, </w:t>
+      </w:r>
+      <w:r>
+        <w:t xml:space="preserve">email </w:t>
+      </w:r>
+      <w:r>
+        <w:t xml:space="preserve">and telephone number of any person/company with </w:t>
+      </w:r>
+      <w:proofErr w:type="gramStart"/>
+      <w:r>
+        <w:t>information;</w:t>
+      </w:r>
+      <w:proofErr w:type="gramEnd"/>
+      <w:r>
+        <w:t xml:space="preserve"> </w:t>
+      </w:r>
+    </w:p>
+    <w:p>
+      <w:pPr>
+        <w:pStyle w:val="BodyText"/>
+        <w:numPr>
+          <w:ilvl w:val="2"/>
+          <w:numId w:val="8"/>
+        </w:numPr>
+        <w:spacing w:after="144"/>
+        <w:contextualSpacing/>
+      </w:pPr>
+      <w:r>
+        <w:t>The date(s) that you conducted such investigation or otherwise acquired such knowledge/</w:t>
+      </w:r>
+      <w:proofErr w:type="gramStart"/>
+      <w:r>
+        <w:t>information;</w:t>
+      </w:r>
+      <w:proofErr w:type="gramEnd"/>
+    </w:p>
+    <w:p>
+      <w:pPr>
+        <w:pStyle w:val="BodyText"/>
+        <w:numPr>
+          <w:ilvl w:val="1"/>
+          <w:numId w:val="8"/>
+        </w:numPr>
+        <w:spacing w:after="144"/>
+        <w:contextualSpacing/>
+      </w:pPr>
+      <w:r>
         <w:lastRenderedPageBreak/>
-        <w:t>If the landlord before, at the time of, or immediately following the purchase or acquisition of the apartment or building, obtained any inspections, assessments or evaluations of the apartment and/or building, for each such inspection, assessment or evaluation state:</w:t>
+        <w:t xml:space="preserve">A full and complete description of any steps you have taken regarding the presence of lead paint in the apartment and/or building (i.e., </w:t>
+      </w:r>
+      <w:proofErr w:type="gramStart"/>
+      <w:r>
+        <w:t>any and all</w:t>
+      </w:r>
+      <w:proofErr w:type="gramEnd"/>
+      <w:r>
+        <w:t xml:space="preserve"> inspections not identified above and/or abatement of any lead paint hazard), including, but not limited to:</w:t>
+      </w:r>
+    </w:p>
+    <w:p>
+      <w:pPr>
+        <w:pStyle w:val="BodyText"/>
+        <w:numPr>
+          <w:ilvl w:val="2"/>
+          <w:numId w:val="8"/>
+        </w:numPr>
+        <w:spacing w:after="144"/>
+        <w:contextualSpacing/>
+      </w:pPr>
+      <w:r>
+        <w:t xml:space="preserve">The substance of all action taken or work </w:t>
+      </w:r>
+      <w:proofErr w:type="gramStart"/>
+      <w:r>
+        <w:t>performed;</w:t>
+      </w:r>
+      <w:proofErr w:type="gramEnd"/>
+      <w:r>
+        <w:t xml:space="preserve"> </w:t>
+      </w:r>
+    </w:p>
+    <w:p>
+      <w:pPr>
+        <w:pStyle w:val="BodyText"/>
+        <w:numPr>
+          <w:ilvl w:val="2"/>
+          <w:numId w:val="8"/>
+        </w:numPr>
+        <w:spacing w:after="144"/>
+        <w:contextualSpacing/>
+      </w:pPr>
+      <w:r>
+        <w:t xml:space="preserve">The date(s) </w:t>
+      </w:r>
+      <w:proofErr w:type="gramStart"/>
+      <w:r>
+        <w:t>thereof;</w:t>
+      </w:r>
+      <w:proofErr w:type="gramEnd"/>
+      <w:r>
+        <w:t xml:space="preserve"> </w:t>
+      </w:r>
+    </w:p>
+    <w:p>
+      <w:pPr>
+        <w:pStyle w:val="BodyText"/>
+        <w:numPr>
+          <w:ilvl w:val="2"/>
+          <w:numId w:val="8"/>
+        </w:numPr>
+        <w:spacing w:after="144"/>
+        <w:contextualSpacing/>
+      </w:pPr>
+      <w:r>
+        <w:t xml:space="preserve">Who did what work (name, address, company, </w:t>
+      </w:r>
+      <w:r>
+        <w:t xml:space="preserve">email, </w:t>
+      </w:r>
+      <w:r>
+        <w:t xml:space="preserve">telephone number, and license number of the </w:t>
+      </w:r>
+      <w:proofErr w:type="spellStart"/>
+      <w:r>
+        <w:t>deleader</w:t>
+      </w:r>
+      <w:proofErr w:type="spellEnd"/>
+      <w:proofErr w:type="gramStart"/>
+      <w:r>
+        <w:t>);</w:t>
+      </w:r>
+      <w:proofErr w:type="gramEnd"/>
+      <w:r>
+        <w:t xml:space="preserve"> </w:t>
+      </w:r>
+    </w:p>
+    <w:p>
+      <w:pPr>
+        <w:pStyle w:val="BodyText"/>
+        <w:numPr>
+          <w:ilvl w:val="2"/>
+          <w:numId w:val="8"/>
+        </w:numPr>
+        <w:spacing w:after="144"/>
+        <w:contextualSpacing/>
+      </w:pPr>
+      <w:r>
+        <w:t>The details of any arrangements for relocation of the tenant during the abatement process (including where the tenant was relocated, how the tenant was relocated, and the payment of any costs associated with such relocation).</w:t>
+      </w:r>
+    </w:p>
+    <w:p>
+      <w:pPr>
+        <w:pStyle w:val="BodyText"/>
+        <w:spacing w:after="144"/>
+        <w:contextualSpacing/>
+      </w:pPr>
+      <w:r>
+        <w:t>{%p endif %}</w:t>
+      </w:r>
+    </w:p>
+    <w:p>
+      <w:pPr>
+        <w:pStyle w:val="BodyText"/>
+        <w:numPr>
+          <w:ilvl w:val="0"/>
+          <w:numId w:val="8"/>
+        </w:numPr>
+        <w:spacing w:after="144"/>
+        <w:contextualSpacing/>
+      </w:pPr>
+      <w:r>
+        <w:t xml:space="preserve">{%p if </w:t>
+      </w:r>
+      <w:proofErr w:type="spellStart"/>
+      <w:r>
+        <w:t>ints.get</w:t>
+      </w:r>
+      <w:proofErr w:type="spellEnd"/>
+      <w:r>
+        <w:t>('</w:t>
+      </w:r>
+      <w:r>
+        <w:t>bad_conditions_tenant_damaged</w:t>
+      </w:r>
+      <w:proofErr w:type="gramStart"/>
+      <w:r>
+        <w:t>',</w:t>
+      </w:r>
+      <w:proofErr w:type="spellStart"/>
+      <w:r>
+        <w:t>DAEmpty</w:t>
+      </w:r>
+      <w:proofErr w:type="spellEnd"/>
+      <w:proofErr w:type="gramEnd"/>
+      <w:r>
+        <w:t>()).checked</w:t>
+      </w:r>
+      <w:r>
+        <w:t xml:space="preserve"> %}</w:t>
+      </w:r>
+    </w:p>
+    <w:p>
+      <w:pPr>
+        <w:pStyle w:val="BodyText"/>
+        <w:numPr>
+          <w:ilvl w:val="0"/>
+          <w:numId w:val="8"/>
+        </w:numPr>
+        <w:spacing w:after="144"/>
+        <w:contextualSpacing/>
+      </w:pPr>
+      <w:r>
+        <w:t>If you claim that the tenant caused any damage to the apartment and/or building, please describe such damage in full and complete detail, including, but not limited to:</w:t>
       </w:r>
     </w:p>
     <w:p>
@@ -3396,13 +3999,16 @@
         <w:contextualSpacing/>
       </w:pPr>
       <w:r>
-        <w:t xml:space="preserve">The </w:t>
-      </w:r>
-      <w:proofErr w:type="gramStart"/>
-      <w:r>
-        <w:t>date;</w:t>
-      </w:r>
-      <w:proofErr w:type="gramEnd"/>
+        <w:t xml:space="preserve">The substance of such </w:t>
+      </w:r>
+      <w:proofErr w:type="gramStart"/>
+      <w:r>
+        <w:t>damage;</w:t>
+      </w:r>
+      <w:proofErr w:type="gramEnd"/>
+      <w:r>
+        <w:t xml:space="preserve"> </w:t>
+      </w:r>
     </w:p>
     <w:p>
       <w:pPr>
@@ -3415,19 +4021,117 @@
         <w:contextualSpacing/>
       </w:pPr>
       <w:r>
-        <w:t xml:space="preserve">The name, address, </w:t>
+        <w:t xml:space="preserve">Why you believe the tenant caused the </w:t>
+      </w:r>
+      <w:proofErr w:type="gramStart"/>
+      <w:r>
+        <w:t>damage;</w:t>
+      </w:r>
+      <w:proofErr w:type="gramEnd"/>
+    </w:p>
+    <w:p>
+      <w:pPr>
+        <w:pStyle w:val="BodyText"/>
+        <w:numPr>
+          <w:ilvl w:val="1"/>
+          <w:numId w:val="8"/>
+        </w:numPr>
+        <w:spacing w:after="144"/>
+        <w:contextualSpacing/>
+      </w:pPr>
+      <w:r>
+        <w:t xml:space="preserve">What if any repairs were made to such damage, the date(s) of such repairs, and the costs of such </w:t>
+      </w:r>
+      <w:proofErr w:type="gramStart"/>
+      <w:r>
+        <w:t>repairs;</w:t>
+      </w:r>
+      <w:proofErr w:type="gramEnd"/>
+    </w:p>
+    <w:p>
+      <w:pPr>
+        <w:pStyle w:val="BodyText"/>
+        <w:numPr>
+          <w:ilvl w:val="1"/>
+          <w:numId w:val="8"/>
+        </w:numPr>
+        <w:spacing w:after="144"/>
+        <w:contextualSpacing/>
+      </w:pPr>
+      <w:r>
+        <w:t xml:space="preserve">The name(s), address(es), </w:t>
       </w:r>
       <w:r>
         <w:t xml:space="preserve">email </w:t>
       </w:r>
       <w:r>
-        <w:t xml:space="preserve">and telephone number of the person or agency who/that performed </w:t>
-      </w:r>
-      <w:proofErr w:type="gramStart"/>
-      <w:r>
-        <w:t>it;</w:t>
-      </w:r>
-      <w:proofErr w:type="gramEnd"/>
+        <w:t>and telephone number(s) of anyone with knowledge of such damage allegedly caused by the tenant.</w:t>
+      </w:r>
+    </w:p>
+    <w:p>
+      <w:pPr>
+        <w:pStyle w:val="BodyText"/>
+        <w:spacing w:after="144"/>
+        <w:contextualSpacing/>
+      </w:pPr>
+      <w:r>
+        <w:t>{%p endif %}</w:t>
+      </w:r>
+    </w:p>
+    <w:p>
+      <w:pPr>
+        <w:pStyle w:val="BodyText"/>
+        <w:numPr>
+          <w:ilvl w:val="0"/>
+          <w:numId w:val="8"/>
+        </w:numPr>
+        <w:spacing w:after="144"/>
+        <w:contextualSpacing/>
+      </w:pPr>
+      <w:r>
+        <w:t xml:space="preserve">{%p if </w:t>
+      </w:r>
+      <w:proofErr w:type="spellStart"/>
+      <w:r>
+        <w:t>ints.get</w:t>
+      </w:r>
+      <w:proofErr w:type="spellEnd"/>
+      <w:r>
+        <w:t>('</w:t>
+      </w:r>
+      <w:r>
+        <w:t>bad_conditions_tenant_hindered</w:t>
+      </w:r>
+      <w:proofErr w:type="gramStart"/>
+      <w:r>
+        <w:t>',</w:t>
+      </w:r>
+      <w:proofErr w:type="spellStart"/>
+      <w:r>
+        <w:t>DAEmpty</w:t>
+      </w:r>
+      <w:proofErr w:type="spellEnd"/>
+      <w:proofErr w:type="gramEnd"/>
+      <w:r>
+        <w:t>()).checked</w:t>
+      </w:r>
+      <w:r>
+        <w:t xml:space="preserve"> %}</w:t>
+      </w:r>
+    </w:p>
+    <w:p>
+      <w:pPr>
+        <w:pStyle w:val="BodyText"/>
+        <w:numPr>
+          <w:ilvl w:val="0"/>
+          <w:numId w:val="8"/>
+        </w:numPr>
+        <w:spacing w:after="144"/>
+        <w:contextualSpacing/>
+      </w:pPr>
+      <w:r>
+        <w:t>If you claim the tenant prevented or hindered you from inspecting the apartment and/or making repairs, for each attempt to inspect or make repairs, please describe:</w:t>
+      </w:r>
     </w:p>
     <w:p>
       <w:pPr>
@@ -3440,11 +4144,11 @@
         <w:contextualSpacing/>
       </w:pPr>
       <w:r>
-        <w:t xml:space="preserve">When you received or became aware of the inspection, assessment or </w:t>
-      </w:r>
-      <w:proofErr w:type="gramStart"/>
-      <w:r>
-        <w:t>evaluation;</w:t>
+        <w:t xml:space="preserve">The date of the </w:t>
+      </w:r>
+      <w:proofErr w:type="gramStart"/>
+      <w:r>
+        <w:t>attempt;</w:t>
       </w:r>
       <w:proofErr w:type="gramEnd"/>
     </w:p>
@@ -3459,8 +4163,13 @@
         <w:contextualSpacing/>
       </w:pPr>
       <w:r>
-        <w:t>The contents thereof, stating specifically what problems or conditions were noted; and</w:t>
-      </w:r>
+        <w:t xml:space="preserve">How and when you let the tenant know of your plan to inspect and/or to </w:t>
+      </w:r>
+      <w:proofErr w:type="gramStart"/>
+      <w:r>
+        <w:t>repair;</w:t>
+      </w:r>
+      <w:proofErr w:type="gramEnd"/>
     </w:p>
     <w:p>
       <w:pPr>
@@ -3473,7 +4182,40 @@
         <w:contextualSpacing/>
       </w:pPr>
       <w:r>
-        <w:t>What, if anything, you did in response to such inspection, assessment, or evaluation.</w:t>
+        <w:t xml:space="preserve">What the tenant did or said to prevent or hinder the inspection or </w:t>
+      </w:r>
+      <w:proofErr w:type="gramStart"/>
+      <w:r>
+        <w:t>repair;</w:t>
+      </w:r>
+      <w:proofErr w:type="gramEnd"/>
+    </w:p>
+    <w:p>
+      <w:pPr>
+        <w:pStyle w:val="BodyText"/>
+        <w:numPr>
+          <w:ilvl w:val="1"/>
+          <w:numId w:val="8"/>
+        </w:numPr>
+        <w:spacing w:after="144"/>
+        <w:contextualSpacing/>
+      </w:pPr>
+      <w:r>
+        <w:t>The names and addresses of anyone present at the time who has information about the tenant’s interference with the inspection or repair; and</w:t>
+      </w:r>
+    </w:p>
+    <w:p>
+      <w:pPr>
+        <w:pStyle w:val="BodyText"/>
+        <w:numPr>
+          <w:ilvl w:val="1"/>
+          <w:numId w:val="8"/>
+        </w:numPr>
+        <w:spacing w:after="144"/>
+        <w:contextualSpacing/>
+      </w:pPr>
+      <w:r>
+        <w:t>Any financial or other loss suffered as a result of the tenant’s actions or inactions.</w:t>
       </w:r>
     </w:p>
     <w:p>
@@ -3499,26 +4241,16 @@
       <w:r>
         <w:t xml:space="preserve">{%p if </w:t>
       </w:r>
-      <w:proofErr w:type="spellStart"/>
-      <w:r>
-        <w:t>ints.get</w:t>
-      </w:r>
-      <w:proofErr w:type="spellEnd"/>
-      <w:r>
-        <w:t>('</w:t>
-      </w:r>
-      <w:r>
-        <w:t>bad_conditions_attempted_repairs</w:t>
-      </w:r>
-      <w:proofErr w:type="gramStart"/>
-      <w:r>
-        <w:t>',</w:t>
-      </w:r>
-      <w:proofErr w:type="spellStart"/>
-      <w:r>
-        <w:t>DAEmpty</w:t>
-      </w:r>
-      <w:proofErr w:type="spellEnd"/>
+      <w:r>
+        <w:t>ints.get('</w:t>
+      </w:r>
+      <w:r>
+        <w:t>bad_conditions_landlord_entered_premises</w:t>
+      </w:r>
+      <w:proofErr w:type="gramStart"/>
+      <w:r>
+        <w:t>',DAEmpty</w:t>
+      </w:r>
       <w:proofErr w:type="gramEnd"/>
       <w:r>
         <w:t>()).checked</w:t>
@@ -3538,121 +4270,13 @@
         <w:contextualSpacing/>
       </w:pPr>
       <w:r>
-        <w:t>If the landlord has made or attempted to make inspections and/or repairs (including exterminations) to the tenant’s apartment and/or common areas and systems of the building</w:t>
-      </w:r>
-      <w:r>
-        <w:t xml:space="preserve"> </w:t>
-      </w:r>
-      <w:r>
-        <w:t>within the most recent 6 years of the tenant’s tenancy</w:t>
-      </w:r>
-      <w:r>
-        <w:t>, for each such inspection and/or repair (or attempt), including extermination, please state:</w:t>
-      </w:r>
-    </w:p>
-    <w:p>
-      <w:pPr>
-        <w:pStyle w:val="BodyText"/>
-        <w:numPr>
-          <w:ilvl w:val="1"/>
-          <w:numId w:val="8"/>
-        </w:numPr>
-        <w:spacing w:after="144"/>
-        <w:contextualSpacing/>
-      </w:pPr>
-      <w:r>
-        <w:t xml:space="preserve">A description of each inspection and/or </w:t>
-      </w:r>
-      <w:proofErr w:type="gramStart"/>
-      <w:r>
-        <w:t>repair;</w:t>
-      </w:r>
-      <w:proofErr w:type="gramEnd"/>
-    </w:p>
-    <w:p>
-      <w:pPr>
-        <w:pStyle w:val="BodyText"/>
-        <w:numPr>
-          <w:ilvl w:val="1"/>
-          <w:numId w:val="8"/>
-        </w:numPr>
-        <w:spacing w:after="144"/>
-        <w:contextualSpacing/>
-      </w:pPr>
-      <w:r>
-        <w:t>How and when you let the tenant know of your plan to inspect and/or to repair (including whether there was written notice to the tenant</w:t>
-      </w:r>
-      <w:proofErr w:type="gramStart"/>
-      <w:r>
-        <w:t>);</w:t>
-      </w:r>
-      <w:proofErr w:type="gramEnd"/>
-    </w:p>
-    <w:p>
-      <w:pPr>
-        <w:pStyle w:val="BodyText"/>
-        <w:numPr>
-          <w:ilvl w:val="1"/>
-          <w:numId w:val="8"/>
-        </w:numPr>
-        <w:spacing w:after="144"/>
-        <w:contextualSpacing/>
-      </w:pPr>
-      <w:r>
-        <w:t xml:space="preserve">The date of each inspection and/or </w:t>
-      </w:r>
-      <w:proofErr w:type="gramStart"/>
-      <w:r>
-        <w:t>repair;</w:t>
-      </w:r>
-      <w:proofErr w:type="gramEnd"/>
-    </w:p>
-    <w:p>
-      <w:pPr>
-        <w:pStyle w:val="BodyText"/>
-        <w:numPr>
-          <w:ilvl w:val="1"/>
-          <w:numId w:val="8"/>
-        </w:numPr>
-        <w:spacing w:after="144"/>
-        <w:contextualSpacing/>
-      </w:pPr>
-      <w:r>
-        <w:t xml:space="preserve">The name, address, and </w:t>
-      </w:r>
-      <w:r>
-        <w:t xml:space="preserve">email and </w:t>
-      </w:r>
-      <w:r>
-        <w:t>telephone number of the company/person who made each inspection and/or repair; and</w:t>
-      </w:r>
-    </w:p>
-    <w:p>
-      <w:pPr>
-        <w:pStyle w:val="BodyText"/>
-        <w:numPr>
-          <w:ilvl w:val="1"/>
-          <w:numId w:val="8"/>
-        </w:numPr>
-        <w:spacing w:after="144"/>
-        <w:contextualSpacing/>
-      </w:pPr>
-      <w:r>
-        <w:t>The cost of each repair, if applicable.</w:t>
-      </w:r>
-    </w:p>
-    <w:p>
-      <w:pPr>
-        <w:pStyle w:val="BodyText"/>
-        <w:numPr>
-          <w:ilvl w:val="1"/>
-          <w:numId w:val="8"/>
-        </w:numPr>
-        <w:spacing w:after="144"/>
-        <w:contextualSpacing/>
-      </w:pPr>
-      <w:r>
-        <w:t>For repairs, how and when you first knew of the condition that needed to be repaired.</w:t>
+        <w:t xml:space="preserve">If you or anyone on your behalf has been inside the tenant’s apartment </w:t>
+      </w:r>
+      <w:r>
+        <w:t xml:space="preserve">within the most recent 6 years of the tenant’s tenancy </w:t>
+      </w:r>
+      <w:r>
+        <w:t>(or before the tenancy for the purpose of renting to/preparing the apartment for the tenant), please state who was inside the apartment, when, and why s/he was there.</w:t>
       </w:r>
     </w:p>
     <w:p>
@@ -3678,26 +4302,16 @@
       <w:r>
         <w:t xml:space="preserve">{%p if </w:t>
       </w:r>
-      <w:proofErr w:type="spellStart"/>
-      <w:r>
-        <w:t>ints.get</w:t>
-      </w:r>
-      <w:proofErr w:type="spellEnd"/>
-      <w:r>
-        <w:t>('</w:t>
-      </w:r>
-      <w:r>
-        <w:t>lead_paint</w:t>
-      </w:r>
-      <w:proofErr w:type="gramStart"/>
-      <w:r>
-        <w:t>',</w:t>
-      </w:r>
-      <w:proofErr w:type="spellStart"/>
-      <w:r>
-        <w:t>DAEmpty</w:t>
-      </w:r>
-      <w:proofErr w:type="spellEnd"/>
+      <w:r>
+        <w:t>ints.get('</w:t>
+      </w:r>
+      <w:r>
+        <w:t>bad_conditions_describe_maintenance</w:t>
+      </w:r>
+      <w:proofErr w:type="gramStart"/>
+      <w:r>
+        <w:t>',DAEmpty</w:t>
+      </w:r>
       <w:proofErr w:type="gramEnd"/>
       <w:r>
         <w:t>()).checked</w:t>
@@ -3717,615 +4331,11 @@
         <w:contextualSpacing/>
       </w:pPr>
       <w:r>
-        <w:t>If you have ever learned of or tried to discover whether there is lead paint in the tenant’s apartment and/or building, please provide:</w:t>
-      </w:r>
-    </w:p>
-    <w:p>
-      <w:pPr>
-        <w:pStyle w:val="BodyText"/>
-        <w:numPr>
-          <w:ilvl w:val="1"/>
-          <w:numId w:val="8"/>
-        </w:numPr>
-        <w:spacing w:after="144"/>
-        <w:contextualSpacing/>
-      </w:pPr>
-      <w:r>
-        <w:t>A full and complete description of your investigation and/or knowledge/information regarding the presence (or absence) of lead paint in the apartment and/or building, including, but not limited to:</w:t>
-      </w:r>
-    </w:p>
-    <w:p>
-      <w:pPr>
-        <w:pStyle w:val="BodyText"/>
-        <w:numPr>
-          <w:ilvl w:val="2"/>
-          <w:numId w:val="8"/>
-        </w:numPr>
-        <w:spacing w:after="144"/>
-        <w:contextualSpacing/>
-      </w:pPr>
-      <w:r>
-        <w:t>The substance of any inspections, investigation or knowledge/</w:t>
-      </w:r>
-      <w:proofErr w:type="gramStart"/>
-      <w:r>
-        <w:t>information;</w:t>
-      </w:r>
-      <w:proofErr w:type="gramEnd"/>
-    </w:p>
-    <w:p>
-      <w:pPr>
-        <w:pStyle w:val="BodyText"/>
-        <w:numPr>
-          <w:ilvl w:val="2"/>
-          <w:numId w:val="8"/>
-        </w:numPr>
-        <w:spacing w:after="144"/>
-        <w:contextualSpacing/>
-      </w:pPr>
-      <w:r>
-        <w:t xml:space="preserve">The name, address, </w:t>
-      </w:r>
-      <w:r>
-        <w:t xml:space="preserve">email </w:t>
-      </w:r>
-      <w:r>
-        <w:t xml:space="preserve">and telephone number of any person/company with </w:t>
-      </w:r>
-      <w:proofErr w:type="gramStart"/>
-      <w:r>
-        <w:t>information;</w:t>
-      </w:r>
-      <w:proofErr w:type="gramEnd"/>
-      <w:r>
-        <w:t xml:space="preserve"> </w:t>
-      </w:r>
-    </w:p>
-    <w:p>
-      <w:pPr>
-        <w:pStyle w:val="BodyText"/>
-        <w:numPr>
-          <w:ilvl w:val="2"/>
-          <w:numId w:val="8"/>
-        </w:numPr>
-        <w:spacing w:after="144"/>
-        <w:contextualSpacing/>
-      </w:pPr>
-      <w:r>
-        <w:t>The date(s) that you conducted such investigation or otherwise acquired such knowledge/</w:t>
-      </w:r>
-      <w:proofErr w:type="gramStart"/>
-      <w:r>
-        <w:t>information;</w:t>
-      </w:r>
-      <w:proofErr w:type="gramEnd"/>
-    </w:p>
-    <w:p>
-      <w:pPr>
-        <w:pStyle w:val="BodyText"/>
-        <w:numPr>
-          <w:ilvl w:val="1"/>
-          <w:numId w:val="8"/>
-        </w:numPr>
-        <w:spacing w:after="144"/>
-        <w:contextualSpacing/>
-      </w:pPr>
-      <w:r>
-        <w:t xml:space="preserve">A full and complete description of any steps you have taken regarding the presence of lead paint in the apartment and/or building (i.e., </w:t>
-      </w:r>
-      <w:proofErr w:type="gramStart"/>
-      <w:r>
-        <w:t>any and all</w:t>
-      </w:r>
-      <w:proofErr w:type="gramEnd"/>
-      <w:r>
-        <w:t xml:space="preserve"> inspections not identified above and/or abatement of any lead paint hazard), including, but not limited to:</w:t>
-      </w:r>
-    </w:p>
-    <w:p>
-      <w:pPr>
-        <w:pStyle w:val="BodyText"/>
-        <w:numPr>
-          <w:ilvl w:val="2"/>
-          <w:numId w:val="8"/>
-        </w:numPr>
-        <w:spacing w:after="144"/>
-        <w:contextualSpacing/>
-      </w:pPr>
-      <w:r>
-        <w:t xml:space="preserve">The substance of all action taken or work </w:t>
-      </w:r>
-      <w:proofErr w:type="gramStart"/>
-      <w:r>
-        <w:t>performed;</w:t>
-      </w:r>
-      <w:proofErr w:type="gramEnd"/>
-      <w:r>
-        <w:t xml:space="preserve"> </w:t>
-      </w:r>
-    </w:p>
-    <w:p>
-      <w:pPr>
-        <w:pStyle w:val="BodyText"/>
-        <w:numPr>
-          <w:ilvl w:val="2"/>
-          <w:numId w:val="8"/>
-        </w:numPr>
-        <w:spacing w:after="144"/>
-        <w:contextualSpacing/>
-      </w:pPr>
-      <w:r>
-        <w:t xml:space="preserve">The date(s) </w:t>
-      </w:r>
-      <w:proofErr w:type="gramStart"/>
-      <w:r>
-        <w:t>thereof;</w:t>
-      </w:r>
-      <w:proofErr w:type="gramEnd"/>
-      <w:r>
-        <w:t xml:space="preserve"> </w:t>
-      </w:r>
-    </w:p>
-    <w:p>
-      <w:pPr>
-        <w:pStyle w:val="BodyText"/>
-        <w:numPr>
-          <w:ilvl w:val="2"/>
-          <w:numId w:val="8"/>
-        </w:numPr>
-        <w:spacing w:after="144"/>
-        <w:contextualSpacing/>
-      </w:pPr>
-      <w:r>
-        <w:t xml:space="preserve">Who did what work (name, address, company, </w:t>
-      </w:r>
-      <w:r>
-        <w:t xml:space="preserve">email, </w:t>
-      </w:r>
-      <w:r>
-        <w:t xml:space="preserve">telephone number, and license number of the </w:t>
-      </w:r>
-      <w:proofErr w:type="spellStart"/>
-      <w:r>
-        <w:t>deleader</w:t>
-      </w:r>
-      <w:proofErr w:type="spellEnd"/>
-      <w:proofErr w:type="gramStart"/>
-      <w:r>
-        <w:t>);</w:t>
-      </w:r>
-      <w:proofErr w:type="gramEnd"/>
-      <w:r>
-        <w:t xml:space="preserve"> </w:t>
-      </w:r>
-    </w:p>
-    <w:p>
-      <w:pPr>
-        <w:pStyle w:val="BodyText"/>
-        <w:numPr>
-          <w:ilvl w:val="2"/>
-          <w:numId w:val="8"/>
-        </w:numPr>
-        <w:spacing w:after="144"/>
-        <w:contextualSpacing/>
-      </w:pPr>
+        <w:t xml:space="preserve">Please describe in full and complete detail the maintenance and management of the apartment and/or building during the tenancy, including, but not limited to, the name of the management company, the identity (by name and address) of each responsible person, a description of each </w:t>
+      </w:r>
       <w:r>
         <w:lastRenderedPageBreak/>
-        <w:t>The details of any arrangements for relocation of the tenant during the abatement process (including where the tenant was relocated, how the tenant was relocated, and the payment of any costs associated with such relocation).</w:t>
-      </w:r>
-    </w:p>
-    <w:p>
-      <w:pPr>
-        <w:pStyle w:val="BodyText"/>
-        <w:spacing w:after="144"/>
-        <w:contextualSpacing/>
-      </w:pPr>
-      <w:r>
-        <w:t>{%p endif %}</w:t>
-      </w:r>
-    </w:p>
-    <w:p>
-      <w:pPr>
-        <w:pStyle w:val="BodyText"/>
-        <w:numPr>
-          <w:ilvl w:val="0"/>
-          <w:numId w:val="8"/>
-        </w:numPr>
-        <w:spacing w:after="144"/>
-        <w:contextualSpacing/>
-      </w:pPr>
-      <w:r>
-        <w:t xml:space="preserve">{%p if </w:t>
-      </w:r>
-      <w:proofErr w:type="spellStart"/>
-      <w:r>
-        <w:t>ints.get</w:t>
-      </w:r>
-      <w:proofErr w:type="spellEnd"/>
-      <w:r>
-        <w:t>('</w:t>
-      </w:r>
-      <w:r>
-        <w:t>bad_conditions_tenant_damaged</w:t>
-      </w:r>
-      <w:proofErr w:type="gramStart"/>
-      <w:r>
-        <w:t>',</w:t>
-      </w:r>
-      <w:proofErr w:type="spellStart"/>
-      <w:r>
-        <w:t>DAEmpty</w:t>
-      </w:r>
-      <w:proofErr w:type="spellEnd"/>
-      <w:proofErr w:type="gramEnd"/>
-      <w:r>
-        <w:t>()).checked</w:t>
-      </w:r>
-      <w:r>
-        <w:t xml:space="preserve"> %}</w:t>
-      </w:r>
-    </w:p>
-    <w:p>
-      <w:pPr>
-        <w:pStyle w:val="BodyText"/>
-        <w:numPr>
-          <w:ilvl w:val="0"/>
-          <w:numId w:val="8"/>
-        </w:numPr>
-        <w:spacing w:after="144"/>
-        <w:contextualSpacing/>
-      </w:pPr>
-      <w:r>
-        <w:t>If you claim that the tenant caused any damage to the apartment and/or building, please describe such damage in full and complete detail, including, but not limited to:</w:t>
-      </w:r>
-    </w:p>
-    <w:p>
-      <w:pPr>
-        <w:pStyle w:val="BodyText"/>
-        <w:numPr>
-          <w:ilvl w:val="1"/>
-          <w:numId w:val="8"/>
-        </w:numPr>
-        <w:spacing w:after="144"/>
-        <w:contextualSpacing/>
-      </w:pPr>
-      <w:r>
-        <w:t xml:space="preserve">The substance of such </w:t>
-      </w:r>
-      <w:proofErr w:type="gramStart"/>
-      <w:r>
-        <w:t>damage;</w:t>
-      </w:r>
-      <w:proofErr w:type="gramEnd"/>
-      <w:r>
-        <w:t xml:space="preserve"> </w:t>
-      </w:r>
-    </w:p>
-    <w:p>
-      <w:pPr>
-        <w:pStyle w:val="BodyText"/>
-        <w:numPr>
-          <w:ilvl w:val="1"/>
-          <w:numId w:val="8"/>
-        </w:numPr>
-        <w:spacing w:after="144"/>
-        <w:contextualSpacing/>
-      </w:pPr>
-      <w:r>
-        <w:t xml:space="preserve">Why you believe the tenant caused the </w:t>
-      </w:r>
-      <w:proofErr w:type="gramStart"/>
-      <w:r>
-        <w:t>damage;</w:t>
-      </w:r>
-      <w:proofErr w:type="gramEnd"/>
-    </w:p>
-    <w:p>
-      <w:pPr>
-        <w:pStyle w:val="BodyText"/>
-        <w:numPr>
-          <w:ilvl w:val="1"/>
-          <w:numId w:val="8"/>
-        </w:numPr>
-        <w:spacing w:after="144"/>
-        <w:contextualSpacing/>
-      </w:pPr>
-      <w:r>
-        <w:t xml:space="preserve">What if any repairs were made to such damage, the date(s) of such repairs, and the costs of </w:t>
-      </w:r>
-      <w:proofErr w:type="gramStart"/>
-      <w:r>
-        <w:t>such repairs;</w:t>
-      </w:r>
-      <w:proofErr w:type="gramEnd"/>
-    </w:p>
-    <w:p>
-      <w:pPr>
-        <w:pStyle w:val="BodyText"/>
-        <w:numPr>
-          <w:ilvl w:val="1"/>
-          <w:numId w:val="8"/>
-        </w:numPr>
-        <w:spacing w:after="144"/>
-        <w:contextualSpacing/>
-      </w:pPr>
-      <w:r>
-        <w:t xml:space="preserve">The name(s), address(es), </w:t>
-      </w:r>
-      <w:r>
-        <w:t xml:space="preserve">email </w:t>
-      </w:r>
-      <w:r>
-        <w:t>and telephone number(s) of anyone with knowledge of such damage allegedly caused by the tenant.</w:t>
-      </w:r>
-    </w:p>
-    <w:p>
-      <w:pPr>
-        <w:pStyle w:val="BodyText"/>
-        <w:spacing w:after="144"/>
-        <w:contextualSpacing/>
-      </w:pPr>
-      <w:r>
-        <w:t>{%p endif %}</w:t>
-      </w:r>
-    </w:p>
-    <w:p>
-      <w:pPr>
-        <w:pStyle w:val="BodyText"/>
-        <w:numPr>
-          <w:ilvl w:val="0"/>
-          <w:numId w:val="8"/>
-        </w:numPr>
-        <w:spacing w:after="144"/>
-        <w:contextualSpacing/>
-      </w:pPr>
-      <w:r>
-        <w:t xml:space="preserve">{%p if </w:t>
-      </w:r>
-      <w:proofErr w:type="spellStart"/>
-      <w:r>
-        <w:t>ints.get</w:t>
-      </w:r>
-      <w:proofErr w:type="spellEnd"/>
-      <w:r>
-        <w:t>('</w:t>
-      </w:r>
-      <w:r>
-        <w:t>bad_conditions_tenant_hindered</w:t>
-      </w:r>
-      <w:proofErr w:type="gramStart"/>
-      <w:r>
-        <w:t>',</w:t>
-      </w:r>
-      <w:proofErr w:type="spellStart"/>
-      <w:r>
-        <w:t>DAEmpty</w:t>
-      </w:r>
-      <w:proofErr w:type="spellEnd"/>
-      <w:proofErr w:type="gramEnd"/>
-      <w:r>
-        <w:t>()).checked</w:t>
-      </w:r>
-      <w:r>
-        <w:t xml:space="preserve"> %}</w:t>
-      </w:r>
-    </w:p>
-    <w:p>
-      <w:pPr>
-        <w:pStyle w:val="BodyText"/>
-        <w:numPr>
-          <w:ilvl w:val="0"/>
-          <w:numId w:val="8"/>
-        </w:numPr>
-        <w:spacing w:after="144"/>
-        <w:contextualSpacing/>
-      </w:pPr>
-      <w:r>
-        <w:t>If you claim the tenant prevented or hindered you from inspecting the apartment and/or making repairs, for each attempt to inspect or make repairs, please describe:</w:t>
-      </w:r>
-    </w:p>
-    <w:p>
-      <w:pPr>
-        <w:pStyle w:val="BodyText"/>
-        <w:numPr>
-          <w:ilvl w:val="1"/>
-          <w:numId w:val="8"/>
-        </w:numPr>
-        <w:spacing w:after="144"/>
-        <w:contextualSpacing/>
-      </w:pPr>
-      <w:r>
-        <w:t xml:space="preserve">The date of the </w:t>
-      </w:r>
-      <w:proofErr w:type="gramStart"/>
-      <w:r>
-        <w:t>attempt;</w:t>
-      </w:r>
-      <w:proofErr w:type="gramEnd"/>
-    </w:p>
-    <w:p>
-      <w:pPr>
-        <w:pStyle w:val="BodyText"/>
-        <w:numPr>
-          <w:ilvl w:val="1"/>
-          <w:numId w:val="8"/>
-        </w:numPr>
-        <w:spacing w:after="144"/>
-        <w:contextualSpacing/>
-      </w:pPr>
-      <w:r>
-        <w:t xml:space="preserve">How and when you let the tenant know of your plan to inspect and/or to </w:t>
-      </w:r>
-      <w:proofErr w:type="gramStart"/>
-      <w:r>
-        <w:t>repair;</w:t>
-      </w:r>
-      <w:proofErr w:type="gramEnd"/>
-    </w:p>
-    <w:p>
-      <w:pPr>
-        <w:pStyle w:val="BodyText"/>
-        <w:numPr>
-          <w:ilvl w:val="1"/>
-          <w:numId w:val="8"/>
-        </w:numPr>
-        <w:spacing w:after="144"/>
-        <w:contextualSpacing/>
-      </w:pPr>
-      <w:r>
-        <w:t xml:space="preserve">What the tenant did or said to prevent or hinder the inspection or </w:t>
-      </w:r>
-      <w:proofErr w:type="gramStart"/>
-      <w:r>
-        <w:t>repair;</w:t>
-      </w:r>
-      <w:proofErr w:type="gramEnd"/>
-    </w:p>
-    <w:p>
-      <w:pPr>
-        <w:pStyle w:val="BodyText"/>
-        <w:numPr>
-          <w:ilvl w:val="1"/>
-          <w:numId w:val="8"/>
-        </w:numPr>
-        <w:spacing w:after="144"/>
-        <w:contextualSpacing/>
-      </w:pPr>
-      <w:r>
-        <w:t>The names and addresses of anyone present at the time who has information about the tenant’s interference with the inspection or repair; and</w:t>
-      </w:r>
-    </w:p>
-    <w:p>
-      <w:pPr>
-        <w:pStyle w:val="BodyText"/>
-        <w:numPr>
-          <w:ilvl w:val="1"/>
-          <w:numId w:val="8"/>
-        </w:numPr>
-        <w:spacing w:after="144"/>
-        <w:contextualSpacing/>
-      </w:pPr>
-      <w:r>
-        <w:t>Any financial or other loss suffered as a result of the tenant’s actions or inactions.</w:t>
-      </w:r>
-    </w:p>
-    <w:p>
-      <w:pPr>
-        <w:pStyle w:val="BodyText"/>
-        <w:spacing w:after="144"/>
-        <w:contextualSpacing/>
-      </w:pPr>
-      <w:r>
-        <w:t>{%p endif %}</w:t>
-      </w:r>
-    </w:p>
-    <w:p>
-      <w:pPr>
-        <w:pStyle w:val="BodyText"/>
-        <w:numPr>
-          <w:ilvl w:val="0"/>
-          <w:numId w:val="8"/>
-        </w:numPr>
-        <w:spacing w:after="144"/>
-        <w:contextualSpacing/>
-      </w:pPr>
-      <w:r>
-        <w:t xml:space="preserve">{%p if </w:t>
-      </w:r>
-      <w:r>
-        <w:t>ints.get('</w:t>
-      </w:r>
-      <w:r>
-        <w:t>bad_conditions_landlord_entered_premises</w:t>
-      </w:r>
-      <w:proofErr w:type="gramStart"/>
-      <w:r>
-        <w:t>',DAEmpty</w:t>
-      </w:r>
-      <w:proofErr w:type="gramEnd"/>
-      <w:r>
-        <w:t>()).checked</w:t>
-      </w:r>
-      <w:r>
-        <w:t xml:space="preserve"> %}</w:t>
-      </w:r>
-    </w:p>
-    <w:p>
-      <w:pPr>
-        <w:pStyle w:val="BodyText"/>
-        <w:numPr>
-          <w:ilvl w:val="0"/>
-          <w:numId w:val="8"/>
-        </w:numPr>
-        <w:spacing w:after="144"/>
-        <w:contextualSpacing/>
-      </w:pPr>
-      <w:r>
-        <w:t xml:space="preserve">If you or anyone on your behalf has been inside the tenant’s apartment </w:t>
-      </w:r>
-      <w:r>
-        <w:t>within the most recent 6 years of the tenant’s tenancy</w:t>
-      </w:r>
-      <w:r>
-        <w:t xml:space="preserve"> </w:t>
-      </w:r>
-      <w:r>
-        <w:t>(or before the tenancy for the purpose of renting to/preparing the apartment for the tenant), please state who was inside the apartment, when, and why s/he was there.</w:t>
-      </w:r>
-    </w:p>
-    <w:p>
-      <w:pPr>
-        <w:pStyle w:val="BodyText"/>
-        <w:spacing w:after="144"/>
-        <w:contextualSpacing/>
-      </w:pPr>
-      <w:r>
-        <w:t>{%p endif %}</w:t>
-      </w:r>
-    </w:p>
-    <w:p>
-      <w:pPr>
-        <w:pStyle w:val="BodyText"/>
-        <w:numPr>
-          <w:ilvl w:val="0"/>
-          <w:numId w:val="8"/>
-        </w:numPr>
-        <w:spacing w:after="144"/>
-        <w:contextualSpacing/>
-      </w:pPr>
-      <w:r>
-        <w:t xml:space="preserve">{%p if </w:t>
-      </w:r>
-      <w:r>
-        <w:t>ints.get('</w:t>
-      </w:r>
-      <w:r>
-        <w:t>bad_conditions_describe_maintenance</w:t>
-      </w:r>
-      <w:proofErr w:type="gramStart"/>
-      <w:r>
-        <w:t>',DAEmpty</w:t>
-      </w:r>
-      <w:proofErr w:type="gramEnd"/>
-      <w:r>
-        <w:t>()).checked</w:t>
-      </w:r>
-      <w:r>
-        <w:t xml:space="preserve"> %}</w:t>
-      </w:r>
-    </w:p>
-    <w:p>
-      <w:pPr>
-        <w:pStyle w:val="BodyText"/>
-        <w:numPr>
-          <w:ilvl w:val="0"/>
-          <w:numId w:val="8"/>
-        </w:numPr>
-        <w:spacing w:after="144"/>
-        <w:contextualSpacing/>
-      </w:pPr>
-      <w:r>
-        <w:t>Please describe in full and complete detail the maintenance and management of the apartment and/or building during the tenancy, including, but not limited to, the name of the management company, the identity (by name and address) of each responsible person, a description of each such person’s duties, for how long s/he has managed and/or maintained the building, and his or her job training/experience/qualifications.</w:t>
+        <w:t>such person’s duties, for how long s/he has managed and/or maintained the building, and his or her job training/experience/qualifications.</w:t>
       </w:r>
     </w:p>
     <w:p>
@@ -4486,7 +4496,6 @@
         <w:contextualSpacing/>
       </w:pPr>
       <w:r>
-        <w:lastRenderedPageBreak/>
         <w:t>If you ever received payment(s) for a security deposit and/or last month’s rent from or on behalf of the tenant, or know that the tenant made such payment(s) to a former owner, please state:</w:t>
       </w:r>
     </w:p>
@@ -4897,7 +4906,11 @@
         <w:contextualSpacing/>
       </w:pPr>
       <w:r>
-        <w:t>Please describe any accounts that the landlord has or has had for common area utility usage (including water and sewer) in the building, including the date such account was established, the name of the utility company, the account number for each such account, and a description of the areas in the building covered by each such account.</w:t>
+        <w:t xml:space="preserve">Please describe any accounts that the landlord has or has had for common area utility usage (including water and sewer) in the building, including the date such account was established, the </w:t>
+      </w:r>
+      <w:r>
+        <w:lastRenderedPageBreak/>
+        <w:t>name of the utility company, the account number for each such account, and a description of the areas in the building covered by each such account.</w:t>
       </w:r>
     </w:p>
     <w:p>
@@ -4962,11 +4975,7 @@
         <w:contextualSpacing/>
       </w:pPr>
       <w:r>
-        <w:t xml:space="preserve">If the tenant is or was at any time responsible for paying for any water, electricity or other utility outside the apartment, including, but not limited to, hallways, basement, and/or the exterior of the building, please describe what the tenant is responsible for, whether there is a written </w:t>
-      </w:r>
-      <w:r>
-        <w:lastRenderedPageBreak/>
-        <w:t>agreement between the parties reflecting this arrangement, and the date such arrangement first took effect.</w:t>
+        <w:t>If the tenant is or was at any time responsible for paying for any water, electricity or other utility outside the apartment, including, but not limited to, hallways, basement, and/or the exterior of the building, please describe what the tenant is responsible for, whether there is a written agreement between the parties reflecting this arrangement, and the date such arrangement first took effect.</w:t>
       </w:r>
     </w:p>
     <w:p>
@@ -5471,8 +5480,13 @@
         <w:t>('</w:t>
       </w:r>
       <w:r>
-        <w:t>disability_ra</w:t>
-      </w:r>
+        <w:t>disability_</w:t>
+      </w:r>
+      <w:proofErr w:type="spellStart"/>
+      <w:r>
+        <w:t>ra</w:t>
+      </w:r>
+      <w:proofErr w:type="spellEnd"/>
       <w:proofErr w:type="gramStart"/>
       <w:r>
         <w:t>',</w:t>
@@ -5501,6 +5515,7 @@
         <w:contextualSpacing/>
       </w:pPr>
       <w:r>
+        <w:lastRenderedPageBreak/>
         <w:t>Please describe in detail any requests made by or on behalf of the tenant or household member for an accommodation or accommodation otherwise considered (e.g., a change in rules or policy, a physical change to the apartment, not proceeding with an eviction, or other special treatment) due to her/his disability, including, but not limited to:</w:t>
       </w:r>
     </w:p>
@@ -5534,7 +5549,6 @@
         <w:contextualSpacing/>
       </w:pPr>
       <w:r>
-        <w:lastRenderedPageBreak/>
         <w:t>What s/he requested that you do or not do on account of her/his disability or that you otherwise considered; and</w:t>
       </w:r>
     </w:p>
@@ -5979,6 +5993,7 @@
         <w:rPr>
           <w:rFonts w:eastAsia="Times New Roman" w:cs="Times New Roman"/>
         </w:rPr>
+        <w:lastRenderedPageBreak/>
         <w:t>{%p endif %}</w:t>
       </w:r>
     </w:p>
@@ -6076,7 +6091,6 @@
         <w:rPr>
           <w:rFonts w:eastAsia="Times New Roman" w:cs="Times New Roman"/>
         </w:rPr>
-        <w:lastRenderedPageBreak/>
         <w:t>{%p endif %}</w:t>
       </w:r>
     </w:p>
@@ -6620,6 +6634,7 @@
         <w:contextualSpacing/>
       </w:pPr>
       <w:r>
+        <w:lastRenderedPageBreak/>
         <w:t>If the building or the tenant’s apartment has been converted to the condominium or cooperative form of ownership, or if there is an intent to do so, please state:</w:t>
       </w:r>
     </w:p>
@@ -6695,7 +6710,6 @@
       </w:pPr>
       <w:proofErr w:type="gramStart"/>
       <w:r>
-        <w:lastRenderedPageBreak/>
         <w:t xml:space="preserve">{{ </w:t>
       </w:r>
       <w:proofErr w:type="spellStart"/>
@@ -7522,21 +7536,10 @@
         </w:numPr>
       </w:pPr>
       <w:r>
-        <w:t xml:space="preserve">All documents concerning charitable or </w:t>
-      </w:r>
-      <w:proofErr w:type="gramStart"/>
-      <w:r>
-        <w:t>third party</w:t>
-      </w:r>
-      <w:proofErr w:type="gramEnd"/>
-      <w:r>
-        <w:t xml:space="preserve"> payments on behalf of the tenant, including, but not limited to, </w:t>
-      </w:r>
-      <w:r>
-        <w:t xml:space="preserve">RAFT, </w:t>
-      </w:r>
-      <w:r>
-        <w:t>fuel/weatherization, rent and/or other assistance.</w:t>
+        <w:t xml:space="preserve">All documents related to rental assistance (or other subsidy or financial assistance, whether from RAFT or other any program) for the tenant's rent/use and occupancy for the apartment, including e.g. documents reflecting request(s), your response(s), or other communications, and any documents exchanged concerning such </w:t>
+      </w:r>
+      <w:r>
+        <w:t>assistance.</w:t>
       </w:r>
     </w:p>
     <w:p>
@@ -7717,6 +7720,7 @@
         </w:numPr>
       </w:pPr>
       <w:r>
+        <w:lastRenderedPageBreak/>
         <w:t>All documents related in any way to any of your reasons for evicting the tenant.</w:t>
       </w:r>
     </w:p>
@@ -7737,7 +7741,6 @@
         </w:numPr>
       </w:pPr>
       <w:r>
-        <w:lastRenderedPageBreak/>
         <w:t>All documents related in any way to the landlord’s claims and/or to the tenant’s defenses or counterclaims (to the extent not addressed elsewhere in your responses to these document requests).</w:t>
       </w:r>
     </w:p>
@@ -8219,6 +8222,7 @@
         </w:numPr>
       </w:pPr>
       <w:r>
+        <w:lastRenderedPageBreak/>
         <w:t xml:space="preserve">{%p if </w:t>
       </w:r>
       <w:r>
@@ -8248,7 +8252,6 @@
         </w:numPr>
       </w:pPr>
       <w:r>
-        <w:lastRenderedPageBreak/>
         <w:t xml:space="preserve">All letters and other written communications between the landlord and any housing authority, DHCD, </w:t>
       </w:r>
       <w:proofErr w:type="spellStart"/>
@@ -10132,7 +10135,7 @@
 </file>
 
 <file path=word/endnotes.xml><?xml version="1.0" encoding="utf-8"?>
-<w:endnotes xmlns:wpc="http://schemas.microsoft.com/office/word/2010/wordprocessingCanvas" xmlns:cx="http://schemas.microsoft.com/office/drawing/2014/chartex" xmlns:cx1="http://schemas.microsoft.com/office/drawing/2015/9/8/chartex" xmlns:cx2="http://schemas.microsoft.com/office/drawing/2015/10/21/chartex" xmlns:cx3="http://schemas.microsoft.com/office/drawing/2016/5/9/chartex" xmlns:cx4="http://schemas.microsoft.com/office/drawing/2016/5/10/chartex" xmlns:cx5="http://schemas.microsoft.com/office/drawing/2016/5/11/chartex" xmlns:cx6="http://schemas.microsoft.com/office/drawing/2016/5/12/chartex" xmlns:cx7="http://schemas.microsoft.com/office/drawing/2016/5/13/chartex" xmlns:cx8="http://schemas.microsoft.com/office/drawing/2016/5/14/chartex" xmlns:mc="http://schemas.openxmlformats.org/markup-compatibility/2006" xmlns:aink="http://schemas.microsoft.com/office/drawing/2016/ink" xmlns:am3d="http://schemas.microsoft.com/office/drawing/2017/model3d" xmlns:o="urn:schemas-microsoft-com:office:office" xmlns:r="http://schemas.openxmlformats.org/officeDocument/2006/relationships" xmlns:m="http://schemas.openxmlformats.org/officeDocument/2006/math" xmlns:v="urn:schemas-microsoft-com:vml" xmlns:wp14="http://schemas.microsoft.com/office/word/2010/wordprocessingDrawing" xmlns:wp="http://schemas.openxmlformats.org/drawingml/2006/wordprocessingDrawing" xmlns:w10="urn:schemas-microsoft-com:office:word" xmlns:w="http://schemas.openxmlformats.org/wordprocessingml/2006/main" xmlns:w14="http://schemas.microsoft.com/office/word/2010/wordml" xmlns:w15="http://schemas.microsoft.com/office/word/2012/wordml" xmlns:w16cex="http://schemas.microsoft.com/office/word/2018/wordml/cex" xmlns:w16cid="http://schemas.microsoft.com/office/word/2016/wordml/cid" xmlns:w16="http://schemas.microsoft.com/office/word/2018/wordml" xmlns:w16sdtdh="http://schemas.microsoft.com/office/word/2020/wordml/sdtdatahash" xmlns:w16se="http://schemas.microsoft.com/office/word/2015/wordml/symex" xmlns:wpg="http://schemas.microsoft.com/office/word/2010/wordprocessingGroup" xmlns:wpi="http://schemas.microsoft.com/office/word/2010/wordprocessingInk" xmlns:wne="http://schemas.microsoft.com/office/word/2006/wordml" xmlns:wps="http://schemas.microsoft.com/office/word/2010/wordprocessingShape" mc:Ignorable="w14 w15 w16se w16cid w16 w16cex w16sdtdh wp14">
+<w:endnotes xmlns:wpc="http://schemas.microsoft.com/office/word/2010/wordprocessingCanvas" xmlns:cx="http://schemas.microsoft.com/office/drawing/2014/chartex" xmlns:cx1="http://schemas.microsoft.com/office/drawing/2015/9/8/chartex" xmlns:cx2="http://schemas.microsoft.com/office/drawing/2015/10/21/chartex" xmlns:cx3="http://schemas.microsoft.com/office/drawing/2016/5/9/chartex" xmlns:cx4="http://schemas.microsoft.com/office/drawing/2016/5/10/chartex" xmlns:cx5="http://schemas.microsoft.com/office/drawing/2016/5/11/chartex" xmlns:cx6="http://schemas.microsoft.com/office/drawing/2016/5/12/chartex" xmlns:cx7="http://schemas.microsoft.com/office/drawing/2016/5/13/chartex" xmlns:cx8="http://schemas.microsoft.com/office/drawing/2016/5/14/chartex" xmlns:mc="http://schemas.openxmlformats.org/markup-compatibility/2006" xmlns:aink="http://schemas.microsoft.com/office/drawing/2016/ink" xmlns:am3d="http://schemas.microsoft.com/office/drawing/2017/model3d" xmlns:o="urn:schemas-microsoft-com:office:office" xmlns:oel="http://schemas.microsoft.com/office/2019/extlst" xmlns:r="http://schemas.openxmlformats.org/officeDocument/2006/relationships" xmlns:m="http://schemas.openxmlformats.org/officeDocument/2006/math" xmlns:v="urn:schemas-microsoft-com:vml" xmlns:wp14="http://schemas.microsoft.com/office/word/2010/wordprocessingDrawing" xmlns:wp="http://schemas.openxmlformats.org/drawingml/2006/wordprocessingDrawing" xmlns:w10="urn:schemas-microsoft-com:office:word" xmlns:w="http://schemas.openxmlformats.org/wordprocessingml/2006/main" xmlns:w14="http://schemas.microsoft.com/office/word/2010/wordml" xmlns:w15="http://schemas.microsoft.com/office/word/2012/wordml" xmlns:w16cex="http://schemas.microsoft.com/office/word/2018/wordml/cex" xmlns:w16cid="http://schemas.microsoft.com/office/word/2016/wordml/cid" xmlns:w16="http://schemas.microsoft.com/office/word/2018/wordml" xmlns:w16sdtdh="http://schemas.microsoft.com/office/word/2020/wordml/sdtdatahash" xmlns:w16se="http://schemas.microsoft.com/office/word/2015/wordml/symex" xmlns:wpg="http://schemas.microsoft.com/office/word/2010/wordprocessingGroup" xmlns:wpi="http://schemas.microsoft.com/office/word/2010/wordprocessingInk" xmlns:wne="http://schemas.microsoft.com/office/word/2006/wordml" xmlns:wps="http://schemas.microsoft.com/office/word/2010/wordprocessingShape" mc:Ignorable="w14 w15 w16se w16cid w16 w16cex w16sdtdh wp14">
   <w:endnote w:type="separator" w:id="-1">
     <w:p>
       <w:r>
@@ -10151,7 +10154,7 @@
 </file>
 
 <file path=word/footer1.xml><?xml version="1.0" encoding="utf-8"?>
-<w:ftr xmlns:wpc="http://schemas.microsoft.com/office/word/2010/wordprocessingCanvas" xmlns:cx="http://schemas.microsoft.com/office/drawing/2014/chartex" xmlns:cx1="http://schemas.microsoft.com/office/drawing/2015/9/8/chartex" xmlns:cx2="http://schemas.microsoft.com/office/drawing/2015/10/21/chartex" xmlns:cx3="http://schemas.microsoft.com/office/drawing/2016/5/9/chartex" xmlns:cx4="http://schemas.microsoft.com/office/drawing/2016/5/10/chartex" xmlns:cx5="http://schemas.microsoft.com/office/drawing/2016/5/11/chartex" xmlns:cx6="http://schemas.microsoft.com/office/drawing/2016/5/12/chartex" xmlns:cx7="http://schemas.microsoft.com/office/drawing/2016/5/13/chartex" xmlns:cx8="http://schemas.microsoft.com/office/drawing/2016/5/14/chartex" xmlns:mc="http://schemas.openxmlformats.org/markup-compatibility/2006" xmlns:aink="http://schemas.microsoft.com/office/drawing/2016/ink" xmlns:am3d="http://schemas.microsoft.com/office/drawing/2017/model3d" xmlns:o="urn:schemas-microsoft-com:office:office" xmlns:r="http://schemas.openxmlformats.org/officeDocument/2006/relationships" xmlns:m="http://schemas.openxmlformats.org/officeDocument/2006/math" xmlns:v="urn:schemas-microsoft-com:vml" xmlns:wp14="http://schemas.microsoft.com/office/word/2010/wordprocessingDrawing" xmlns:wp="http://schemas.openxmlformats.org/drawingml/2006/wordprocessingDrawing" xmlns:w10="urn:schemas-microsoft-com:office:word" xmlns:w="http://schemas.openxmlformats.org/wordprocessingml/2006/main" xmlns:w14="http://schemas.microsoft.com/office/word/2010/wordml" xmlns:w15="http://schemas.microsoft.com/office/word/2012/wordml" xmlns:w16cex="http://schemas.microsoft.com/office/word/2018/wordml/cex" xmlns:w16cid="http://schemas.microsoft.com/office/word/2016/wordml/cid" xmlns:w16="http://schemas.microsoft.com/office/word/2018/wordml" xmlns:w16sdtdh="http://schemas.microsoft.com/office/word/2020/wordml/sdtdatahash" xmlns:w16se="http://schemas.microsoft.com/office/word/2015/wordml/symex" xmlns:wpg="http://schemas.microsoft.com/office/word/2010/wordprocessingGroup" xmlns:wpi="http://schemas.microsoft.com/office/word/2010/wordprocessingInk" xmlns:wne="http://schemas.microsoft.com/office/word/2006/wordml" xmlns:wps="http://schemas.microsoft.com/office/word/2010/wordprocessingShape" mc:Ignorable="w14 w15 w16se w16cid w16 w16cex w16sdtdh wp14">
+<w:ftr xmlns:wpc="http://schemas.microsoft.com/office/word/2010/wordprocessingCanvas" xmlns:cx="http://schemas.microsoft.com/office/drawing/2014/chartex" xmlns:cx1="http://schemas.microsoft.com/office/drawing/2015/9/8/chartex" xmlns:cx2="http://schemas.microsoft.com/office/drawing/2015/10/21/chartex" xmlns:cx3="http://schemas.microsoft.com/office/drawing/2016/5/9/chartex" xmlns:cx4="http://schemas.microsoft.com/office/drawing/2016/5/10/chartex" xmlns:cx5="http://schemas.microsoft.com/office/drawing/2016/5/11/chartex" xmlns:cx6="http://schemas.microsoft.com/office/drawing/2016/5/12/chartex" xmlns:cx7="http://schemas.microsoft.com/office/drawing/2016/5/13/chartex" xmlns:cx8="http://schemas.microsoft.com/office/drawing/2016/5/14/chartex" xmlns:mc="http://schemas.openxmlformats.org/markup-compatibility/2006" xmlns:aink="http://schemas.microsoft.com/office/drawing/2016/ink" xmlns:am3d="http://schemas.microsoft.com/office/drawing/2017/model3d" xmlns:o="urn:schemas-microsoft-com:office:office" xmlns:oel="http://schemas.microsoft.com/office/2019/extlst" xmlns:r="http://schemas.openxmlformats.org/officeDocument/2006/relationships" xmlns:m="http://schemas.openxmlformats.org/officeDocument/2006/math" xmlns:v="urn:schemas-microsoft-com:vml" xmlns:wp14="http://schemas.microsoft.com/office/word/2010/wordprocessingDrawing" xmlns:wp="http://schemas.openxmlformats.org/drawingml/2006/wordprocessingDrawing" xmlns:w10="urn:schemas-microsoft-com:office:word" xmlns:w="http://schemas.openxmlformats.org/wordprocessingml/2006/main" xmlns:w14="http://schemas.microsoft.com/office/word/2010/wordml" xmlns:w15="http://schemas.microsoft.com/office/word/2012/wordml" xmlns:w16cex="http://schemas.microsoft.com/office/word/2018/wordml/cex" xmlns:w16cid="http://schemas.microsoft.com/office/word/2016/wordml/cid" xmlns:w16="http://schemas.microsoft.com/office/word/2018/wordml" xmlns:w16sdtdh="http://schemas.microsoft.com/office/word/2020/wordml/sdtdatahash" xmlns:w16se="http://schemas.microsoft.com/office/word/2015/wordml/symex" xmlns:wpg="http://schemas.microsoft.com/office/word/2010/wordprocessingGroup" xmlns:wpi="http://schemas.microsoft.com/office/word/2010/wordprocessingInk" xmlns:wne="http://schemas.microsoft.com/office/word/2006/wordml" xmlns:wps="http://schemas.microsoft.com/office/word/2010/wordprocessingShape" mc:Ignorable="w14 w15 w16se w16cid w16 w16cex w16sdtdh wp14">
   <w:sdt>
     <w:sdtPr>
       <w:id w:val="889738437"/>
@@ -10160,7 +10163,6 @@
         <w:docPartUnique/>
       </w:docPartObj>
     </w:sdtPr>
-    <w:sdtEndPr/>
     <w:sdtContent>
       <w:p>
         <w:pPr>
@@ -10220,7 +10222,7 @@
 </file>
 
 <file path=word/footnotes.xml><?xml version="1.0" encoding="utf-8"?>
-<w:footnotes xmlns:wpc="http://schemas.microsoft.com/office/word/2010/wordprocessingCanvas" xmlns:cx="http://schemas.microsoft.com/office/drawing/2014/chartex" xmlns:cx1="http://schemas.microsoft.com/office/drawing/2015/9/8/chartex" xmlns:cx2="http://schemas.microsoft.com/office/drawing/2015/10/21/chartex" xmlns:cx3="http://schemas.microsoft.com/office/drawing/2016/5/9/chartex" xmlns:cx4="http://schemas.microsoft.com/office/drawing/2016/5/10/chartex" xmlns:cx5="http://schemas.microsoft.com/office/drawing/2016/5/11/chartex" xmlns:cx6="http://schemas.microsoft.com/office/drawing/2016/5/12/chartex" xmlns:cx7="http://schemas.microsoft.com/office/drawing/2016/5/13/chartex" xmlns:cx8="http://schemas.microsoft.com/office/drawing/2016/5/14/chartex" xmlns:mc="http://schemas.openxmlformats.org/markup-compatibility/2006" xmlns:aink="http://schemas.microsoft.com/office/drawing/2016/ink" xmlns:am3d="http://schemas.microsoft.com/office/drawing/2017/model3d" xmlns:o="urn:schemas-microsoft-com:office:office" xmlns:r="http://schemas.openxmlformats.org/officeDocument/2006/relationships" xmlns:m="http://schemas.openxmlformats.org/officeDocument/2006/math" xmlns:v="urn:schemas-microsoft-com:vml" xmlns:wp14="http://schemas.microsoft.com/office/word/2010/wordprocessingDrawing" xmlns:wp="http://schemas.openxmlformats.org/drawingml/2006/wordprocessingDrawing" xmlns:w10="urn:schemas-microsoft-com:office:word" xmlns:w="http://schemas.openxmlformats.org/wordprocessingml/2006/main" xmlns:w14="http://schemas.microsoft.com/office/word/2010/wordml" xmlns:w15="http://schemas.microsoft.com/office/word/2012/wordml" xmlns:w16cex="http://schemas.microsoft.com/office/word/2018/wordml/cex" xmlns:w16cid="http://schemas.microsoft.com/office/word/2016/wordml/cid" xmlns:w16="http://schemas.microsoft.com/office/word/2018/wordml" xmlns:w16sdtdh="http://schemas.microsoft.com/office/word/2020/wordml/sdtdatahash" xmlns:w16se="http://schemas.microsoft.com/office/word/2015/wordml/symex" xmlns:wpg="http://schemas.microsoft.com/office/word/2010/wordprocessingGroup" xmlns:wpi="http://schemas.microsoft.com/office/word/2010/wordprocessingInk" xmlns:wne="http://schemas.microsoft.com/office/word/2006/wordml" xmlns:wps="http://schemas.microsoft.com/office/word/2010/wordprocessingShape" mc:Ignorable="w14 w15 w16se w16cid w16 w16cex w16sdtdh wp14">
+<w:footnotes xmlns:wpc="http://schemas.microsoft.com/office/word/2010/wordprocessingCanvas" xmlns:cx="http://schemas.microsoft.com/office/drawing/2014/chartex" xmlns:cx1="http://schemas.microsoft.com/office/drawing/2015/9/8/chartex" xmlns:cx2="http://schemas.microsoft.com/office/drawing/2015/10/21/chartex" xmlns:cx3="http://schemas.microsoft.com/office/drawing/2016/5/9/chartex" xmlns:cx4="http://schemas.microsoft.com/office/drawing/2016/5/10/chartex" xmlns:cx5="http://schemas.microsoft.com/office/drawing/2016/5/11/chartex" xmlns:cx6="http://schemas.microsoft.com/office/drawing/2016/5/12/chartex" xmlns:cx7="http://schemas.microsoft.com/office/drawing/2016/5/13/chartex" xmlns:cx8="http://schemas.microsoft.com/office/drawing/2016/5/14/chartex" xmlns:mc="http://schemas.openxmlformats.org/markup-compatibility/2006" xmlns:aink="http://schemas.microsoft.com/office/drawing/2016/ink" xmlns:am3d="http://schemas.microsoft.com/office/drawing/2017/model3d" xmlns:o="urn:schemas-microsoft-com:office:office" xmlns:oel="http://schemas.microsoft.com/office/2019/extlst" xmlns:r="http://schemas.openxmlformats.org/officeDocument/2006/relationships" xmlns:m="http://schemas.openxmlformats.org/officeDocument/2006/math" xmlns:v="urn:schemas-microsoft-com:vml" xmlns:wp14="http://schemas.microsoft.com/office/word/2010/wordprocessingDrawing" xmlns:wp="http://schemas.openxmlformats.org/drawingml/2006/wordprocessingDrawing" xmlns:w10="urn:schemas-microsoft-com:office:word" xmlns:w="http://schemas.openxmlformats.org/wordprocessingml/2006/main" xmlns:w14="http://schemas.microsoft.com/office/word/2010/wordml" xmlns:w15="http://schemas.microsoft.com/office/word/2012/wordml" xmlns:w16cex="http://schemas.microsoft.com/office/word/2018/wordml/cex" xmlns:w16cid="http://schemas.microsoft.com/office/word/2016/wordml/cid" xmlns:w16="http://schemas.microsoft.com/office/word/2018/wordml" xmlns:w16sdtdh="http://schemas.microsoft.com/office/word/2020/wordml/sdtdatahash" xmlns:w16se="http://schemas.microsoft.com/office/word/2015/wordml/symex" xmlns:wpg="http://schemas.microsoft.com/office/word/2010/wordprocessingGroup" xmlns:wpi="http://schemas.microsoft.com/office/word/2010/wordprocessingInk" xmlns:wne="http://schemas.microsoft.com/office/word/2006/wordml" xmlns:wps="http://schemas.microsoft.com/office/word/2010/wordprocessingShape" mc:Ignorable="w14 w15 w16se w16cid w16 w16cex w16sdtdh wp14">
   <w:footnote w:type="separator" w:id="-1">
     <w:p>
       <w:r>
@@ -10239,7 +10241,7 @@
 </file>
 
 <file path=word/numbering.xml><?xml version="1.0" encoding="utf-8"?>
-<w:numbering xmlns:wpc="http://schemas.microsoft.com/office/word/2010/wordprocessingCanvas" xmlns:cx="http://schemas.microsoft.com/office/drawing/2014/chartex" xmlns:cx1="http://schemas.microsoft.com/office/drawing/2015/9/8/chartex" xmlns:cx2="http://schemas.microsoft.com/office/drawing/2015/10/21/chartex" xmlns:cx3="http://schemas.microsoft.com/office/drawing/2016/5/9/chartex" xmlns:cx4="http://schemas.microsoft.com/office/drawing/2016/5/10/chartex" xmlns:cx5="http://schemas.microsoft.com/office/drawing/2016/5/11/chartex" xmlns:cx6="http://schemas.microsoft.com/office/drawing/2016/5/12/chartex" xmlns:cx7="http://schemas.microsoft.com/office/drawing/2016/5/13/chartex" xmlns:cx8="http://schemas.microsoft.com/office/drawing/2016/5/14/chartex" xmlns:mc="http://schemas.openxmlformats.org/markup-compatibility/2006" xmlns:aink="http://schemas.microsoft.com/office/drawing/2016/ink" xmlns:am3d="http://schemas.microsoft.com/office/drawing/2017/model3d" xmlns:o="urn:schemas-microsoft-com:office:office" xmlns:r="http://schemas.openxmlformats.org/officeDocument/2006/relationships" xmlns:m="http://schemas.openxmlformats.org/officeDocument/2006/math" xmlns:v="urn:schemas-microsoft-com:vml" xmlns:wp14="http://schemas.microsoft.com/office/word/2010/wordprocessingDrawing" xmlns:wp="http://schemas.openxmlformats.org/drawingml/2006/wordprocessingDrawing" xmlns:w10="urn:schemas-microsoft-com:office:word" xmlns:w="http://schemas.openxmlformats.org/wordprocessingml/2006/main" xmlns:w14="http://schemas.microsoft.com/office/word/2010/wordml" xmlns:w15="http://schemas.microsoft.com/office/word/2012/wordml" xmlns:w16cex="http://schemas.microsoft.com/office/word/2018/wordml/cex" xmlns:w16cid="http://schemas.microsoft.com/office/word/2016/wordml/cid" xmlns:w16="http://schemas.microsoft.com/office/word/2018/wordml" xmlns:w16sdtdh="http://schemas.microsoft.com/office/word/2020/wordml/sdtdatahash" xmlns:w16se="http://schemas.microsoft.com/office/word/2015/wordml/symex" xmlns:wpg="http://schemas.microsoft.com/office/word/2010/wordprocessingGroup" xmlns:wpi="http://schemas.microsoft.com/office/word/2010/wordprocessingInk" xmlns:wne="http://schemas.microsoft.com/office/word/2006/wordml" xmlns:wps="http://schemas.microsoft.com/office/word/2010/wordprocessingShape" mc:Ignorable="w14 w15 w16se w16cid w16 w16cex w16sdtdh wp14">
+<w:numbering xmlns:wpc="http://schemas.microsoft.com/office/word/2010/wordprocessingCanvas" xmlns:cx="http://schemas.microsoft.com/office/drawing/2014/chartex" xmlns:cx1="http://schemas.microsoft.com/office/drawing/2015/9/8/chartex" xmlns:cx2="http://schemas.microsoft.com/office/drawing/2015/10/21/chartex" xmlns:cx3="http://schemas.microsoft.com/office/drawing/2016/5/9/chartex" xmlns:cx4="http://schemas.microsoft.com/office/drawing/2016/5/10/chartex" xmlns:cx5="http://schemas.microsoft.com/office/drawing/2016/5/11/chartex" xmlns:cx6="http://schemas.microsoft.com/office/drawing/2016/5/12/chartex" xmlns:cx7="http://schemas.microsoft.com/office/drawing/2016/5/13/chartex" xmlns:cx8="http://schemas.microsoft.com/office/drawing/2016/5/14/chartex" xmlns:mc="http://schemas.openxmlformats.org/markup-compatibility/2006" xmlns:aink="http://schemas.microsoft.com/office/drawing/2016/ink" xmlns:am3d="http://schemas.microsoft.com/office/drawing/2017/model3d" xmlns:o="urn:schemas-microsoft-com:office:office" xmlns:oel="http://schemas.microsoft.com/office/2019/extlst" xmlns:r="http://schemas.openxmlformats.org/officeDocument/2006/relationships" xmlns:m="http://schemas.openxmlformats.org/officeDocument/2006/math" xmlns:v="urn:schemas-microsoft-com:vml" xmlns:wp14="http://schemas.microsoft.com/office/word/2010/wordprocessingDrawing" xmlns:wp="http://schemas.openxmlformats.org/drawingml/2006/wordprocessingDrawing" xmlns:w10="urn:schemas-microsoft-com:office:word" xmlns:w="http://schemas.openxmlformats.org/wordprocessingml/2006/main" xmlns:w14="http://schemas.microsoft.com/office/word/2010/wordml" xmlns:w15="http://schemas.microsoft.com/office/word/2012/wordml" xmlns:w16cex="http://schemas.microsoft.com/office/word/2018/wordml/cex" xmlns:w16cid="http://schemas.microsoft.com/office/word/2016/wordml/cid" xmlns:w16="http://schemas.microsoft.com/office/word/2018/wordml" xmlns:w16sdtdh="http://schemas.microsoft.com/office/word/2020/wordml/sdtdatahash" xmlns:w16se="http://schemas.microsoft.com/office/word/2015/wordml/symex" xmlns:wpg="http://schemas.microsoft.com/office/word/2010/wordprocessingGroup" xmlns:wpi="http://schemas.microsoft.com/office/word/2010/wordprocessingInk" xmlns:wne="http://schemas.microsoft.com/office/word/2006/wordml" xmlns:wps="http://schemas.microsoft.com/office/word/2010/wordprocessingShape" mc:Ignorable="w14 w15 w16se w16cid w16 w16cex w16sdtdh wp14">
   <w:abstractNum w:abstractNumId="0" w15:restartNumberingAfterBreak="0">
     <w:nsid w:val="0C0D1279"/>
     <w:multiLevelType w:val="multilevel"/>
@@ -12027,52 +12029,52 @@
       </w:pPr>
     </w:lvl>
   </w:abstractNum>
-  <w:num w:numId="1">
+  <w:num w:numId="1" w16cid:durableId="79103778">
     <w:abstractNumId w:val="6"/>
   </w:num>
-  <w:num w:numId="2">
+  <w:num w:numId="2" w16cid:durableId="2077047600">
     <w:abstractNumId w:val="5"/>
   </w:num>
-  <w:num w:numId="3">
+  <w:num w:numId="3" w16cid:durableId="610284489">
     <w:abstractNumId w:val="3"/>
   </w:num>
-  <w:num w:numId="4">
+  <w:num w:numId="4" w16cid:durableId="1015881248">
     <w:abstractNumId w:val="15"/>
   </w:num>
-  <w:num w:numId="5">
+  <w:num w:numId="5" w16cid:durableId="1874225372">
     <w:abstractNumId w:val="13"/>
   </w:num>
-  <w:num w:numId="6">
+  <w:num w:numId="6" w16cid:durableId="2002611508">
     <w:abstractNumId w:val="9"/>
   </w:num>
-  <w:num w:numId="7">
+  <w:num w:numId="7" w16cid:durableId="952903691">
     <w:abstractNumId w:val="12"/>
   </w:num>
-  <w:num w:numId="8">
+  <w:num w:numId="8" w16cid:durableId="1680157482">
     <w:abstractNumId w:val="2"/>
   </w:num>
-  <w:num w:numId="9">
+  <w:num w:numId="9" w16cid:durableId="736780694">
     <w:abstractNumId w:val="8"/>
   </w:num>
-  <w:num w:numId="10">
+  <w:num w:numId="10" w16cid:durableId="100346554">
     <w:abstractNumId w:val="1"/>
   </w:num>
-  <w:num w:numId="11">
+  <w:num w:numId="11" w16cid:durableId="1807895781">
     <w:abstractNumId w:val="7"/>
   </w:num>
-  <w:num w:numId="12">
+  <w:num w:numId="12" w16cid:durableId="1708070305">
     <w:abstractNumId w:val="10"/>
   </w:num>
-  <w:num w:numId="13">
+  <w:num w:numId="13" w16cid:durableId="512035986">
     <w:abstractNumId w:val="11"/>
   </w:num>
-  <w:num w:numId="14">
+  <w:num w:numId="14" w16cid:durableId="613639501">
     <w:abstractNumId w:val="0"/>
   </w:num>
-  <w:num w:numId="15">
+  <w:num w:numId="15" w16cid:durableId="1402218128">
     <w:abstractNumId w:val="14"/>
   </w:num>
-  <w:num w:numId="16">
+  <w:num w:numId="16" w16cid:durableId="1588154091">
     <w:abstractNumId w:val="4"/>
   </w:num>
 </w:numbering>
@@ -12198,6 +12200,7 @@
     <w:lsdException w:name="HTML Sample" w:semiHidden="1" w:unhideWhenUsed="1"/>
     <w:lsdException w:name="HTML Typewriter" w:semiHidden="1" w:unhideWhenUsed="1"/>
     <w:lsdException w:name="HTML Variable" w:semiHidden="1" w:unhideWhenUsed="1"/>
+    <w:lsdException w:name="Normal Table" w:semiHidden="1" w:unhideWhenUsed="1"/>
     <w:lsdException w:name="annotation subject" w:semiHidden="1" w:unhideWhenUsed="1"/>
     <w:lsdException w:name="No List" w:semiHidden="1" w:unhideWhenUsed="1"/>
     <w:lsdException w:name="Outline List 1" w:semiHidden="1" w:unhideWhenUsed="1"/>
@@ -12240,8 +12243,11 @@
     <w:lsdException w:name="Table Contemporary" w:semiHidden="1" w:unhideWhenUsed="1"/>
     <w:lsdException w:name="Table Elegant" w:semiHidden="1" w:unhideWhenUsed="1"/>
     <w:lsdException w:name="Table Professional" w:semiHidden="1" w:unhideWhenUsed="1"/>
+    <w:lsdException w:name="Table Subtle 1" w:semiHidden="1" w:unhideWhenUsed="1"/>
     <w:lsdException w:name="Table Subtle 2" w:semiHidden="1" w:unhideWhenUsed="1"/>
     <w:lsdException w:name="Table Web 1" w:semiHidden="1" w:unhideWhenUsed="1"/>
+    <w:lsdException w:name="Table Web 2" w:semiHidden="1" w:unhideWhenUsed="1"/>
+    <w:lsdException w:name="Table Web 3" w:semiHidden="1" w:unhideWhenUsed="1"/>
     <w:lsdException w:name="Balloon Text" w:semiHidden="1" w:unhideWhenUsed="1"/>
     <w:lsdException w:name="Table Grid" w:uiPriority="39"/>
     <w:lsdException w:name="Table Theme" w:semiHidden="1" w:unhideWhenUsed="1"/>

</xml_diff>

<commit_message>
Updated language on the template for trusts on 73/74.
</commit_message>
<xml_diff>
--- a/docassemble/MAEvictionDefense/data/templates/SummaryProcessDiscovery.docx
+++ b/docassemble/MAEvictionDefense/data/templates/SummaryProcessDiscovery.docx
@@ -1,6 +1,6 @@
 
 <file path=word/document.xml><?xml version="1.0" encoding="utf-8"?>
-<w:document xmlns:wpc="http://schemas.microsoft.com/office/word/2010/wordprocessingCanvas" xmlns:cx="http://schemas.microsoft.com/office/drawing/2014/chartex" xmlns:cx1="http://schemas.microsoft.com/office/drawing/2015/9/8/chartex" xmlns:cx2="http://schemas.microsoft.com/office/drawing/2015/10/21/chartex" xmlns:cx3="http://schemas.microsoft.com/office/drawing/2016/5/9/chartex" xmlns:cx4="http://schemas.microsoft.com/office/drawing/2016/5/10/chartex" xmlns:cx5="http://schemas.microsoft.com/office/drawing/2016/5/11/chartex" xmlns:cx6="http://schemas.microsoft.com/office/drawing/2016/5/12/chartex" xmlns:cx7="http://schemas.microsoft.com/office/drawing/2016/5/13/chartex" xmlns:cx8="http://schemas.microsoft.com/office/drawing/2016/5/14/chartex" xmlns:mc="http://schemas.openxmlformats.org/markup-compatibility/2006" xmlns:aink="http://schemas.microsoft.com/office/drawing/2016/ink" xmlns:am3d="http://schemas.microsoft.com/office/drawing/2017/model3d" xmlns:o="urn:schemas-microsoft-com:office:office" xmlns:r="http://schemas.openxmlformats.org/officeDocument/2006/relationships" xmlns:m="http://schemas.openxmlformats.org/officeDocument/2006/math" xmlns:v="urn:schemas-microsoft-com:vml" xmlns:wp14="http://schemas.microsoft.com/office/word/2010/wordprocessingDrawing" xmlns:wp="http://schemas.openxmlformats.org/drawingml/2006/wordprocessingDrawing" xmlns:w10="urn:schemas-microsoft-com:office:word" xmlns:w="http://schemas.openxmlformats.org/wordprocessingml/2006/main" xmlns:w14="http://schemas.microsoft.com/office/word/2010/wordml" xmlns:w15="http://schemas.microsoft.com/office/word/2012/wordml" xmlns:w16cex="http://schemas.microsoft.com/office/word/2018/wordml/cex" xmlns:w16cid="http://schemas.microsoft.com/office/word/2016/wordml/cid" xmlns:w16="http://schemas.microsoft.com/office/word/2018/wordml" xmlns:w16sdtdh="http://schemas.microsoft.com/office/word/2020/wordml/sdtdatahash" xmlns:w16se="http://schemas.microsoft.com/office/word/2015/wordml/symex" xmlns:wpg="http://schemas.microsoft.com/office/word/2010/wordprocessingGroup" xmlns:wpi="http://schemas.microsoft.com/office/word/2010/wordprocessingInk" xmlns:wne="http://schemas.microsoft.com/office/word/2006/wordml" xmlns:wps="http://schemas.microsoft.com/office/word/2010/wordprocessingShape" mc:Ignorable="w14 w15 w16se w16cid w16 w16cex w16sdtdh wp14">
+<w:document xmlns:wpc="http://schemas.microsoft.com/office/word/2010/wordprocessingCanvas" xmlns:cx="http://schemas.microsoft.com/office/drawing/2014/chartex" xmlns:cx1="http://schemas.microsoft.com/office/drawing/2015/9/8/chartex" xmlns:cx2="http://schemas.microsoft.com/office/drawing/2015/10/21/chartex" xmlns:cx3="http://schemas.microsoft.com/office/drawing/2016/5/9/chartex" xmlns:cx4="http://schemas.microsoft.com/office/drawing/2016/5/10/chartex" xmlns:cx5="http://schemas.microsoft.com/office/drawing/2016/5/11/chartex" xmlns:cx6="http://schemas.microsoft.com/office/drawing/2016/5/12/chartex" xmlns:cx7="http://schemas.microsoft.com/office/drawing/2016/5/13/chartex" xmlns:cx8="http://schemas.microsoft.com/office/drawing/2016/5/14/chartex" xmlns:mc="http://schemas.openxmlformats.org/markup-compatibility/2006" xmlns:aink="http://schemas.microsoft.com/office/drawing/2016/ink" xmlns:am3d="http://schemas.microsoft.com/office/drawing/2017/model3d" xmlns:o="urn:schemas-microsoft-com:office:office" xmlns:oel="http://schemas.microsoft.com/office/2019/extlst" xmlns:r="http://schemas.openxmlformats.org/officeDocument/2006/relationships" xmlns:m="http://schemas.openxmlformats.org/officeDocument/2006/math" xmlns:v="urn:schemas-microsoft-com:vml" xmlns:wp14="http://schemas.microsoft.com/office/word/2010/wordprocessingDrawing" xmlns:wp="http://schemas.openxmlformats.org/drawingml/2006/wordprocessingDrawing" xmlns:w10="urn:schemas-microsoft-com:office:word" xmlns:w="http://schemas.openxmlformats.org/wordprocessingml/2006/main" xmlns:w14="http://schemas.microsoft.com/office/word/2010/wordml" xmlns:w15="http://schemas.microsoft.com/office/word/2012/wordml" xmlns:w16cex="http://schemas.microsoft.com/office/word/2018/wordml/cex" xmlns:w16cid="http://schemas.microsoft.com/office/word/2016/wordml/cid" xmlns:w16="http://schemas.microsoft.com/office/word/2018/wordml" xmlns:w16sdtdh="http://schemas.microsoft.com/office/word/2020/wordml/sdtdatahash" xmlns:w16se="http://schemas.microsoft.com/office/word/2015/wordml/symex" xmlns:wpg="http://schemas.microsoft.com/office/word/2010/wordprocessingGroup" xmlns:wpi="http://schemas.microsoft.com/office/word/2010/wordprocessingInk" xmlns:wne="http://schemas.microsoft.com/office/word/2006/wordml" xmlns:wps="http://schemas.microsoft.com/office/word/2010/wordprocessingShape" mc:Ignorable="w14 w15 w16se w16cid w16 w16cex w16sdtdh wp14">
   <w:body>
     <w:p>
       <w:pPr>
@@ -4031,11 +4031,11 @@
         <w:contextualSpacing/>
       </w:pPr>
       <w:r>
-        <w:t xml:space="preserve">What if any repairs were made to such damage, the date(s) of such repairs, and the costs of </w:t>
-      </w:r>
-      <w:proofErr w:type="gramStart"/>
-      <w:r>
-        <w:t>such repairs;</w:t>
+        <w:t xml:space="preserve">What if any repairs were made to such damage, the date(s) of such repairs, and the costs of such </w:t>
+      </w:r>
+      <w:proofErr w:type="gramStart"/>
+      <w:r>
+        <w:t>repairs;</w:t>
       </w:r>
       <w:proofErr w:type="gramEnd"/>
     </w:p>
@@ -4264,10 +4264,7 @@
         <w:t xml:space="preserve">If you or anyone on your behalf has been inside the tenant’s apartment </w:t>
       </w:r>
       <w:r>
-        <w:t>within the most recent 6 years of the tenant’s tenancy</w:t>
-      </w:r>
-      <w:r>
-        <w:t xml:space="preserve"> </w:t>
+        <w:t xml:space="preserve">within the most recent 6 years of the tenant’s tenancy </w:t>
       </w:r>
       <w:r>
         <w:t>(or before the tenancy for the purpose of renting to/preparing the apartment for the tenant), please state who was inside the apartment, when, and why s/he was there.</w:t>
@@ -5196,10 +5193,6 @@
     <w:p>
       <w:pPr>
         <w:pStyle w:val="BodyText"/>
-        <w:numPr>
-          <w:ilvl w:val="0"/>
-          <w:numId w:val="8"/>
-        </w:numPr>
         <w:spacing w:after="144"/>
         <w:contextualSpacing/>
       </w:pPr>
@@ -5245,7 +5238,13 @@
         <w:contextualSpacing/>
       </w:pPr>
       <w:r>
-        <w:t xml:space="preserve">If you are a trust, please describe the trust in detail, including, but not limited to: </w:t>
+        <w:t>I</w:t>
+      </w:r>
+      <w:r>
+        <w:t>f you do not own the building in your personal capacity, i.e. if the owner of the building is a trust, corporation, or other entity, please describe such trust or business entity in detail, including, but not limited to</w:t>
+      </w:r>
+      <w:r>
+        <w:t xml:space="preserve">: </w:t>
       </w:r>
     </w:p>
     <w:p>
@@ -5259,16 +5258,13 @@
         <w:contextualSpacing/>
       </w:pPr>
       <w:r>
-        <w:t xml:space="preserve">The name and type of the </w:t>
-      </w:r>
-      <w:proofErr w:type="gramStart"/>
-      <w:r>
-        <w:t>trust;</w:t>
-      </w:r>
-      <w:proofErr w:type="gramEnd"/>
-      <w:r>
-        <w:t xml:space="preserve"> </w:t>
-      </w:r>
+        <w:t xml:space="preserve">The name and type of the trust or other business </w:t>
+      </w:r>
+      <w:proofErr w:type="gramStart"/>
+      <w:r>
+        <w:t>entity;</w:t>
+      </w:r>
+      <w:proofErr w:type="gramEnd"/>
     </w:p>
     <w:p>
       <w:pPr>
@@ -5281,7 +5277,7 @@
         <w:contextualSpacing/>
       </w:pPr>
       <w:r>
-        <w:t>The names of the trustees, and any changes thereto (including all applicable dates</w:t>
+        <w:t>The names of the trustee(s) (if a trust) or principals (if an entity other than a trust), and any changes thereto (including all applicable dates</w:t>
       </w:r>
       <w:proofErr w:type="gramStart"/>
       <w:r>
@@ -5471,8 +5467,13 @@
         <w:t>('</w:t>
       </w:r>
       <w:r>
-        <w:t>disability_ra</w:t>
-      </w:r>
+        <w:t>disability_</w:t>
+      </w:r>
+      <w:proofErr w:type="spellStart"/>
+      <w:r>
+        <w:t>ra</w:t>
+      </w:r>
+      <w:proofErr w:type="spellEnd"/>
       <w:proofErr w:type="gramStart"/>
       <w:r>
         <w:t>',</w:t>
@@ -5515,6 +5516,7 @@
         <w:contextualSpacing/>
       </w:pPr>
       <w:r>
+        <w:lastRenderedPageBreak/>
         <w:t>When and how the tenant or other person asked you for an accommodation or an accommodation was otherwise considered (in relation to the Tenant’s Answer or by other means</w:t>
       </w:r>
       <w:proofErr w:type="gramStart"/>
@@ -5534,7 +5536,6 @@
         <w:contextualSpacing/>
       </w:pPr>
       <w:r>
-        <w:lastRenderedPageBreak/>
         <w:t>What s/he requested that you do or not do on account of her/his disability or that you otherwise considered; and</w:t>
       </w:r>
     </w:p>
@@ -6043,40 +6044,47 @@
           <w:rFonts w:eastAsia="Times New Roman" w:cs="Times New Roman"/>
           <w:szCs w:val="24"/>
         </w:rPr>
-        <w:t xml:space="preserve">If the tenant sent you a signed Declaration or any other document related to the CDC order relation to the Temporary Halt in Residential Evictions to Prevent the Further Spread of COVID-19, please state whether you contest the validity of the statements contained in the Declaration, and if so, please state which statements you contest </w:t>
+        <w:t>If the tenant sent you a signed Declaration or any other document related to the CDC order relation to the Temporary Halt in Residential Evictions to Prevent the Further Spread of COVID-</w:t>
       </w:r>
       <w:r>
         <w:rPr>
           <w:rFonts w:eastAsia="Times New Roman" w:cs="Times New Roman"/>
           <w:szCs w:val="24"/>
         </w:rPr>
-        <w:t xml:space="preserve">and </w:t>
+        <w:lastRenderedPageBreak/>
+        <w:t xml:space="preserve">19, please state whether you contest the validity of the statements contained in the Declaration, and if so, please state which statements you contest </w:t>
       </w:r>
       <w:r>
         <w:rPr>
           <w:rFonts w:eastAsia="Times New Roman" w:cs="Times New Roman"/>
           <w:szCs w:val="24"/>
         </w:rPr>
-        <w:t>on what basis, evidence, and/or information.</w:t>
-      </w:r>
-    </w:p>
-    <w:p>
-      <w:pPr>
-        <w:pStyle w:val="ListParagraph"/>
-        <w:numPr>
-          <w:ilvl w:val="0"/>
-          <w:numId w:val="8"/>
-        </w:numPr>
+        <w:t xml:space="preserve">and </w:t>
+      </w:r>
+      <w:r>
         <w:rPr>
           <w:rFonts w:eastAsia="Times New Roman" w:cs="Times New Roman"/>
           <w:szCs w:val="24"/>
         </w:rPr>
-      </w:pPr>
-      <w:r>
+        <w:t>on what basis, evidence, and/or information.</w:t>
+      </w:r>
+    </w:p>
+    <w:p>
+      <w:pPr>
+        <w:pStyle w:val="ListParagraph"/>
+        <w:numPr>
+          <w:ilvl w:val="0"/>
+          <w:numId w:val="8"/>
+        </w:numPr>
         <w:rPr>
           <w:rFonts w:eastAsia="Times New Roman" w:cs="Times New Roman"/>
-        </w:rPr>
-        <w:lastRenderedPageBreak/>
+          <w:szCs w:val="24"/>
+        </w:rPr>
+      </w:pPr>
+      <w:r>
+        <w:rPr>
+          <w:rFonts w:eastAsia="Times New Roman" w:cs="Times New Roman"/>
+        </w:rPr>
         <w:t>{%p endif %}</w:t>
       </w:r>
     </w:p>
@@ -6648,6 +6656,7 @@
         <w:contextualSpacing/>
       </w:pPr>
       <w:r>
+        <w:lastRenderedPageBreak/>
         <w:t>The substance and date(s) of information or notices, if any, provided the tenant by the landlord or any other person or entity regarding any rights the tenant may have under applicable condominium conversion eviction laws.</w:t>
       </w:r>
     </w:p>
@@ -6695,7 +6704,6 @@
       </w:pPr>
       <w:proofErr w:type="gramStart"/>
       <w:r>
-        <w:lastRenderedPageBreak/>
         <w:t xml:space="preserve">{{ </w:t>
       </w:r>
       <w:proofErr w:type="spellStart"/>
@@ -10132,7 +10140,7 @@
 </file>
 
 <file path=word/endnotes.xml><?xml version="1.0" encoding="utf-8"?>
-<w:endnotes xmlns:wpc="http://schemas.microsoft.com/office/word/2010/wordprocessingCanvas" xmlns:cx="http://schemas.microsoft.com/office/drawing/2014/chartex" xmlns:cx1="http://schemas.microsoft.com/office/drawing/2015/9/8/chartex" xmlns:cx2="http://schemas.microsoft.com/office/drawing/2015/10/21/chartex" xmlns:cx3="http://schemas.microsoft.com/office/drawing/2016/5/9/chartex" xmlns:cx4="http://schemas.microsoft.com/office/drawing/2016/5/10/chartex" xmlns:cx5="http://schemas.microsoft.com/office/drawing/2016/5/11/chartex" xmlns:cx6="http://schemas.microsoft.com/office/drawing/2016/5/12/chartex" xmlns:cx7="http://schemas.microsoft.com/office/drawing/2016/5/13/chartex" xmlns:cx8="http://schemas.microsoft.com/office/drawing/2016/5/14/chartex" xmlns:mc="http://schemas.openxmlformats.org/markup-compatibility/2006" xmlns:aink="http://schemas.microsoft.com/office/drawing/2016/ink" xmlns:am3d="http://schemas.microsoft.com/office/drawing/2017/model3d" xmlns:o="urn:schemas-microsoft-com:office:office" xmlns:r="http://schemas.openxmlformats.org/officeDocument/2006/relationships" xmlns:m="http://schemas.openxmlformats.org/officeDocument/2006/math" xmlns:v="urn:schemas-microsoft-com:vml" xmlns:wp14="http://schemas.microsoft.com/office/word/2010/wordprocessingDrawing" xmlns:wp="http://schemas.openxmlformats.org/drawingml/2006/wordprocessingDrawing" xmlns:w10="urn:schemas-microsoft-com:office:word" xmlns:w="http://schemas.openxmlformats.org/wordprocessingml/2006/main" xmlns:w14="http://schemas.microsoft.com/office/word/2010/wordml" xmlns:w15="http://schemas.microsoft.com/office/word/2012/wordml" xmlns:w16cex="http://schemas.microsoft.com/office/word/2018/wordml/cex" xmlns:w16cid="http://schemas.microsoft.com/office/word/2016/wordml/cid" xmlns:w16="http://schemas.microsoft.com/office/word/2018/wordml" xmlns:w16sdtdh="http://schemas.microsoft.com/office/word/2020/wordml/sdtdatahash" xmlns:w16se="http://schemas.microsoft.com/office/word/2015/wordml/symex" xmlns:wpg="http://schemas.microsoft.com/office/word/2010/wordprocessingGroup" xmlns:wpi="http://schemas.microsoft.com/office/word/2010/wordprocessingInk" xmlns:wne="http://schemas.microsoft.com/office/word/2006/wordml" xmlns:wps="http://schemas.microsoft.com/office/word/2010/wordprocessingShape" mc:Ignorable="w14 w15 w16se w16cid w16 w16cex w16sdtdh wp14">
+<w:endnotes xmlns:wpc="http://schemas.microsoft.com/office/word/2010/wordprocessingCanvas" xmlns:cx="http://schemas.microsoft.com/office/drawing/2014/chartex" xmlns:cx1="http://schemas.microsoft.com/office/drawing/2015/9/8/chartex" xmlns:cx2="http://schemas.microsoft.com/office/drawing/2015/10/21/chartex" xmlns:cx3="http://schemas.microsoft.com/office/drawing/2016/5/9/chartex" xmlns:cx4="http://schemas.microsoft.com/office/drawing/2016/5/10/chartex" xmlns:cx5="http://schemas.microsoft.com/office/drawing/2016/5/11/chartex" xmlns:cx6="http://schemas.microsoft.com/office/drawing/2016/5/12/chartex" xmlns:cx7="http://schemas.microsoft.com/office/drawing/2016/5/13/chartex" xmlns:cx8="http://schemas.microsoft.com/office/drawing/2016/5/14/chartex" xmlns:mc="http://schemas.openxmlformats.org/markup-compatibility/2006" xmlns:aink="http://schemas.microsoft.com/office/drawing/2016/ink" xmlns:am3d="http://schemas.microsoft.com/office/drawing/2017/model3d" xmlns:o="urn:schemas-microsoft-com:office:office" xmlns:oel="http://schemas.microsoft.com/office/2019/extlst" xmlns:r="http://schemas.openxmlformats.org/officeDocument/2006/relationships" xmlns:m="http://schemas.openxmlformats.org/officeDocument/2006/math" xmlns:v="urn:schemas-microsoft-com:vml" xmlns:wp14="http://schemas.microsoft.com/office/word/2010/wordprocessingDrawing" xmlns:wp="http://schemas.openxmlformats.org/drawingml/2006/wordprocessingDrawing" xmlns:w10="urn:schemas-microsoft-com:office:word" xmlns:w="http://schemas.openxmlformats.org/wordprocessingml/2006/main" xmlns:w14="http://schemas.microsoft.com/office/word/2010/wordml" xmlns:w15="http://schemas.microsoft.com/office/word/2012/wordml" xmlns:w16cex="http://schemas.microsoft.com/office/word/2018/wordml/cex" xmlns:w16cid="http://schemas.microsoft.com/office/word/2016/wordml/cid" xmlns:w16="http://schemas.microsoft.com/office/word/2018/wordml" xmlns:w16sdtdh="http://schemas.microsoft.com/office/word/2020/wordml/sdtdatahash" xmlns:w16se="http://schemas.microsoft.com/office/word/2015/wordml/symex" xmlns:wpg="http://schemas.microsoft.com/office/word/2010/wordprocessingGroup" xmlns:wpi="http://schemas.microsoft.com/office/word/2010/wordprocessingInk" xmlns:wne="http://schemas.microsoft.com/office/word/2006/wordml" xmlns:wps="http://schemas.microsoft.com/office/word/2010/wordprocessingShape" mc:Ignorable="w14 w15 w16se w16cid w16 w16cex w16sdtdh wp14">
   <w:endnote w:type="separator" w:id="-1">
     <w:p>
       <w:r>
@@ -10151,7 +10159,7 @@
 </file>
 
 <file path=word/footer1.xml><?xml version="1.0" encoding="utf-8"?>
-<w:ftr xmlns:wpc="http://schemas.microsoft.com/office/word/2010/wordprocessingCanvas" xmlns:cx="http://schemas.microsoft.com/office/drawing/2014/chartex" xmlns:cx1="http://schemas.microsoft.com/office/drawing/2015/9/8/chartex" xmlns:cx2="http://schemas.microsoft.com/office/drawing/2015/10/21/chartex" xmlns:cx3="http://schemas.microsoft.com/office/drawing/2016/5/9/chartex" xmlns:cx4="http://schemas.microsoft.com/office/drawing/2016/5/10/chartex" xmlns:cx5="http://schemas.microsoft.com/office/drawing/2016/5/11/chartex" xmlns:cx6="http://schemas.microsoft.com/office/drawing/2016/5/12/chartex" xmlns:cx7="http://schemas.microsoft.com/office/drawing/2016/5/13/chartex" xmlns:cx8="http://schemas.microsoft.com/office/drawing/2016/5/14/chartex" xmlns:mc="http://schemas.openxmlformats.org/markup-compatibility/2006" xmlns:aink="http://schemas.microsoft.com/office/drawing/2016/ink" xmlns:am3d="http://schemas.microsoft.com/office/drawing/2017/model3d" xmlns:o="urn:schemas-microsoft-com:office:office" xmlns:r="http://schemas.openxmlformats.org/officeDocument/2006/relationships" xmlns:m="http://schemas.openxmlformats.org/officeDocument/2006/math" xmlns:v="urn:schemas-microsoft-com:vml" xmlns:wp14="http://schemas.microsoft.com/office/word/2010/wordprocessingDrawing" xmlns:wp="http://schemas.openxmlformats.org/drawingml/2006/wordprocessingDrawing" xmlns:w10="urn:schemas-microsoft-com:office:word" xmlns:w="http://schemas.openxmlformats.org/wordprocessingml/2006/main" xmlns:w14="http://schemas.microsoft.com/office/word/2010/wordml" xmlns:w15="http://schemas.microsoft.com/office/word/2012/wordml" xmlns:w16cex="http://schemas.microsoft.com/office/word/2018/wordml/cex" xmlns:w16cid="http://schemas.microsoft.com/office/word/2016/wordml/cid" xmlns:w16="http://schemas.microsoft.com/office/word/2018/wordml" xmlns:w16sdtdh="http://schemas.microsoft.com/office/word/2020/wordml/sdtdatahash" xmlns:w16se="http://schemas.microsoft.com/office/word/2015/wordml/symex" xmlns:wpg="http://schemas.microsoft.com/office/word/2010/wordprocessingGroup" xmlns:wpi="http://schemas.microsoft.com/office/word/2010/wordprocessingInk" xmlns:wne="http://schemas.microsoft.com/office/word/2006/wordml" xmlns:wps="http://schemas.microsoft.com/office/word/2010/wordprocessingShape" mc:Ignorable="w14 w15 w16se w16cid w16 w16cex w16sdtdh wp14">
+<w:ftr xmlns:wpc="http://schemas.microsoft.com/office/word/2010/wordprocessingCanvas" xmlns:cx="http://schemas.microsoft.com/office/drawing/2014/chartex" xmlns:cx1="http://schemas.microsoft.com/office/drawing/2015/9/8/chartex" xmlns:cx2="http://schemas.microsoft.com/office/drawing/2015/10/21/chartex" xmlns:cx3="http://schemas.microsoft.com/office/drawing/2016/5/9/chartex" xmlns:cx4="http://schemas.microsoft.com/office/drawing/2016/5/10/chartex" xmlns:cx5="http://schemas.microsoft.com/office/drawing/2016/5/11/chartex" xmlns:cx6="http://schemas.microsoft.com/office/drawing/2016/5/12/chartex" xmlns:cx7="http://schemas.microsoft.com/office/drawing/2016/5/13/chartex" xmlns:cx8="http://schemas.microsoft.com/office/drawing/2016/5/14/chartex" xmlns:mc="http://schemas.openxmlformats.org/markup-compatibility/2006" xmlns:aink="http://schemas.microsoft.com/office/drawing/2016/ink" xmlns:am3d="http://schemas.microsoft.com/office/drawing/2017/model3d" xmlns:o="urn:schemas-microsoft-com:office:office" xmlns:oel="http://schemas.microsoft.com/office/2019/extlst" xmlns:r="http://schemas.openxmlformats.org/officeDocument/2006/relationships" xmlns:m="http://schemas.openxmlformats.org/officeDocument/2006/math" xmlns:v="urn:schemas-microsoft-com:vml" xmlns:wp14="http://schemas.microsoft.com/office/word/2010/wordprocessingDrawing" xmlns:wp="http://schemas.openxmlformats.org/drawingml/2006/wordprocessingDrawing" xmlns:w10="urn:schemas-microsoft-com:office:word" xmlns:w="http://schemas.openxmlformats.org/wordprocessingml/2006/main" xmlns:w14="http://schemas.microsoft.com/office/word/2010/wordml" xmlns:w15="http://schemas.microsoft.com/office/word/2012/wordml" xmlns:w16cex="http://schemas.microsoft.com/office/word/2018/wordml/cex" xmlns:w16cid="http://schemas.microsoft.com/office/word/2016/wordml/cid" xmlns:w16="http://schemas.microsoft.com/office/word/2018/wordml" xmlns:w16sdtdh="http://schemas.microsoft.com/office/word/2020/wordml/sdtdatahash" xmlns:w16se="http://schemas.microsoft.com/office/word/2015/wordml/symex" xmlns:wpg="http://schemas.microsoft.com/office/word/2010/wordprocessingGroup" xmlns:wpi="http://schemas.microsoft.com/office/word/2010/wordprocessingInk" xmlns:wne="http://schemas.microsoft.com/office/word/2006/wordml" xmlns:wps="http://schemas.microsoft.com/office/word/2010/wordprocessingShape" mc:Ignorable="w14 w15 w16se w16cid w16 w16cex w16sdtdh wp14">
   <w:sdt>
     <w:sdtPr>
       <w:id w:val="889738437"/>
@@ -10160,7 +10168,6 @@
         <w:docPartUnique/>
       </w:docPartObj>
     </w:sdtPr>
-    <w:sdtEndPr/>
     <w:sdtContent>
       <w:p>
         <w:pPr>
@@ -10220,7 +10227,7 @@
 </file>
 
 <file path=word/footnotes.xml><?xml version="1.0" encoding="utf-8"?>
-<w:footnotes xmlns:wpc="http://schemas.microsoft.com/office/word/2010/wordprocessingCanvas" xmlns:cx="http://schemas.microsoft.com/office/drawing/2014/chartex" xmlns:cx1="http://schemas.microsoft.com/office/drawing/2015/9/8/chartex" xmlns:cx2="http://schemas.microsoft.com/office/drawing/2015/10/21/chartex" xmlns:cx3="http://schemas.microsoft.com/office/drawing/2016/5/9/chartex" xmlns:cx4="http://schemas.microsoft.com/office/drawing/2016/5/10/chartex" xmlns:cx5="http://schemas.microsoft.com/office/drawing/2016/5/11/chartex" xmlns:cx6="http://schemas.microsoft.com/office/drawing/2016/5/12/chartex" xmlns:cx7="http://schemas.microsoft.com/office/drawing/2016/5/13/chartex" xmlns:cx8="http://schemas.microsoft.com/office/drawing/2016/5/14/chartex" xmlns:mc="http://schemas.openxmlformats.org/markup-compatibility/2006" xmlns:aink="http://schemas.microsoft.com/office/drawing/2016/ink" xmlns:am3d="http://schemas.microsoft.com/office/drawing/2017/model3d" xmlns:o="urn:schemas-microsoft-com:office:office" xmlns:r="http://schemas.openxmlformats.org/officeDocument/2006/relationships" xmlns:m="http://schemas.openxmlformats.org/officeDocument/2006/math" xmlns:v="urn:schemas-microsoft-com:vml" xmlns:wp14="http://schemas.microsoft.com/office/word/2010/wordprocessingDrawing" xmlns:wp="http://schemas.openxmlformats.org/drawingml/2006/wordprocessingDrawing" xmlns:w10="urn:schemas-microsoft-com:office:word" xmlns:w="http://schemas.openxmlformats.org/wordprocessingml/2006/main" xmlns:w14="http://schemas.microsoft.com/office/word/2010/wordml" xmlns:w15="http://schemas.microsoft.com/office/word/2012/wordml" xmlns:w16cex="http://schemas.microsoft.com/office/word/2018/wordml/cex" xmlns:w16cid="http://schemas.microsoft.com/office/word/2016/wordml/cid" xmlns:w16="http://schemas.microsoft.com/office/word/2018/wordml" xmlns:w16sdtdh="http://schemas.microsoft.com/office/word/2020/wordml/sdtdatahash" xmlns:w16se="http://schemas.microsoft.com/office/word/2015/wordml/symex" xmlns:wpg="http://schemas.microsoft.com/office/word/2010/wordprocessingGroup" xmlns:wpi="http://schemas.microsoft.com/office/word/2010/wordprocessingInk" xmlns:wne="http://schemas.microsoft.com/office/word/2006/wordml" xmlns:wps="http://schemas.microsoft.com/office/word/2010/wordprocessingShape" mc:Ignorable="w14 w15 w16se w16cid w16 w16cex w16sdtdh wp14">
+<w:footnotes xmlns:wpc="http://schemas.microsoft.com/office/word/2010/wordprocessingCanvas" xmlns:cx="http://schemas.microsoft.com/office/drawing/2014/chartex" xmlns:cx1="http://schemas.microsoft.com/office/drawing/2015/9/8/chartex" xmlns:cx2="http://schemas.microsoft.com/office/drawing/2015/10/21/chartex" xmlns:cx3="http://schemas.microsoft.com/office/drawing/2016/5/9/chartex" xmlns:cx4="http://schemas.microsoft.com/office/drawing/2016/5/10/chartex" xmlns:cx5="http://schemas.microsoft.com/office/drawing/2016/5/11/chartex" xmlns:cx6="http://schemas.microsoft.com/office/drawing/2016/5/12/chartex" xmlns:cx7="http://schemas.microsoft.com/office/drawing/2016/5/13/chartex" xmlns:cx8="http://schemas.microsoft.com/office/drawing/2016/5/14/chartex" xmlns:mc="http://schemas.openxmlformats.org/markup-compatibility/2006" xmlns:aink="http://schemas.microsoft.com/office/drawing/2016/ink" xmlns:am3d="http://schemas.microsoft.com/office/drawing/2017/model3d" xmlns:o="urn:schemas-microsoft-com:office:office" xmlns:oel="http://schemas.microsoft.com/office/2019/extlst" xmlns:r="http://schemas.openxmlformats.org/officeDocument/2006/relationships" xmlns:m="http://schemas.openxmlformats.org/officeDocument/2006/math" xmlns:v="urn:schemas-microsoft-com:vml" xmlns:wp14="http://schemas.microsoft.com/office/word/2010/wordprocessingDrawing" xmlns:wp="http://schemas.openxmlformats.org/drawingml/2006/wordprocessingDrawing" xmlns:w10="urn:schemas-microsoft-com:office:word" xmlns:w="http://schemas.openxmlformats.org/wordprocessingml/2006/main" xmlns:w14="http://schemas.microsoft.com/office/word/2010/wordml" xmlns:w15="http://schemas.microsoft.com/office/word/2012/wordml" xmlns:w16cex="http://schemas.microsoft.com/office/word/2018/wordml/cex" xmlns:w16cid="http://schemas.microsoft.com/office/word/2016/wordml/cid" xmlns:w16="http://schemas.microsoft.com/office/word/2018/wordml" xmlns:w16sdtdh="http://schemas.microsoft.com/office/word/2020/wordml/sdtdatahash" xmlns:w16se="http://schemas.microsoft.com/office/word/2015/wordml/symex" xmlns:wpg="http://schemas.microsoft.com/office/word/2010/wordprocessingGroup" xmlns:wpi="http://schemas.microsoft.com/office/word/2010/wordprocessingInk" xmlns:wne="http://schemas.microsoft.com/office/word/2006/wordml" xmlns:wps="http://schemas.microsoft.com/office/word/2010/wordprocessingShape" mc:Ignorable="w14 w15 w16se w16cid w16 w16cex w16sdtdh wp14">
   <w:footnote w:type="separator" w:id="-1">
     <w:p>
       <w:r>
@@ -10239,7 +10246,7 @@
 </file>
 
 <file path=word/numbering.xml><?xml version="1.0" encoding="utf-8"?>
-<w:numbering xmlns:wpc="http://schemas.microsoft.com/office/word/2010/wordprocessingCanvas" xmlns:cx="http://schemas.microsoft.com/office/drawing/2014/chartex" xmlns:cx1="http://schemas.microsoft.com/office/drawing/2015/9/8/chartex" xmlns:cx2="http://schemas.microsoft.com/office/drawing/2015/10/21/chartex" xmlns:cx3="http://schemas.microsoft.com/office/drawing/2016/5/9/chartex" xmlns:cx4="http://schemas.microsoft.com/office/drawing/2016/5/10/chartex" xmlns:cx5="http://schemas.microsoft.com/office/drawing/2016/5/11/chartex" xmlns:cx6="http://schemas.microsoft.com/office/drawing/2016/5/12/chartex" xmlns:cx7="http://schemas.microsoft.com/office/drawing/2016/5/13/chartex" xmlns:cx8="http://schemas.microsoft.com/office/drawing/2016/5/14/chartex" xmlns:mc="http://schemas.openxmlformats.org/markup-compatibility/2006" xmlns:aink="http://schemas.microsoft.com/office/drawing/2016/ink" xmlns:am3d="http://schemas.microsoft.com/office/drawing/2017/model3d" xmlns:o="urn:schemas-microsoft-com:office:office" xmlns:r="http://schemas.openxmlformats.org/officeDocument/2006/relationships" xmlns:m="http://schemas.openxmlformats.org/officeDocument/2006/math" xmlns:v="urn:schemas-microsoft-com:vml" xmlns:wp14="http://schemas.microsoft.com/office/word/2010/wordprocessingDrawing" xmlns:wp="http://schemas.openxmlformats.org/drawingml/2006/wordprocessingDrawing" xmlns:w10="urn:schemas-microsoft-com:office:word" xmlns:w="http://schemas.openxmlformats.org/wordprocessingml/2006/main" xmlns:w14="http://schemas.microsoft.com/office/word/2010/wordml" xmlns:w15="http://schemas.microsoft.com/office/word/2012/wordml" xmlns:w16cex="http://schemas.microsoft.com/office/word/2018/wordml/cex" xmlns:w16cid="http://schemas.microsoft.com/office/word/2016/wordml/cid" xmlns:w16="http://schemas.microsoft.com/office/word/2018/wordml" xmlns:w16sdtdh="http://schemas.microsoft.com/office/word/2020/wordml/sdtdatahash" xmlns:w16se="http://schemas.microsoft.com/office/word/2015/wordml/symex" xmlns:wpg="http://schemas.microsoft.com/office/word/2010/wordprocessingGroup" xmlns:wpi="http://schemas.microsoft.com/office/word/2010/wordprocessingInk" xmlns:wne="http://schemas.microsoft.com/office/word/2006/wordml" xmlns:wps="http://schemas.microsoft.com/office/word/2010/wordprocessingShape" mc:Ignorable="w14 w15 w16se w16cid w16 w16cex w16sdtdh wp14">
+<w:numbering xmlns:wpc="http://schemas.microsoft.com/office/word/2010/wordprocessingCanvas" xmlns:cx="http://schemas.microsoft.com/office/drawing/2014/chartex" xmlns:cx1="http://schemas.microsoft.com/office/drawing/2015/9/8/chartex" xmlns:cx2="http://schemas.microsoft.com/office/drawing/2015/10/21/chartex" xmlns:cx3="http://schemas.microsoft.com/office/drawing/2016/5/9/chartex" xmlns:cx4="http://schemas.microsoft.com/office/drawing/2016/5/10/chartex" xmlns:cx5="http://schemas.microsoft.com/office/drawing/2016/5/11/chartex" xmlns:cx6="http://schemas.microsoft.com/office/drawing/2016/5/12/chartex" xmlns:cx7="http://schemas.microsoft.com/office/drawing/2016/5/13/chartex" xmlns:cx8="http://schemas.microsoft.com/office/drawing/2016/5/14/chartex" xmlns:mc="http://schemas.openxmlformats.org/markup-compatibility/2006" xmlns:aink="http://schemas.microsoft.com/office/drawing/2016/ink" xmlns:am3d="http://schemas.microsoft.com/office/drawing/2017/model3d" xmlns:o="urn:schemas-microsoft-com:office:office" xmlns:oel="http://schemas.microsoft.com/office/2019/extlst" xmlns:r="http://schemas.openxmlformats.org/officeDocument/2006/relationships" xmlns:m="http://schemas.openxmlformats.org/officeDocument/2006/math" xmlns:v="urn:schemas-microsoft-com:vml" xmlns:wp14="http://schemas.microsoft.com/office/word/2010/wordprocessingDrawing" xmlns:wp="http://schemas.openxmlformats.org/drawingml/2006/wordprocessingDrawing" xmlns:w10="urn:schemas-microsoft-com:office:word" xmlns:w="http://schemas.openxmlformats.org/wordprocessingml/2006/main" xmlns:w14="http://schemas.microsoft.com/office/word/2010/wordml" xmlns:w15="http://schemas.microsoft.com/office/word/2012/wordml" xmlns:w16cex="http://schemas.microsoft.com/office/word/2018/wordml/cex" xmlns:w16cid="http://schemas.microsoft.com/office/word/2016/wordml/cid" xmlns:w16="http://schemas.microsoft.com/office/word/2018/wordml" xmlns:w16sdtdh="http://schemas.microsoft.com/office/word/2020/wordml/sdtdatahash" xmlns:w16se="http://schemas.microsoft.com/office/word/2015/wordml/symex" xmlns:wpg="http://schemas.microsoft.com/office/word/2010/wordprocessingGroup" xmlns:wpi="http://schemas.microsoft.com/office/word/2010/wordprocessingInk" xmlns:wne="http://schemas.microsoft.com/office/word/2006/wordml" xmlns:wps="http://schemas.microsoft.com/office/word/2010/wordprocessingShape" mc:Ignorable="w14 w15 w16se w16cid w16 w16cex w16sdtdh wp14">
   <w:abstractNum w:abstractNumId="0" w15:restartNumberingAfterBreak="0">
     <w:nsid w:val="0C0D1279"/>
     <w:multiLevelType w:val="multilevel"/>
@@ -10390,6 +10397,155 @@
     </w:lvl>
   </w:abstractNum>
   <w:abstractNum w:abstractNumId="1" w15:restartNumberingAfterBreak="0">
+    <w:nsid w:val="0F6B2C0C"/>
+    <w:multiLevelType w:val="multilevel"/>
+    <w:tmpl w:val="206C11F6"/>
+    <w:lvl w:ilvl="0">
+      <w:start w:val="1"/>
+      <w:numFmt w:val="bullet"/>
+      <w:lvlText w:val=""/>
+      <w:lvlJc w:val="left"/>
+      <w:pPr>
+        <w:tabs>
+          <w:tab w:val="num" w:pos="720"/>
+        </w:tabs>
+        <w:ind w:left="720" w:hanging="360"/>
+      </w:pPr>
+      <w:rPr>
+        <w:rFonts w:ascii="Symbol" w:hAnsi="Symbol" w:hint="default"/>
+        <w:sz w:val="20"/>
+      </w:rPr>
+    </w:lvl>
+    <w:lvl w:ilvl="1" w:tentative="1">
+      <w:start w:val="1"/>
+      <w:numFmt w:val="bullet"/>
+      <w:lvlText w:val="o"/>
+      <w:lvlJc w:val="left"/>
+      <w:pPr>
+        <w:tabs>
+          <w:tab w:val="num" w:pos="1440"/>
+        </w:tabs>
+        <w:ind w:left="1440" w:hanging="360"/>
+      </w:pPr>
+      <w:rPr>
+        <w:rFonts w:ascii="Courier New" w:hAnsi="Courier New" w:hint="default"/>
+        <w:sz w:val="20"/>
+      </w:rPr>
+    </w:lvl>
+    <w:lvl w:ilvl="2" w:tentative="1">
+      <w:start w:val="1"/>
+      <w:numFmt w:val="bullet"/>
+      <w:lvlText w:val=""/>
+      <w:lvlJc w:val="left"/>
+      <w:pPr>
+        <w:tabs>
+          <w:tab w:val="num" w:pos="2160"/>
+        </w:tabs>
+        <w:ind w:left="2160" w:hanging="360"/>
+      </w:pPr>
+      <w:rPr>
+        <w:rFonts w:ascii="Wingdings" w:hAnsi="Wingdings" w:hint="default"/>
+        <w:sz w:val="20"/>
+      </w:rPr>
+    </w:lvl>
+    <w:lvl w:ilvl="3" w:tentative="1">
+      <w:start w:val="1"/>
+      <w:numFmt w:val="bullet"/>
+      <w:lvlText w:val=""/>
+      <w:lvlJc w:val="left"/>
+      <w:pPr>
+        <w:tabs>
+          <w:tab w:val="num" w:pos="2880"/>
+        </w:tabs>
+        <w:ind w:left="2880" w:hanging="360"/>
+      </w:pPr>
+      <w:rPr>
+        <w:rFonts w:ascii="Wingdings" w:hAnsi="Wingdings" w:hint="default"/>
+        <w:sz w:val="20"/>
+      </w:rPr>
+    </w:lvl>
+    <w:lvl w:ilvl="4" w:tentative="1">
+      <w:start w:val="1"/>
+      <w:numFmt w:val="bullet"/>
+      <w:lvlText w:val=""/>
+      <w:lvlJc w:val="left"/>
+      <w:pPr>
+        <w:tabs>
+          <w:tab w:val="num" w:pos="3600"/>
+        </w:tabs>
+        <w:ind w:left="3600" w:hanging="360"/>
+      </w:pPr>
+      <w:rPr>
+        <w:rFonts w:ascii="Wingdings" w:hAnsi="Wingdings" w:hint="default"/>
+        <w:sz w:val="20"/>
+      </w:rPr>
+    </w:lvl>
+    <w:lvl w:ilvl="5" w:tentative="1">
+      <w:start w:val="1"/>
+      <w:numFmt w:val="bullet"/>
+      <w:lvlText w:val=""/>
+      <w:lvlJc w:val="left"/>
+      <w:pPr>
+        <w:tabs>
+          <w:tab w:val="num" w:pos="4320"/>
+        </w:tabs>
+        <w:ind w:left="4320" w:hanging="360"/>
+      </w:pPr>
+      <w:rPr>
+        <w:rFonts w:ascii="Wingdings" w:hAnsi="Wingdings" w:hint="default"/>
+        <w:sz w:val="20"/>
+      </w:rPr>
+    </w:lvl>
+    <w:lvl w:ilvl="6" w:tentative="1">
+      <w:start w:val="1"/>
+      <w:numFmt w:val="bullet"/>
+      <w:lvlText w:val=""/>
+      <w:lvlJc w:val="left"/>
+      <w:pPr>
+        <w:tabs>
+          <w:tab w:val="num" w:pos="5040"/>
+        </w:tabs>
+        <w:ind w:left="5040" w:hanging="360"/>
+      </w:pPr>
+      <w:rPr>
+        <w:rFonts w:ascii="Wingdings" w:hAnsi="Wingdings" w:hint="default"/>
+        <w:sz w:val="20"/>
+      </w:rPr>
+    </w:lvl>
+    <w:lvl w:ilvl="7" w:tentative="1">
+      <w:start w:val="1"/>
+      <w:numFmt w:val="bullet"/>
+      <w:lvlText w:val=""/>
+      <w:lvlJc w:val="left"/>
+      <w:pPr>
+        <w:tabs>
+          <w:tab w:val="num" w:pos="5760"/>
+        </w:tabs>
+        <w:ind w:left="5760" w:hanging="360"/>
+      </w:pPr>
+      <w:rPr>
+        <w:rFonts w:ascii="Wingdings" w:hAnsi="Wingdings" w:hint="default"/>
+        <w:sz w:val="20"/>
+      </w:rPr>
+    </w:lvl>
+    <w:lvl w:ilvl="8" w:tentative="1">
+      <w:start w:val="1"/>
+      <w:numFmt w:val="bullet"/>
+      <w:lvlText w:val=""/>
+      <w:lvlJc w:val="left"/>
+      <w:pPr>
+        <w:tabs>
+          <w:tab w:val="num" w:pos="6480"/>
+        </w:tabs>
+        <w:ind w:left="6480" w:hanging="360"/>
+      </w:pPr>
+      <w:rPr>
+        <w:rFonts w:ascii="Wingdings" w:hAnsi="Wingdings" w:hint="default"/>
+        <w:sz w:val="20"/>
+      </w:rPr>
+    </w:lvl>
+  </w:abstractNum>
+  <w:abstractNum w:abstractNumId="2" w15:restartNumberingAfterBreak="0">
     <w:nsid w:val="16A14BC9"/>
     <w:multiLevelType w:val="multilevel"/>
     <w:tmpl w:val="3140C600"/>
@@ -10513,7 +10669,7 @@
       </w:pPr>
     </w:lvl>
   </w:abstractNum>
-  <w:abstractNum w:abstractNumId="2" w15:restartNumberingAfterBreak="0">
+  <w:abstractNum w:abstractNumId="3" w15:restartNumberingAfterBreak="0">
     <w:nsid w:val="16CB1D3E"/>
     <w:multiLevelType w:val="multilevel"/>
     <w:tmpl w:val="137014CE"/>
@@ -10662,7 +10818,7 @@
       </w:rPr>
     </w:lvl>
   </w:abstractNum>
-  <w:abstractNum w:abstractNumId="3" w15:restartNumberingAfterBreak="0">
+  <w:abstractNum w:abstractNumId="4" w15:restartNumberingAfterBreak="0">
     <w:nsid w:val="16D470CA"/>
     <w:multiLevelType w:val="hybridMultilevel"/>
     <w:tmpl w:val="921EEE88"/>
@@ -10748,7 +10904,7 @@
       </w:pPr>
     </w:lvl>
   </w:abstractNum>
-  <w:abstractNum w:abstractNumId="4" w15:restartNumberingAfterBreak="0">
+  <w:abstractNum w:abstractNumId="5" w15:restartNumberingAfterBreak="0">
     <w:nsid w:val="1FB52B03"/>
     <w:multiLevelType w:val="multilevel"/>
     <w:tmpl w:val="B9BCE5C6"/>
@@ -10838,7 +10994,156 @@
       </w:pPr>
     </w:lvl>
   </w:abstractNum>
-  <w:abstractNum w:abstractNumId="5" w15:restartNumberingAfterBreak="0">
+  <w:abstractNum w:abstractNumId="6" w15:restartNumberingAfterBreak="0">
+    <w:nsid w:val="23AA6D5D"/>
+    <w:multiLevelType w:val="multilevel"/>
+    <w:tmpl w:val="997EE44C"/>
+    <w:lvl w:ilvl="0">
+      <w:start w:val="1"/>
+      <w:numFmt w:val="bullet"/>
+      <w:lvlText w:val=""/>
+      <w:lvlJc w:val="left"/>
+      <w:pPr>
+        <w:tabs>
+          <w:tab w:val="num" w:pos="720"/>
+        </w:tabs>
+        <w:ind w:left="720" w:hanging="360"/>
+      </w:pPr>
+      <w:rPr>
+        <w:rFonts w:ascii="Symbol" w:hAnsi="Symbol" w:hint="default"/>
+        <w:sz w:val="20"/>
+      </w:rPr>
+    </w:lvl>
+    <w:lvl w:ilvl="1" w:tentative="1">
+      <w:start w:val="1"/>
+      <w:numFmt w:val="bullet"/>
+      <w:lvlText w:val="o"/>
+      <w:lvlJc w:val="left"/>
+      <w:pPr>
+        <w:tabs>
+          <w:tab w:val="num" w:pos="1440"/>
+        </w:tabs>
+        <w:ind w:left="1440" w:hanging="360"/>
+      </w:pPr>
+      <w:rPr>
+        <w:rFonts w:ascii="Courier New" w:hAnsi="Courier New" w:hint="default"/>
+        <w:sz w:val="20"/>
+      </w:rPr>
+    </w:lvl>
+    <w:lvl w:ilvl="2" w:tentative="1">
+      <w:start w:val="1"/>
+      <w:numFmt w:val="bullet"/>
+      <w:lvlText w:val=""/>
+      <w:lvlJc w:val="left"/>
+      <w:pPr>
+        <w:tabs>
+          <w:tab w:val="num" w:pos="2160"/>
+        </w:tabs>
+        <w:ind w:left="2160" w:hanging="360"/>
+      </w:pPr>
+      <w:rPr>
+        <w:rFonts w:ascii="Wingdings" w:hAnsi="Wingdings" w:hint="default"/>
+        <w:sz w:val="20"/>
+      </w:rPr>
+    </w:lvl>
+    <w:lvl w:ilvl="3" w:tentative="1">
+      <w:start w:val="1"/>
+      <w:numFmt w:val="bullet"/>
+      <w:lvlText w:val=""/>
+      <w:lvlJc w:val="left"/>
+      <w:pPr>
+        <w:tabs>
+          <w:tab w:val="num" w:pos="2880"/>
+        </w:tabs>
+        <w:ind w:left="2880" w:hanging="360"/>
+      </w:pPr>
+      <w:rPr>
+        <w:rFonts w:ascii="Wingdings" w:hAnsi="Wingdings" w:hint="default"/>
+        <w:sz w:val="20"/>
+      </w:rPr>
+    </w:lvl>
+    <w:lvl w:ilvl="4" w:tentative="1">
+      <w:start w:val="1"/>
+      <w:numFmt w:val="bullet"/>
+      <w:lvlText w:val=""/>
+      <w:lvlJc w:val="left"/>
+      <w:pPr>
+        <w:tabs>
+          <w:tab w:val="num" w:pos="3600"/>
+        </w:tabs>
+        <w:ind w:left="3600" w:hanging="360"/>
+      </w:pPr>
+      <w:rPr>
+        <w:rFonts w:ascii="Wingdings" w:hAnsi="Wingdings" w:hint="default"/>
+        <w:sz w:val="20"/>
+      </w:rPr>
+    </w:lvl>
+    <w:lvl w:ilvl="5" w:tentative="1">
+      <w:start w:val="1"/>
+      <w:numFmt w:val="bullet"/>
+      <w:lvlText w:val=""/>
+      <w:lvlJc w:val="left"/>
+      <w:pPr>
+        <w:tabs>
+          <w:tab w:val="num" w:pos="4320"/>
+        </w:tabs>
+        <w:ind w:left="4320" w:hanging="360"/>
+      </w:pPr>
+      <w:rPr>
+        <w:rFonts w:ascii="Wingdings" w:hAnsi="Wingdings" w:hint="default"/>
+        <w:sz w:val="20"/>
+      </w:rPr>
+    </w:lvl>
+    <w:lvl w:ilvl="6" w:tentative="1">
+      <w:start w:val="1"/>
+      <w:numFmt w:val="bullet"/>
+      <w:lvlText w:val=""/>
+      <w:lvlJc w:val="left"/>
+      <w:pPr>
+        <w:tabs>
+          <w:tab w:val="num" w:pos="5040"/>
+        </w:tabs>
+        <w:ind w:left="5040" w:hanging="360"/>
+      </w:pPr>
+      <w:rPr>
+        <w:rFonts w:ascii="Wingdings" w:hAnsi="Wingdings" w:hint="default"/>
+        <w:sz w:val="20"/>
+      </w:rPr>
+    </w:lvl>
+    <w:lvl w:ilvl="7" w:tentative="1">
+      <w:start w:val="1"/>
+      <w:numFmt w:val="bullet"/>
+      <w:lvlText w:val=""/>
+      <w:lvlJc w:val="left"/>
+      <w:pPr>
+        <w:tabs>
+          <w:tab w:val="num" w:pos="5760"/>
+        </w:tabs>
+        <w:ind w:left="5760" w:hanging="360"/>
+      </w:pPr>
+      <w:rPr>
+        <w:rFonts w:ascii="Wingdings" w:hAnsi="Wingdings" w:hint="default"/>
+        <w:sz w:val="20"/>
+      </w:rPr>
+    </w:lvl>
+    <w:lvl w:ilvl="8" w:tentative="1">
+      <w:start w:val="1"/>
+      <w:numFmt w:val="bullet"/>
+      <w:lvlText w:val=""/>
+      <w:lvlJc w:val="left"/>
+      <w:pPr>
+        <w:tabs>
+          <w:tab w:val="num" w:pos="6480"/>
+        </w:tabs>
+        <w:ind w:left="6480" w:hanging="360"/>
+      </w:pPr>
+      <w:rPr>
+        <w:rFonts w:ascii="Wingdings" w:hAnsi="Wingdings" w:hint="default"/>
+        <w:sz w:val="20"/>
+      </w:rPr>
+    </w:lvl>
+  </w:abstractNum>
+  <w:abstractNum w:abstractNumId="7" w15:restartNumberingAfterBreak="0">
     <w:nsid w:val="2E466370"/>
     <w:multiLevelType w:val="hybridMultilevel"/>
     <w:tmpl w:val="0D12DF32"/>
@@ -10924,7 +11229,7 @@
       </w:pPr>
     </w:lvl>
   </w:abstractNum>
-  <w:abstractNum w:abstractNumId="6" w15:restartNumberingAfterBreak="0">
+  <w:abstractNum w:abstractNumId="8" w15:restartNumberingAfterBreak="0">
     <w:nsid w:val="34C524B6"/>
     <w:multiLevelType w:val="hybridMultilevel"/>
     <w:tmpl w:val="15E2C6E6"/>
@@ -11010,7 +11315,7 @@
       </w:pPr>
     </w:lvl>
   </w:abstractNum>
-  <w:abstractNum w:abstractNumId="7" w15:restartNumberingAfterBreak="0">
+  <w:abstractNum w:abstractNumId="9" w15:restartNumberingAfterBreak="0">
     <w:nsid w:val="3EC41BB0"/>
     <w:multiLevelType w:val="multilevel"/>
     <w:tmpl w:val="D0340B30"/>
@@ -11096,7 +11401,7 @@
       </w:pPr>
     </w:lvl>
   </w:abstractNum>
-  <w:abstractNum w:abstractNumId="8" w15:restartNumberingAfterBreak="0">
+  <w:abstractNum w:abstractNumId="10" w15:restartNumberingAfterBreak="0">
     <w:nsid w:val="48CD36E9"/>
     <w:multiLevelType w:val="multilevel"/>
     <w:tmpl w:val="A14A2C76"/>
@@ -11245,7 +11550,156 @@
       </w:rPr>
     </w:lvl>
   </w:abstractNum>
-  <w:abstractNum w:abstractNumId="9" w15:restartNumberingAfterBreak="0">
+  <w:abstractNum w:abstractNumId="11" w15:restartNumberingAfterBreak="0">
+    <w:nsid w:val="4A2A7FD0"/>
+    <w:multiLevelType w:val="multilevel"/>
+    <w:tmpl w:val="33860D8E"/>
+    <w:lvl w:ilvl="0">
+      <w:start w:val="1"/>
+      <w:numFmt w:val="bullet"/>
+      <w:lvlText w:val=""/>
+      <w:lvlJc w:val="left"/>
+      <w:pPr>
+        <w:tabs>
+          <w:tab w:val="num" w:pos="720"/>
+        </w:tabs>
+        <w:ind w:left="720" w:hanging="360"/>
+      </w:pPr>
+      <w:rPr>
+        <w:rFonts w:ascii="Symbol" w:hAnsi="Symbol" w:hint="default"/>
+        <w:sz w:val="20"/>
+      </w:rPr>
+    </w:lvl>
+    <w:lvl w:ilvl="1" w:tentative="1">
+      <w:start w:val="1"/>
+      <w:numFmt w:val="bullet"/>
+      <w:lvlText w:val="o"/>
+      <w:lvlJc w:val="left"/>
+      <w:pPr>
+        <w:tabs>
+          <w:tab w:val="num" w:pos="1440"/>
+        </w:tabs>
+        <w:ind w:left="1440" w:hanging="360"/>
+      </w:pPr>
+      <w:rPr>
+        <w:rFonts w:ascii="Courier New" w:hAnsi="Courier New" w:hint="default"/>
+        <w:sz w:val="20"/>
+      </w:rPr>
+    </w:lvl>
+    <w:lvl w:ilvl="2" w:tentative="1">
+      <w:start w:val="1"/>
+      <w:numFmt w:val="bullet"/>
+      <w:lvlText w:val=""/>
+      <w:lvlJc w:val="left"/>
+      <w:pPr>
+        <w:tabs>
+          <w:tab w:val="num" w:pos="2160"/>
+        </w:tabs>
+        <w:ind w:left="2160" w:hanging="360"/>
+      </w:pPr>
+      <w:rPr>
+        <w:rFonts w:ascii="Wingdings" w:hAnsi="Wingdings" w:hint="default"/>
+        <w:sz w:val="20"/>
+      </w:rPr>
+    </w:lvl>
+    <w:lvl w:ilvl="3" w:tentative="1">
+      <w:start w:val="1"/>
+      <w:numFmt w:val="bullet"/>
+      <w:lvlText w:val=""/>
+      <w:lvlJc w:val="left"/>
+      <w:pPr>
+        <w:tabs>
+          <w:tab w:val="num" w:pos="2880"/>
+        </w:tabs>
+        <w:ind w:left="2880" w:hanging="360"/>
+      </w:pPr>
+      <w:rPr>
+        <w:rFonts w:ascii="Wingdings" w:hAnsi="Wingdings" w:hint="default"/>
+        <w:sz w:val="20"/>
+      </w:rPr>
+    </w:lvl>
+    <w:lvl w:ilvl="4" w:tentative="1">
+      <w:start w:val="1"/>
+      <w:numFmt w:val="bullet"/>
+      <w:lvlText w:val=""/>
+      <w:lvlJc w:val="left"/>
+      <w:pPr>
+        <w:tabs>
+          <w:tab w:val="num" w:pos="3600"/>
+        </w:tabs>
+        <w:ind w:left="3600" w:hanging="360"/>
+      </w:pPr>
+      <w:rPr>
+        <w:rFonts w:ascii="Wingdings" w:hAnsi="Wingdings" w:hint="default"/>
+        <w:sz w:val="20"/>
+      </w:rPr>
+    </w:lvl>
+    <w:lvl w:ilvl="5" w:tentative="1">
+      <w:start w:val="1"/>
+      <w:numFmt w:val="bullet"/>
+      <w:lvlText w:val=""/>
+      <w:lvlJc w:val="left"/>
+      <w:pPr>
+        <w:tabs>
+          <w:tab w:val="num" w:pos="4320"/>
+        </w:tabs>
+        <w:ind w:left="4320" w:hanging="360"/>
+      </w:pPr>
+      <w:rPr>
+        <w:rFonts w:ascii="Wingdings" w:hAnsi="Wingdings" w:hint="default"/>
+        <w:sz w:val="20"/>
+      </w:rPr>
+    </w:lvl>
+    <w:lvl w:ilvl="6" w:tentative="1">
+      <w:start w:val="1"/>
+      <w:numFmt w:val="bullet"/>
+      <w:lvlText w:val=""/>
+      <w:lvlJc w:val="left"/>
+      <w:pPr>
+        <w:tabs>
+          <w:tab w:val="num" w:pos="5040"/>
+        </w:tabs>
+        <w:ind w:left="5040" w:hanging="360"/>
+      </w:pPr>
+      <w:rPr>
+        <w:rFonts w:ascii="Wingdings" w:hAnsi="Wingdings" w:hint="default"/>
+        <w:sz w:val="20"/>
+      </w:rPr>
+    </w:lvl>
+    <w:lvl w:ilvl="7" w:tentative="1">
+      <w:start w:val="1"/>
+      <w:numFmt w:val="bullet"/>
+      <w:lvlText w:val=""/>
+      <w:lvlJc w:val="left"/>
+      <w:pPr>
+        <w:tabs>
+          <w:tab w:val="num" w:pos="5760"/>
+        </w:tabs>
+        <w:ind w:left="5760" w:hanging="360"/>
+      </w:pPr>
+      <w:rPr>
+        <w:rFonts w:ascii="Wingdings" w:hAnsi="Wingdings" w:hint="default"/>
+        <w:sz w:val="20"/>
+      </w:rPr>
+    </w:lvl>
+    <w:lvl w:ilvl="8" w:tentative="1">
+      <w:start w:val="1"/>
+      <w:numFmt w:val="bullet"/>
+      <w:lvlText w:val=""/>
+      <w:lvlJc w:val="left"/>
+      <w:pPr>
+        <w:tabs>
+          <w:tab w:val="num" w:pos="6480"/>
+        </w:tabs>
+        <w:ind w:left="6480" w:hanging="360"/>
+      </w:pPr>
+      <w:rPr>
+        <w:rFonts w:ascii="Wingdings" w:hAnsi="Wingdings" w:hint="default"/>
+        <w:sz w:val="20"/>
+      </w:rPr>
+    </w:lvl>
+  </w:abstractNum>
+  <w:abstractNum w:abstractNumId="12" w15:restartNumberingAfterBreak="0">
     <w:nsid w:val="5199140E"/>
     <w:multiLevelType w:val="multilevel"/>
     <w:tmpl w:val="05A25426"/>
@@ -11394,7 +11848,7 @@
       </w:rPr>
     </w:lvl>
   </w:abstractNum>
-  <w:abstractNum w:abstractNumId="10" w15:restartNumberingAfterBreak="0">
+  <w:abstractNum w:abstractNumId="13" w15:restartNumberingAfterBreak="0">
     <w:nsid w:val="519D2A1F"/>
     <w:multiLevelType w:val="multilevel"/>
     <w:tmpl w:val="63BCC1B4"/>
@@ -11489,7 +11943,7 @@
       </w:pPr>
     </w:lvl>
   </w:abstractNum>
-  <w:abstractNum w:abstractNumId="11" w15:restartNumberingAfterBreak="0">
+  <w:abstractNum w:abstractNumId="14" w15:restartNumberingAfterBreak="0">
     <w:nsid w:val="5AB33E53"/>
     <w:multiLevelType w:val="multilevel"/>
     <w:tmpl w:val="137014CE"/>
@@ -11638,7 +12092,7 @@
       </w:rPr>
     </w:lvl>
   </w:abstractNum>
-  <w:abstractNum w:abstractNumId="12" w15:restartNumberingAfterBreak="0">
+  <w:abstractNum w:abstractNumId="15" w15:restartNumberingAfterBreak="0">
     <w:nsid w:val="65066CF2"/>
     <w:multiLevelType w:val="multilevel"/>
     <w:tmpl w:val="9168D858"/>
@@ -11759,7 +12213,7 @@
       </w:pPr>
     </w:lvl>
   </w:abstractNum>
-  <w:abstractNum w:abstractNumId="13" w15:restartNumberingAfterBreak="0">
+  <w:abstractNum w:abstractNumId="16" w15:restartNumberingAfterBreak="0">
     <w:nsid w:val="71495439"/>
     <w:multiLevelType w:val="hybridMultilevel"/>
     <w:tmpl w:val="B99290A2"/>
@@ -11845,7 +12299,7 @@
       </w:pPr>
     </w:lvl>
   </w:abstractNum>
-  <w:abstractNum w:abstractNumId="14" w15:restartNumberingAfterBreak="0">
+  <w:abstractNum w:abstractNumId="17" w15:restartNumberingAfterBreak="0">
     <w:nsid w:val="71615E3D"/>
     <w:multiLevelType w:val="multilevel"/>
     <w:tmpl w:val="42EE1DA0"/>
@@ -11941,7 +12395,7 @@
       </w:pPr>
     </w:lvl>
   </w:abstractNum>
-  <w:abstractNum w:abstractNumId="15" w15:restartNumberingAfterBreak="0">
+  <w:abstractNum w:abstractNumId="18" w15:restartNumberingAfterBreak="0">
     <w:nsid w:val="7AB676A7"/>
     <w:multiLevelType w:val="hybridMultilevel"/>
     <w:tmpl w:val="7E16AF2C"/>
@@ -12027,53 +12481,62 @@
       </w:pPr>
     </w:lvl>
   </w:abstractNum>
-  <w:num w:numId="1">
-    <w:abstractNumId w:val="6"/>
+  <w:num w:numId="1" w16cid:durableId="532110444">
+    <w:abstractNumId w:val="8"/>
   </w:num>
-  <w:num w:numId="2">
+  <w:num w:numId="2" w16cid:durableId="1485466447">
+    <w:abstractNumId w:val="7"/>
+  </w:num>
+  <w:num w:numId="3" w16cid:durableId="2132741960">
+    <w:abstractNumId w:val="4"/>
+  </w:num>
+  <w:num w:numId="4" w16cid:durableId="179054827">
+    <w:abstractNumId w:val="18"/>
+  </w:num>
+  <w:num w:numId="5" w16cid:durableId="281958998">
+    <w:abstractNumId w:val="16"/>
+  </w:num>
+  <w:num w:numId="6" w16cid:durableId="1591963830">
+    <w:abstractNumId w:val="12"/>
+  </w:num>
+  <w:num w:numId="7" w16cid:durableId="1000349763">
+    <w:abstractNumId w:val="15"/>
+  </w:num>
+  <w:num w:numId="8" w16cid:durableId="610939055">
+    <w:abstractNumId w:val="3"/>
+  </w:num>
+  <w:num w:numId="9" w16cid:durableId="1741176807">
+    <w:abstractNumId w:val="10"/>
+  </w:num>
+  <w:num w:numId="10" w16cid:durableId="1084915341">
+    <w:abstractNumId w:val="2"/>
+  </w:num>
+  <w:num w:numId="11" w16cid:durableId="986592385">
+    <w:abstractNumId w:val="9"/>
+  </w:num>
+  <w:num w:numId="12" w16cid:durableId="629437290">
+    <w:abstractNumId w:val="13"/>
+  </w:num>
+  <w:num w:numId="13" w16cid:durableId="347220453">
+    <w:abstractNumId w:val="14"/>
+  </w:num>
+  <w:num w:numId="14" w16cid:durableId="1779176058">
+    <w:abstractNumId w:val="0"/>
+  </w:num>
+  <w:num w:numId="15" w16cid:durableId="754476413">
+    <w:abstractNumId w:val="17"/>
+  </w:num>
+  <w:num w:numId="16" w16cid:durableId="1112894701">
     <w:abstractNumId w:val="5"/>
   </w:num>
-  <w:num w:numId="3">
-    <w:abstractNumId w:val="3"/>
-  </w:num>
-  <w:num w:numId="4">
-    <w:abstractNumId w:val="15"/>
-  </w:num>
-  <w:num w:numId="5">
-    <w:abstractNumId w:val="13"/>
-  </w:num>
-  <w:num w:numId="6">
-    <w:abstractNumId w:val="9"/>
-  </w:num>
-  <w:num w:numId="7">
-    <w:abstractNumId w:val="12"/>
-  </w:num>
-  <w:num w:numId="8">
-    <w:abstractNumId w:val="2"/>
-  </w:num>
-  <w:num w:numId="9">
-    <w:abstractNumId w:val="8"/>
-  </w:num>
-  <w:num w:numId="10">
+  <w:num w:numId="17" w16cid:durableId="710417987">
     <w:abstractNumId w:val="1"/>
   </w:num>
-  <w:num w:numId="11">
-    <w:abstractNumId w:val="7"/>
-  </w:num>
-  <w:num w:numId="12">
-    <w:abstractNumId w:val="10"/>
-  </w:num>
-  <w:num w:numId="13">
+  <w:num w:numId="18" w16cid:durableId="636034781">
     <w:abstractNumId w:val="11"/>
   </w:num>
-  <w:num w:numId="14">
-    <w:abstractNumId w:val="0"/>
-  </w:num>
-  <w:num w:numId="15">
-    <w:abstractNumId w:val="14"/>
-  </w:num>
-  <w:num w:numId="16">
-    <w:abstractNumId w:val="4"/>
+  <w:num w:numId="19" w16cid:durableId="1494444553">
+    <w:abstractNumId w:val="6"/>
   </w:num>
 </w:numbering>
 </file>
@@ -12198,6 +12661,7 @@
     <w:lsdException w:name="HTML Sample" w:semiHidden="1" w:unhideWhenUsed="1"/>
     <w:lsdException w:name="HTML Typewriter" w:semiHidden="1" w:unhideWhenUsed="1"/>
     <w:lsdException w:name="HTML Variable" w:semiHidden="1" w:unhideWhenUsed="1"/>
+    <w:lsdException w:name="Normal Table" w:semiHidden="1" w:unhideWhenUsed="1"/>
     <w:lsdException w:name="annotation subject" w:semiHidden="1" w:unhideWhenUsed="1"/>
     <w:lsdException w:name="No List" w:semiHidden="1" w:unhideWhenUsed="1"/>
     <w:lsdException w:name="Outline List 1" w:semiHidden="1" w:unhideWhenUsed="1"/>
@@ -12240,8 +12704,11 @@
     <w:lsdException w:name="Table Contemporary" w:semiHidden="1" w:unhideWhenUsed="1"/>
     <w:lsdException w:name="Table Elegant" w:semiHidden="1" w:unhideWhenUsed="1"/>
     <w:lsdException w:name="Table Professional" w:semiHidden="1" w:unhideWhenUsed="1"/>
+    <w:lsdException w:name="Table Subtle 1" w:semiHidden="1" w:unhideWhenUsed="1"/>
     <w:lsdException w:name="Table Subtle 2" w:semiHidden="1" w:unhideWhenUsed="1"/>
     <w:lsdException w:name="Table Web 1" w:semiHidden="1" w:unhideWhenUsed="1"/>
+    <w:lsdException w:name="Table Web 2" w:semiHidden="1" w:unhideWhenUsed="1"/>
+    <w:lsdException w:name="Table Web 3" w:semiHidden="1" w:unhideWhenUsed="1"/>
     <w:lsdException w:name="Balloon Text" w:semiHidden="1" w:unhideWhenUsed="1"/>
     <w:lsdException w:name="Table Grid" w:uiPriority="39"/>
     <w:lsdException w:name="Table Theme" w:semiHidden="1" w:unhideWhenUsed="1"/>

</xml_diff>

<commit_message>
Replaced the interrogatory number 5 with updates.
</commit_message>
<xml_diff>
--- a/docassemble/MAEvictionDefense/data/templates/SummaryProcessDiscovery.docx
+++ b/docassemble/MAEvictionDefense/data/templates/SummaryProcessDiscovery.docx
@@ -909,21 +909,40 @@
         <w:spacing w:after="144"/>
         <w:contextualSpacing/>
       </w:pPr>
-      <w:r>
-        <w:t xml:space="preserve">State </w:t>
-      </w:r>
-      <w:proofErr w:type="gramStart"/>
-      <w:r>
-        <w:t>each and every</w:t>
-      </w:r>
-      <w:proofErr w:type="gramEnd"/>
-      <w:r>
-        <w:t xml:space="preserve"> one of your reasons for evicting the tenant, whether or not stated in the complaint. If you claim the tenant, household member, or guest has violated a provision of the </w:t>
-      </w:r>
+      <w:proofErr w:type="gramStart"/>
+      <w:r>
+        <w:t>With regard to</w:t>
+      </w:r>
+      <w:proofErr w:type="gramEnd"/>
+      <w:r>
+        <w:t xml:space="preserve"> each separate incident or lease violation stated as your reason(s) for eviction in your Notice to Quit and/or Summons and Complaint, please describe each such violation (if there is more than one) in full and complete detail, including but not limited </w:t>
+      </w:r>
+      <w:r>
+        <w:t>to:</w:t>
+      </w:r>
+    </w:p>
+    <w:p>
+      <w:pPr>
+        <w:pStyle w:val="BodyText"/>
+        <w:numPr>
+          <w:ilvl w:val="1"/>
+          <w:numId w:val="8"/>
+        </w:numPr>
+        <w:spacing w:after="144"/>
+        <w:contextualSpacing/>
+      </w:pPr>
       <w:r>
         <w:lastRenderedPageBreak/>
-        <w:t>lease or rental agreement, please describe each such violation in full and complete detail, including, but not limited to:</w:t>
-      </w:r>
+        <w:t>The precise location(s) and date(s) of the alleged act(s</w:t>
+      </w:r>
+      <w:proofErr w:type="gramStart"/>
+      <w:r>
+        <w:t>)</w:t>
+      </w:r>
+      <w:r>
+        <w:t>;</w:t>
+      </w:r>
+      <w:proofErr w:type="gramEnd"/>
     </w:p>
     <w:p>
       <w:pPr>
@@ -936,7 +955,7 @@
         <w:contextualSpacing/>
       </w:pPr>
       <w:r>
-        <w:t xml:space="preserve">What </w:t>
+        <w:t xml:space="preserve">The facts describing what </w:t>
       </w:r>
       <w:proofErr w:type="gramStart"/>
       <w:r>
@@ -955,11 +974,11 @@
         <w:contextualSpacing/>
       </w:pPr>
       <w:r>
-        <w:t xml:space="preserve">The dates of each such alleged </w:t>
-      </w:r>
-      <w:proofErr w:type="gramStart"/>
-      <w:r>
-        <w:t>violation;</w:t>
+        <w:t xml:space="preserve">The source(s) and reporting date(s) of all information known or reported to </w:t>
+      </w:r>
+      <w:proofErr w:type="gramStart"/>
+      <w:r>
+        <w:t>you;</w:t>
       </w:r>
       <w:proofErr w:type="gramEnd"/>
     </w:p>
@@ -974,11 +993,11 @@
         <w:contextualSpacing/>
       </w:pPr>
       <w:r>
-        <w:t xml:space="preserve">When and how you learned of the alleged </w:t>
-      </w:r>
-      <w:proofErr w:type="gramStart"/>
-      <w:r>
-        <w:t>violation;</w:t>
+        <w:t xml:space="preserve">The name and address of the person(s) reporting such </w:t>
+      </w:r>
+      <w:proofErr w:type="gramStart"/>
+      <w:r>
+        <w:t>information;</w:t>
       </w:r>
       <w:proofErr w:type="gramEnd"/>
     </w:p>
@@ -993,11 +1012,11 @@
         <w:contextualSpacing/>
       </w:pPr>
       <w:r>
-        <w:t xml:space="preserve">The names and addresses of anyone with knowledge of or information about such alleged </w:t>
-      </w:r>
-      <w:proofErr w:type="gramStart"/>
-      <w:r>
-        <w:t>violation;</w:t>
+        <w:t xml:space="preserve">Whether the information was reported orally or in </w:t>
+      </w:r>
+      <w:proofErr w:type="gramStart"/>
+      <w:r>
+        <w:t>writing;</w:t>
       </w:r>
       <w:proofErr w:type="gramEnd"/>
     </w:p>
@@ -1012,7 +1031,7 @@
         <w:contextualSpacing/>
       </w:pPr>
       <w:r>
-        <w:t>The substance of the information known to each person; and</w:t>
+        <w:t>Whether any document was created concerning the alleged act; and</w:t>
       </w:r>
     </w:p>
     <w:p>
@@ -1025,8 +1044,13 @@
         <w:spacing w:after="144"/>
         <w:contextualSpacing/>
       </w:pPr>
-      <w:r>
-        <w:t>What if anything you did after becoming aware of each alleged violation, including the substance and date(s) of any written or oral communication to the tenant regarding such alleged violation and the tenant’s response(s) to such communication(s).</w:t>
+      <w:proofErr w:type="gramStart"/>
+      <w:r>
+        <w:t>Each and every</w:t>
+      </w:r>
+      <w:proofErr w:type="gramEnd"/>
+      <w:r>
+        <w:t xml:space="preserve"> action taken by you in response to the alleged act, including but not limited to investigation, communications (emails, texts, conversations, etc.), and any report to or communication exchange about the allegation/tenant with the police or other authorities.</w:t>
       </w:r>
     </w:p>
     <w:p>
@@ -1463,7 +1487,75 @@
         <w:contextualSpacing/>
       </w:pPr>
       <w:r>
+        <w:t xml:space="preserve">{%p if </w:t>
+      </w:r>
+      <w:proofErr w:type="spellStart"/>
+      <w:r>
+        <w:t>ints.get</w:t>
+      </w:r>
+      <w:proofErr w:type="spellEnd"/>
+      <w:r>
+        <w:t>('</w:t>
+      </w:r>
+      <w:r>
+        <w:t>rent_paid_after_</w:t>
+      </w:r>
+      <w:proofErr w:type="spellStart"/>
+      <w:r>
+        <w:t>ntq</w:t>
+      </w:r>
+      <w:proofErr w:type="spellEnd"/>
+      <w:proofErr w:type="gramStart"/>
+      <w:r>
+        <w:t>',</w:t>
+      </w:r>
+      <w:proofErr w:type="spellStart"/>
+      <w:r>
+        <w:t>DAEmpty</w:t>
+      </w:r>
+      <w:proofErr w:type="spellEnd"/>
+      <w:proofErr w:type="gramEnd"/>
+      <w:r>
+        <w:t>()).checked</w:t>
+      </w:r>
+      <w:r>
+        <w:t xml:space="preserve"> %}</w:t>
+      </w:r>
+    </w:p>
+    <w:p>
+      <w:pPr>
+        <w:pStyle w:val="BodyText"/>
+        <w:numPr>
+          <w:ilvl w:val="0"/>
+          <w:numId w:val="8"/>
+        </w:numPr>
+        <w:spacing w:after="144"/>
+        <w:contextualSpacing/>
+      </w:pPr>
+      <w:r>
         <w:lastRenderedPageBreak/>
+        <w:t>If the tenant has ever paid or offered to pay any rent owed after receiving the Notice to Quit, please describe the payment or offer, the date of the offer, and your response, if any.</w:t>
+      </w:r>
+    </w:p>
+    <w:p>
+      <w:pPr>
+        <w:pStyle w:val="BodyText"/>
+        <w:spacing w:after="144"/>
+        <w:ind w:left="360"/>
+        <w:contextualSpacing/>
+      </w:pPr>
+      <w:r>
+        <w:t>{%p endif %}</w:t>
+      </w:r>
+    </w:p>
+    <w:p>
+      <w:pPr>
+        <w:pStyle w:val="BodyText"/>
+        <w:spacing w:after="144"/>
+        <w:ind w:left="360"/>
+        <w:contextualSpacing/>
+      </w:pPr>
+      <w:r>
         <w:t xml:space="preserve">{%p if </w:t>
       </w:r>
       <w:proofErr w:type="spellStart"/>
@@ -1475,13 +1567,8 @@
         <w:t>('</w:t>
       </w:r>
       <w:r>
-        <w:t>rent_paid_after_</w:t>
-      </w:r>
-      <w:proofErr w:type="spellStart"/>
-      <w:r>
-        <w:t>ntq</w:t>
-      </w:r>
-      <w:proofErr w:type="spellEnd"/>
+        <w:t>third_party_payment</w:t>
+      </w:r>
       <w:proofErr w:type="gramStart"/>
       <w:r>
         <w:t>',</w:t>
@@ -1510,7 +1597,27 @@
         <w:contextualSpacing/>
       </w:pPr>
       <w:r>
-        <w:t>If the tenant has ever paid or offered to pay any rent owed after receiving the Notice to Quit, please describe the payment or offer, the date of the offer, and your response, if any.</w:t>
+        <w:t xml:space="preserve">Please describe in full and complete detail your communications with the tenant and/or any representative of a RAFT or other </w:t>
+      </w:r>
+      <w:r>
+        <w:t>rental assistance or subsidy program related to the tenant's application for assistance, including for each communication, the date and substance of each conversation/communication (whether verbal or written) and persons involved.</w:t>
+      </w:r>
+    </w:p>
+    <w:p>
+      <w:pPr>
+        <w:pStyle w:val="BodyText"/>
+        <w:numPr>
+          <w:ilvl w:val="0"/>
+          <w:numId w:val="8"/>
+        </w:numPr>
+        <w:spacing w:after="144"/>
+        <w:contextualSpacing/>
+      </w:pPr>
+      <w:r>
+        <w:t>I</w:t>
+      </w:r>
+      <w:r>
+        <w:t>f you have refused to accept rental assistance from RAFT or any other rental assistance/subsidy program (or intend to refuse such assistance if approved), please describe in full and complete detail the reasons for such refusal.</w:t>
       </w:r>
     </w:p>
     <w:p>
@@ -1543,7 +1650,7 @@
         <w:t>('</w:t>
       </w:r>
       <w:r>
-        <w:t>third_party_payment</w:t>
+        <w:t>rent_increase_request</w:t>
       </w:r>
       <w:proofErr w:type="gramStart"/>
       <w:r>
@@ -1573,25 +1680,461 @@
         <w:contextualSpacing/>
       </w:pPr>
       <w:r>
+        <w:t xml:space="preserve">If you have requested an increase to the rent </w:t>
+      </w:r>
+      <w:proofErr w:type="gramStart"/>
+      <w:r>
+        <w:t>during the course of</w:t>
+      </w:r>
+      <w:proofErr w:type="gramEnd"/>
+      <w:r>
+        <w:t xml:space="preserve"> the tenancy, please describe any such request in full and complete detail, including, but not limited to:</w:t>
+      </w:r>
+    </w:p>
+    <w:p>
+      <w:pPr>
+        <w:pStyle w:val="BodyText"/>
+        <w:numPr>
+          <w:ilvl w:val="1"/>
+          <w:numId w:val="8"/>
+        </w:numPr>
+        <w:spacing w:after="144"/>
+        <w:contextualSpacing/>
+      </w:pPr>
+      <w:r>
+        <w:t xml:space="preserve">To whom the request was </w:t>
+      </w:r>
+      <w:proofErr w:type="gramStart"/>
+      <w:r>
+        <w:t>made;</w:t>
+      </w:r>
+      <w:proofErr w:type="gramEnd"/>
+    </w:p>
+    <w:p>
+      <w:pPr>
+        <w:pStyle w:val="BodyText"/>
+        <w:numPr>
+          <w:ilvl w:val="1"/>
+          <w:numId w:val="8"/>
+        </w:numPr>
+        <w:spacing w:after="144"/>
+        <w:contextualSpacing/>
+      </w:pPr>
+      <w:r>
+        <w:t xml:space="preserve">The amount </w:t>
+      </w:r>
+      <w:proofErr w:type="gramStart"/>
+      <w:r>
+        <w:t>requested;</w:t>
+      </w:r>
+      <w:proofErr w:type="gramEnd"/>
+    </w:p>
+    <w:p>
+      <w:pPr>
+        <w:pStyle w:val="BodyText"/>
+        <w:numPr>
+          <w:ilvl w:val="1"/>
+          <w:numId w:val="8"/>
+        </w:numPr>
+        <w:spacing w:after="144"/>
+        <w:contextualSpacing/>
+      </w:pPr>
+      <w:r>
+        <w:t xml:space="preserve">The basis for such </w:t>
+      </w:r>
+      <w:proofErr w:type="gramStart"/>
+      <w:r>
+        <w:t>request;</w:t>
+      </w:r>
+      <w:proofErr w:type="gramEnd"/>
+    </w:p>
+    <w:p>
+      <w:pPr>
+        <w:pStyle w:val="BodyText"/>
+        <w:numPr>
+          <w:ilvl w:val="1"/>
+          <w:numId w:val="8"/>
+        </w:numPr>
+        <w:spacing w:after="144"/>
+        <w:contextualSpacing/>
+      </w:pPr>
+      <w:r>
+        <w:t xml:space="preserve">The date and manner of the </w:t>
+      </w:r>
+      <w:proofErr w:type="gramStart"/>
+      <w:r>
+        <w:t>request;</w:t>
+      </w:r>
+      <w:proofErr w:type="gramEnd"/>
+    </w:p>
+    <w:p>
+      <w:pPr>
+        <w:pStyle w:val="BodyText"/>
+        <w:numPr>
+          <w:ilvl w:val="1"/>
+          <w:numId w:val="8"/>
+        </w:numPr>
+        <w:spacing w:after="144"/>
+        <w:contextualSpacing/>
+      </w:pPr>
+      <w:r>
+        <w:t>The tenant’s response, if any.</w:t>
+      </w:r>
+    </w:p>
+    <w:p>
+      <w:pPr>
+        <w:pStyle w:val="BodyText"/>
+        <w:spacing w:after="144"/>
+        <w:ind w:left="360"/>
+        <w:contextualSpacing/>
+      </w:pPr>
+      <w:r>
+        <w:t>{%p endif %}</w:t>
+      </w:r>
+    </w:p>
+    <w:p>
+      <w:pPr>
+        <w:pStyle w:val="BodyText"/>
+        <w:spacing w:after="144"/>
+        <w:ind w:left="360"/>
+        <w:contextualSpacing/>
+      </w:pPr>
+      <w:r>
+        <w:t>{# COVID-19 specific interrogatories #}</w:t>
+      </w:r>
+    </w:p>
+    <w:p>
+      <w:pPr>
+        <w:pStyle w:val="BodyText"/>
+        <w:spacing w:after="144"/>
+        <w:ind w:left="360"/>
+        <w:contextualSpacing/>
+      </w:pPr>
+      <w:r>
+        <w:t xml:space="preserve">{%p if </w:t>
+      </w:r>
+      <w:proofErr w:type="spellStart"/>
+      <w:r>
+        <w:t>ints.get</w:t>
+      </w:r>
+      <w:proofErr w:type="spellEnd"/>
+      <w:r>
+        <w:t>('health_and_safety</w:t>
+      </w:r>
+      <w:proofErr w:type="gramStart"/>
+      <w:r>
+        <w:t>',</w:t>
+      </w:r>
+      <w:proofErr w:type="spellStart"/>
+      <w:r>
+        <w:t>DAEmpty</w:t>
+      </w:r>
+      <w:proofErr w:type="spellEnd"/>
+      <w:proofErr w:type="gramEnd"/>
+      <w:r>
+        <w:t>()).checked %}</w:t>
+      </w:r>
+    </w:p>
+    <w:p>
+      <w:pPr>
+        <w:pStyle w:val="BodyText"/>
+        <w:numPr>
+          <w:ilvl w:val="0"/>
+          <w:numId w:val="8"/>
+        </w:numPr>
+        <w:spacing w:after="144"/>
+        <w:contextualSpacing/>
+      </w:pPr>
+      <w:r>
+        <w:t xml:space="preserve">Please describe the basis for your claim that the allegations asserted in the Notice to Quit impact the health or safety of other residents, health care workers, emergency personnel, persons lawfully on the subject property, or the </w:t>
+      </w:r>
+      <w:proofErr w:type="gramStart"/>
+      <w:r>
+        <w:t>general public</w:t>
+      </w:r>
+      <w:proofErr w:type="gramEnd"/>
+      <w:r>
+        <w:t>, including but not limited to:</w:t>
+      </w:r>
+    </w:p>
+    <w:p>
+      <w:pPr>
+        <w:pStyle w:val="BodyText"/>
+        <w:numPr>
+          <w:ilvl w:val="1"/>
+          <w:numId w:val="8"/>
+        </w:numPr>
+        <w:spacing w:after="144"/>
+        <w:contextualSpacing/>
+      </w:pPr>
+      <w:r>
+        <w:t xml:space="preserve">The individual(s) whose health or safety is impacted by these </w:t>
+      </w:r>
+      <w:proofErr w:type="gramStart"/>
+      <w:r>
+        <w:t>allegations;</w:t>
+      </w:r>
+      <w:proofErr w:type="gramEnd"/>
+    </w:p>
+    <w:p>
+      <w:pPr>
+        <w:pStyle w:val="BodyText"/>
+        <w:numPr>
+          <w:ilvl w:val="1"/>
+          <w:numId w:val="8"/>
+        </w:numPr>
+        <w:spacing w:after="144"/>
+        <w:contextualSpacing/>
+      </w:pPr>
+      <w:r>
+        <w:t xml:space="preserve">Whether you claim that these allegations impact either the health or safety of these </w:t>
+      </w:r>
+      <w:proofErr w:type="gramStart"/>
+      <w:r>
+        <w:t>individuals;</w:t>
+      </w:r>
+      <w:proofErr w:type="gramEnd"/>
+      <w:r>
+        <w:t xml:space="preserve"> </w:t>
+      </w:r>
+    </w:p>
+    <w:p>
+      <w:pPr>
+        <w:pStyle w:val="BodyText"/>
+        <w:numPr>
+          <w:ilvl w:val="1"/>
+          <w:numId w:val="8"/>
+        </w:numPr>
+        <w:spacing w:after="144"/>
+        <w:contextualSpacing/>
+      </w:pPr>
+      <w:r>
+        <w:t xml:space="preserve">How, specifically, these individuals’ health or safety has been </w:t>
+      </w:r>
+      <w:proofErr w:type="gramStart"/>
+      <w:r>
+        <w:t>impacted;</w:t>
+      </w:r>
+      <w:proofErr w:type="gramEnd"/>
+      <w:r>
+        <w:t xml:space="preserve"> </w:t>
+      </w:r>
+    </w:p>
+    <w:p>
+      <w:pPr>
+        <w:pStyle w:val="BodyText"/>
+        <w:numPr>
+          <w:ilvl w:val="1"/>
+          <w:numId w:val="8"/>
+        </w:numPr>
+        <w:spacing w:after="144"/>
+        <w:contextualSpacing/>
+      </w:pPr>
+      <w:proofErr w:type="gramStart"/>
+      <w:r>
+        <w:t>Any and all</w:t>
+      </w:r>
+      <w:proofErr w:type="gramEnd"/>
+      <w:r>
+        <w:t xml:space="preserve"> specific instances in which individuals’ health or safety has been impacted by the allegations; and </w:t>
+      </w:r>
+    </w:p>
+    <w:p>
+      <w:pPr>
+        <w:pStyle w:val="BodyText"/>
+        <w:numPr>
+          <w:ilvl w:val="1"/>
+          <w:numId w:val="8"/>
+        </w:numPr>
+        <w:spacing w:after="144"/>
+        <w:contextualSpacing/>
+      </w:pPr>
+      <w:r>
+        <w:t xml:space="preserve">The basis for your assertion that </w:t>
+      </w:r>
+      <w:proofErr w:type="gramStart"/>
+      <w:r>
+        <w:t>these individual(s) health or safety</w:t>
+      </w:r>
+      <w:proofErr w:type="gramEnd"/>
+      <w:r>
+        <w:t xml:space="preserve"> is impacted.</w:t>
+      </w:r>
+    </w:p>
+    <w:p>
+      <w:pPr>
+        <w:pStyle w:val="BodyText"/>
+        <w:spacing w:after="144"/>
+        <w:ind w:left="360"/>
+        <w:contextualSpacing/>
+      </w:pPr>
+      <w:r>
+        <w:t>{%p endif %}</w:t>
+      </w:r>
+    </w:p>
+    <w:p>
+      <w:pPr>
+        <w:pStyle w:val="BodyText"/>
+        <w:spacing w:after="144"/>
+        <w:ind w:left="360"/>
+        <w:contextualSpacing/>
+      </w:pPr>
+      <w:r>
+        <w:t xml:space="preserve">{%p if </w:t>
+      </w:r>
+      <w:proofErr w:type="spellStart"/>
+      <w:r>
+        <w:t>ints.get</w:t>
+      </w:r>
+      <w:proofErr w:type="spellEnd"/>
+      <w:r>
+        <w:t>('complaints</w:t>
+      </w:r>
+      <w:proofErr w:type="gramStart"/>
+      <w:r>
+        <w:t>',</w:t>
+      </w:r>
+      <w:proofErr w:type="spellStart"/>
+      <w:r>
+        <w:t>DAEmpty</w:t>
+      </w:r>
+      <w:proofErr w:type="spellEnd"/>
+      <w:proofErr w:type="gramEnd"/>
+      <w:r>
+        <w:t>()).checked %}</w:t>
+      </w:r>
+    </w:p>
+    <w:p>
+      <w:pPr>
+        <w:pStyle w:val="BodyText"/>
+        <w:numPr>
+          <w:ilvl w:val="0"/>
+          <w:numId w:val="8"/>
+        </w:numPr>
+        <w:spacing w:after="144"/>
+        <w:contextualSpacing/>
+      </w:pPr>
+      <w:r>
+        <w:t xml:space="preserve">Please identify </w:t>
+      </w:r>
+      <w:proofErr w:type="gramStart"/>
+      <w:r>
+        <w:t>each and every</w:t>
+      </w:r>
+      <w:proofErr w:type="gramEnd"/>
+      <w:r>
+        <w:t xml:space="preserve"> complaint the landlord has received from other residents at the building regarding the tenant and/or conduct related to the tenant’s unit. For each complaint, please state:</w:t>
+      </w:r>
+    </w:p>
+    <w:p>
+      <w:pPr>
+        <w:pStyle w:val="BodyText"/>
+        <w:numPr>
+          <w:ilvl w:val="1"/>
+          <w:numId w:val="8"/>
+        </w:numPr>
+        <w:spacing w:after="144"/>
+        <w:contextualSpacing/>
+      </w:pPr>
+      <w:r>
+        <w:t xml:space="preserve">The name and contact information of the individual who made the </w:t>
+      </w:r>
+      <w:proofErr w:type="gramStart"/>
+      <w:r>
+        <w:t>complaint;</w:t>
+      </w:r>
+      <w:proofErr w:type="gramEnd"/>
+    </w:p>
+    <w:p>
+      <w:pPr>
+        <w:pStyle w:val="BodyText"/>
+        <w:numPr>
+          <w:ilvl w:val="1"/>
+          <w:numId w:val="8"/>
+        </w:numPr>
+        <w:spacing w:after="144"/>
+        <w:contextualSpacing/>
+      </w:pPr>
+      <w:r>
+        <w:t xml:space="preserve">The date of the </w:t>
+      </w:r>
+      <w:proofErr w:type="gramStart"/>
+      <w:r>
+        <w:t>complaint;</w:t>
+      </w:r>
+      <w:proofErr w:type="gramEnd"/>
+      <w:r>
+        <w:t xml:space="preserve"> </w:t>
+      </w:r>
+    </w:p>
+    <w:p>
+      <w:pPr>
+        <w:pStyle w:val="BodyText"/>
+        <w:numPr>
+          <w:ilvl w:val="1"/>
+          <w:numId w:val="8"/>
+        </w:numPr>
+        <w:spacing w:after="144"/>
+        <w:contextualSpacing/>
+      </w:pPr>
+      <w:r>
+        <w:t xml:space="preserve">The substance of the </w:t>
+      </w:r>
+      <w:proofErr w:type="gramStart"/>
+      <w:r>
+        <w:t>complaint;</w:t>
+      </w:r>
+      <w:proofErr w:type="gramEnd"/>
+    </w:p>
+    <w:p>
+      <w:pPr>
+        <w:pStyle w:val="BodyText"/>
+        <w:numPr>
+          <w:ilvl w:val="1"/>
+          <w:numId w:val="8"/>
+        </w:numPr>
+        <w:spacing w:after="144"/>
+        <w:contextualSpacing/>
+      </w:pPr>
+      <w:r>
+        <w:t xml:space="preserve">The individual(s) to whom the complaint was </w:t>
+      </w:r>
+      <w:proofErr w:type="gramStart"/>
+      <w:r>
+        <w:t>made;</w:t>
+      </w:r>
+      <w:proofErr w:type="gramEnd"/>
+      <w:r>
+        <w:t xml:space="preserve"> </w:t>
+      </w:r>
+    </w:p>
+    <w:p>
+      <w:pPr>
+        <w:pStyle w:val="BodyText"/>
+        <w:numPr>
+          <w:ilvl w:val="1"/>
+          <w:numId w:val="8"/>
+        </w:numPr>
+        <w:spacing w:after="144"/>
+        <w:contextualSpacing/>
+      </w:pPr>
+      <w:r>
         <w:lastRenderedPageBreak/>
-        <w:t>Please describe in full and complete detail your communications with the tenant and/or any representative of a RAFT or other rental assistance or subsidy program related to the tenant's application for assistance, including for each communication, the date and substance of each conversation/communication (whether verbal or written) and persons involved.</w:t>
-      </w:r>
-    </w:p>
-    <w:p>
-      <w:pPr>
-        <w:pStyle w:val="BodyText"/>
-        <w:numPr>
-          <w:ilvl w:val="0"/>
-          <w:numId w:val="8"/>
-        </w:numPr>
-        <w:spacing w:after="144"/>
-        <w:contextualSpacing/>
-      </w:pPr>
-      <w:r>
-        <w:t>I</w:t>
-      </w:r>
-      <w:r>
-        <w:t>f you have refused to accept rental assistance from RAFT or any other rental assistance/subsidy program (or intend to refuse such assistance if approved), please describe in full and complete detail the reasons for such refusal.</w:t>
+        <w:t>The form of the complaint, whether by phone, email, text, letter, etc.; and</w:t>
+      </w:r>
+    </w:p>
+    <w:p>
+      <w:pPr>
+        <w:pStyle w:val="BodyText"/>
+        <w:numPr>
+          <w:ilvl w:val="1"/>
+          <w:numId w:val="8"/>
+        </w:numPr>
+        <w:spacing w:after="144"/>
+        <w:contextualSpacing/>
+      </w:pPr>
+      <w:r>
+        <w:t>What the landlord’s response to the complaint was, if any.</w:t>
       </w:r>
     </w:p>
     <w:p>
@@ -1613,523 +2156,6 @@
         <w:contextualSpacing/>
       </w:pPr>
       <w:r>
-        <w:t xml:space="preserve">{%p if </w:t>
-      </w:r>
-      <w:proofErr w:type="spellStart"/>
-      <w:r>
-        <w:t>ints.get</w:t>
-      </w:r>
-      <w:proofErr w:type="spellEnd"/>
-      <w:r>
-        <w:t>('</w:t>
-      </w:r>
-      <w:r>
-        <w:t>rent_increase_request</w:t>
-      </w:r>
-      <w:proofErr w:type="gramStart"/>
-      <w:r>
-        <w:t>',</w:t>
-      </w:r>
-      <w:proofErr w:type="spellStart"/>
-      <w:r>
-        <w:t>DAEmpty</w:t>
-      </w:r>
-      <w:proofErr w:type="spellEnd"/>
-      <w:proofErr w:type="gramEnd"/>
-      <w:r>
-        <w:t>()).checked</w:t>
-      </w:r>
-      <w:r>
-        <w:t xml:space="preserve"> %}</w:t>
-      </w:r>
-    </w:p>
-    <w:p>
-      <w:pPr>
-        <w:pStyle w:val="BodyText"/>
-        <w:numPr>
-          <w:ilvl w:val="0"/>
-          <w:numId w:val="8"/>
-        </w:numPr>
-        <w:spacing w:after="144"/>
-        <w:contextualSpacing/>
-      </w:pPr>
-      <w:r>
-        <w:t xml:space="preserve">If you have requested an increase to the rent </w:t>
-      </w:r>
-      <w:proofErr w:type="gramStart"/>
-      <w:r>
-        <w:t>during the course of</w:t>
-      </w:r>
-      <w:proofErr w:type="gramEnd"/>
-      <w:r>
-        <w:t xml:space="preserve"> the tenancy, please describe any such request in full and complete detail, including, but not limited to:</w:t>
-      </w:r>
-    </w:p>
-    <w:p>
-      <w:pPr>
-        <w:pStyle w:val="BodyText"/>
-        <w:numPr>
-          <w:ilvl w:val="1"/>
-          <w:numId w:val="8"/>
-        </w:numPr>
-        <w:spacing w:after="144"/>
-        <w:contextualSpacing/>
-      </w:pPr>
-      <w:r>
-        <w:t xml:space="preserve">To whom the request was </w:t>
-      </w:r>
-      <w:proofErr w:type="gramStart"/>
-      <w:r>
-        <w:t>made;</w:t>
-      </w:r>
-      <w:proofErr w:type="gramEnd"/>
-    </w:p>
-    <w:p>
-      <w:pPr>
-        <w:pStyle w:val="BodyText"/>
-        <w:numPr>
-          <w:ilvl w:val="1"/>
-          <w:numId w:val="8"/>
-        </w:numPr>
-        <w:spacing w:after="144"/>
-        <w:contextualSpacing/>
-      </w:pPr>
-      <w:r>
-        <w:t xml:space="preserve">The amount </w:t>
-      </w:r>
-      <w:proofErr w:type="gramStart"/>
-      <w:r>
-        <w:t>requested;</w:t>
-      </w:r>
-      <w:proofErr w:type="gramEnd"/>
-    </w:p>
-    <w:p>
-      <w:pPr>
-        <w:pStyle w:val="BodyText"/>
-        <w:numPr>
-          <w:ilvl w:val="1"/>
-          <w:numId w:val="8"/>
-        </w:numPr>
-        <w:spacing w:after="144"/>
-        <w:contextualSpacing/>
-      </w:pPr>
-      <w:r>
-        <w:t xml:space="preserve">The basis for such </w:t>
-      </w:r>
-      <w:proofErr w:type="gramStart"/>
-      <w:r>
-        <w:t>request;</w:t>
-      </w:r>
-      <w:proofErr w:type="gramEnd"/>
-    </w:p>
-    <w:p>
-      <w:pPr>
-        <w:pStyle w:val="BodyText"/>
-        <w:numPr>
-          <w:ilvl w:val="1"/>
-          <w:numId w:val="8"/>
-        </w:numPr>
-        <w:spacing w:after="144"/>
-        <w:contextualSpacing/>
-      </w:pPr>
-      <w:r>
-        <w:t xml:space="preserve">The date and manner of the </w:t>
-      </w:r>
-      <w:proofErr w:type="gramStart"/>
-      <w:r>
-        <w:t>request;</w:t>
-      </w:r>
-      <w:proofErr w:type="gramEnd"/>
-    </w:p>
-    <w:p>
-      <w:pPr>
-        <w:pStyle w:val="BodyText"/>
-        <w:numPr>
-          <w:ilvl w:val="1"/>
-          <w:numId w:val="8"/>
-        </w:numPr>
-        <w:spacing w:after="144"/>
-        <w:contextualSpacing/>
-      </w:pPr>
-      <w:r>
-        <w:t>The tenant’s response, if any.</w:t>
-      </w:r>
-    </w:p>
-    <w:p>
-      <w:pPr>
-        <w:pStyle w:val="BodyText"/>
-        <w:spacing w:after="144"/>
-        <w:ind w:left="360"/>
-        <w:contextualSpacing/>
-      </w:pPr>
-      <w:r>
-        <w:t>{%p endif %}</w:t>
-      </w:r>
-    </w:p>
-    <w:p>
-      <w:pPr>
-        <w:pStyle w:val="BodyText"/>
-        <w:spacing w:after="144"/>
-        <w:ind w:left="360"/>
-        <w:contextualSpacing/>
-      </w:pPr>
-      <w:r>
-        <w:t>{# COVID-19 specific interrogatories #}</w:t>
-      </w:r>
-    </w:p>
-    <w:p>
-      <w:pPr>
-        <w:pStyle w:val="BodyText"/>
-        <w:spacing w:after="144"/>
-        <w:ind w:left="360"/>
-        <w:contextualSpacing/>
-      </w:pPr>
-      <w:r>
-        <w:t xml:space="preserve">{%p if </w:t>
-      </w:r>
-      <w:proofErr w:type="spellStart"/>
-      <w:r>
-        <w:t>ints.get</w:t>
-      </w:r>
-      <w:proofErr w:type="spellEnd"/>
-      <w:r>
-        <w:t>('health_and_safety</w:t>
-      </w:r>
-      <w:proofErr w:type="gramStart"/>
-      <w:r>
-        <w:t>',</w:t>
-      </w:r>
-      <w:proofErr w:type="spellStart"/>
-      <w:r>
-        <w:t>DAEmpty</w:t>
-      </w:r>
-      <w:proofErr w:type="spellEnd"/>
-      <w:proofErr w:type="gramEnd"/>
-      <w:r>
-        <w:t>()).checked %}</w:t>
-      </w:r>
-    </w:p>
-    <w:p>
-      <w:pPr>
-        <w:pStyle w:val="BodyText"/>
-        <w:numPr>
-          <w:ilvl w:val="0"/>
-          <w:numId w:val="8"/>
-        </w:numPr>
-        <w:spacing w:after="144"/>
-        <w:contextualSpacing/>
-      </w:pPr>
-      <w:r>
-        <w:t xml:space="preserve">Please describe the basis for your claim that the allegations asserted in the Notice to Quit impact the health or safety of other residents, health care workers, emergency personnel, persons lawfully on the subject property, or the </w:t>
-      </w:r>
-      <w:proofErr w:type="gramStart"/>
-      <w:r>
-        <w:t>general public</w:t>
-      </w:r>
-      <w:proofErr w:type="gramEnd"/>
-      <w:r>
-        <w:t>, including but not limited to:</w:t>
-      </w:r>
-    </w:p>
-    <w:p>
-      <w:pPr>
-        <w:pStyle w:val="BodyText"/>
-        <w:numPr>
-          <w:ilvl w:val="1"/>
-          <w:numId w:val="8"/>
-        </w:numPr>
-        <w:spacing w:after="144"/>
-        <w:contextualSpacing/>
-      </w:pPr>
-      <w:r>
-        <w:t xml:space="preserve">The individual(s) whose health or safety is impacted by these </w:t>
-      </w:r>
-      <w:proofErr w:type="gramStart"/>
-      <w:r>
-        <w:t>allegations;</w:t>
-      </w:r>
-      <w:proofErr w:type="gramEnd"/>
-    </w:p>
-    <w:p>
-      <w:pPr>
-        <w:pStyle w:val="BodyText"/>
-        <w:numPr>
-          <w:ilvl w:val="1"/>
-          <w:numId w:val="8"/>
-        </w:numPr>
-        <w:spacing w:after="144"/>
-        <w:contextualSpacing/>
-      </w:pPr>
-      <w:r>
-        <w:t xml:space="preserve">Whether you claim that these allegations impact either the health or safety of these </w:t>
-      </w:r>
-      <w:proofErr w:type="gramStart"/>
-      <w:r>
-        <w:t>individuals;</w:t>
-      </w:r>
-      <w:proofErr w:type="gramEnd"/>
-      <w:r>
-        <w:t xml:space="preserve"> </w:t>
-      </w:r>
-    </w:p>
-    <w:p>
-      <w:pPr>
-        <w:pStyle w:val="BodyText"/>
-        <w:numPr>
-          <w:ilvl w:val="1"/>
-          <w:numId w:val="8"/>
-        </w:numPr>
-        <w:spacing w:after="144"/>
-        <w:contextualSpacing/>
-      </w:pPr>
-      <w:r>
-        <w:t xml:space="preserve">How, specifically, these individuals’ health or safety has been </w:t>
-      </w:r>
-      <w:proofErr w:type="gramStart"/>
-      <w:r>
-        <w:t>impacted;</w:t>
-      </w:r>
-      <w:proofErr w:type="gramEnd"/>
-      <w:r>
-        <w:t xml:space="preserve"> </w:t>
-      </w:r>
-    </w:p>
-    <w:p>
-      <w:pPr>
-        <w:pStyle w:val="BodyText"/>
-        <w:numPr>
-          <w:ilvl w:val="1"/>
-          <w:numId w:val="8"/>
-        </w:numPr>
-        <w:spacing w:after="144"/>
-        <w:contextualSpacing/>
-      </w:pPr>
-      <w:proofErr w:type="gramStart"/>
-      <w:r>
-        <w:t>Any and all</w:t>
-      </w:r>
-      <w:proofErr w:type="gramEnd"/>
-      <w:r>
-        <w:t xml:space="preserve"> specific instances in which individuals’ health or safety has been impacted by the allegations; and </w:t>
-      </w:r>
-    </w:p>
-    <w:p>
-      <w:pPr>
-        <w:pStyle w:val="BodyText"/>
-        <w:numPr>
-          <w:ilvl w:val="1"/>
-          <w:numId w:val="8"/>
-        </w:numPr>
-        <w:spacing w:after="144"/>
-        <w:contextualSpacing/>
-      </w:pPr>
-      <w:r>
-        <w:t xml:space="preserve">The basis for your assertion that </w:t>
-      </w:r>
-      <w:proofErr w:type="gramStart"/>
-      <w:r>
-        <w:t>these individual(s) health or safety</w:t>
-      </w:r>
-      <w:proofErr w:type="gramEnd"/>
-      <w:r>
-        <w:t xml:space="preserve"> is impacted.</w:t>
-      </w:r>
-    </w:p>
-    <w:p>
-      <w:pPr>
-        <w:pStyle w:val="BodyText"/>
-        <w:spacing w:after="144"/>
-        <w:ind w:left="360"/>
-        <w:contextualSpacing/>
-      </w:pPr>
-      <w:r>
-        <w:t>{%p endif %}</w:t>
-      </w:r>
-    </w:p>
-    <w:p>
-      <w:pPr>
-        <w:pStyle w:val="BodyText"/>
-        <w:spacing w:after="144"/>
-        <w:ind w:left="360"/>
-        <w:contextualSpacing/>
-      </w:pPr>
-      <w:r>
-        <w:t xml:space="preserve">{%p if </w:t>
-      </w:r>
-      <w:proofErr w:type="spellStart"/>
-      <w:r>
-        <w:t>ints.get</w:t>
-      </w:r>
-      <w:proofErr w:type="spellEnd"/>
-      <w:r>
-        <w:t>('complaints</w:t>
-      </w:r>
-      <w:proofErr w:type="gramStart"/>
-      <w:r>
-        <w:t>',</w:t>
-      </w:r>
-      <w:proofErr w:type="spellStart"/>
-      <w:r>
-        <w:t>DAEmpty</w:t>
-      </w:r>
-      <w:proofErr w:type="spellEnd"/>
-      <w:proofErr w:type="gramEnd"/>
-      <w:r>
-        <w:t>()).checked %}</w:t>
-      </w:r>
-    </w:p>
-    <w:p>
-      <w:pPr>
-        <w:pStyle w:val="BodyText"/>
-        <w:numPr>
-          <w:ilvl w:val="0"/>
-          <w:numId w:val="8"/>
-        </w:numPr>
-        <w:spacing w:after="144"/>
-        <w:contextualSpacing/>
-      </w:pPr>
-      <w:r>
-        <w:t xml:space="preserve">Please identify </w:t>
-      </w:r>
-      <w:proofErr w:type="gramStart"/>
-      <w:r>
-        <w:t>each and every</w:t>
-      </w:r>
-      <w:proofErr w:type="gramEnd"/>
-      <w:r>
-        <w:t xml:space="preserve"> complaint the landlord has received from other residents at the building regarding the tenant and/or conduct related to the tenant’s unit. For each complaint, please state:</w:t>
-      </w:r>
-    </w:p>
-    <w:p>
-      <w:pPr>
-        <w:pStyle w:val="BodyText"/>
-        <w:numPr>
-          <w:ilvl w:val="1"/>
-          <w:numId w:val="8"/>
-        </w:numPr>
-        <w:spacing w:after="144"/>
-        <w:contextualSpacing/>
-      </w:pPr>
-      <w:r>
-        <w:t xml:space="preserve">The name and contact information of the individual who made the </w:t>
-      </w:r>
-      <w:proofErr w:type="gramStart"/>
-      <w:r>
-        <w:t>complaint;</w:t>
-      </w:r>
-      <w:proofErr w:type="gramEnd"/>
-    </w:p>
-    <w:p>
-      <w:pPr>
-        <w:pStyle w:val="BodyText"/>
-        <w:numPr>
-          <w:ilvl w:val="1"/>
-          <w:numId w:val="8"/>
-        </w:numPr>
-        <w:spacing w:after="144"/>
-        <w:contextualSpacing/>
-      </w:pPr>
-      <w:r>
-        <w:t xml:space="preserve">The date of the </w:t>
-      </w:r>
-      <w:proofErr w:type="gramStart"/>
-      <w:r>
-        <w:t>complaint;</w:t>
-      </w:r>
-      <w:proofErr w:type="gramEnd"/>
-      <w:r>
-        <w:t xml:space="preserve"> </w:t>
-      </w:r>
-    </w:p>
-    <w:p>
-      <w:pPr>
-        <w:pStyle w:val="BodyText"/>
-        <w:numPr>
-          <w:ilvl w:val="1"/>
-          <w:numId w:val="8"/>
-        </w:numPr>
-        <w:spacing w:after="144"/>
-        <w:contextualSpacing/>
-      </w:pPr>
-      <w:r>
-        <w:t xml:space="preserve">The substance of the </w:t>
-      </w:r>
-      <w:proofErr w:type="gramStart"/>
-      <w:r>
-        <w:t>complaint;</w:t>
-      </w:r>
-      <w:proofErr w:type="gramEnd"/>
-    </w:p>
-    <w:p>
-      <w:pPr>
-        <w:pStyle w:val="BodyText"/>
-        <w:numPr>
-          <w:ilvl w:val="1"/>
-          <w:numId w:val="8"/>
-        </w:numPr>
-        <w:spacing w:after="144"/>
-        <w:contextualSpacing/>
-      </w:pPr>
-      <w:r>
-        <w:t xml:space="preserve">The individual(s) to whom the complaint was </w:t>
-      </w:r>
-      <w:proofErr w:type="gramStart"/>
-      <w:r>
-        <w:t>made;</w:t>
-      </w:r>
-      <w:proofErr w:type="gramEnd"/>
-      <w:r>
-        <w:t xml:space="preserve"> </w:t>
-      </w:r>
-    </w:p>
-    <w:p>
-      <w:pPr>
-        <w:pStyle w:val="BodyText"/>
-        <w:numPr>
-          <w:ilvl w:val="1"/>
-          <w:numId w:val="8"/>
-        </w:numPr>
-        <w:spacing w:after="144"/>
-        <w:contextualSpacing/>
-      </w:pPr>
-      <w:r>
-        <w:t>The form of the complaint, whether by phone, email, text, letter, etc.; and</w:t>
-      </w:r>
-    </w:p>
-    <w:p>
-      <w:pPr>
-        <w:pStyle w:val="BodyText"/>
-        <w:numPr>
-          <w:ilvl w:val="1"/>
-          <w:numId w:val="8"/>
-        </w:numPr>
-        <w:spacing w:after="144"/>
-        <w:contextualSpacing/>
-      </w:pPr>
-      <w:r>
-        <w:t>What the landlord’s response to the complaint was, if any.</w:t>
-      </w:r>
-    </w:p>
-    <w:p>
-      <w:pPr>
-        <w:pStyle w:val="BodyText"/>
-        <w:spacing w:after="144"/>
-        <w:ind w:left="360"/>
-        <w:contextualSpacing/>
-      </w:pPr>
-      <w:r>
-        <w:t>{%p endif %}</w:t>
-      </w:r>
-    </w:p>
-    <w:p>
-      <w:pPr>
-        <w:pStyle w:val="BodyText"/>
-        <w:spacing w:after="144"/>
-        <w:ind w:left="360"/>
-        <w:contextualSpacing/>
-      </w:pPr>
-      <w:r>
-        <w:lastRenderedPageBreak/>
         <w:t xml:space="preserve">{%p if </w:t>
       </w:r>
       <w:proofErr w:type="spellStart"/>
@@ -2711,6 +2737,7 @@
         <w:contextualSpacing/>
       </w:pPr>
       <w:r>
+        <w:lastRenderedPageBreak/>
         <w:t>but not exceeding six years from when the action was commenced.</w:t>
       </w:r>
     </w:p>
@@ -2762,7 +2789,6 @@
         <w:contextualSpacing/>
       </w:pPr>
       <w:r>
-        <w:lastRenderedPageBreak/>
         <w:t>If you have requested an increase to the contract rent during the past twelve months, please describe any such request in full and complete detail, including, but not limited to:</w:t>
       </w:r>
     </w:p>
@@ -3283,6 +3309,7 @@
         <w:contextualSpacing/>
       </w:pPr>
       <w:r>
+        <w:lastRenderedPageBreak/>
         <w:t xml:space="preserve">The identity of the person who contacted the agency to perform the inspection and the date of the </w:t>
       </w:r>
       <w:proofErr w:type="gramStart"/>
@@ -3321,12 +3348,498 @@
         <w:contextualSpacing/>
       </w:pPr>
       <w:r>
+        <w:t xml:space="preserve">The substance of the </w:t>
+      </w:r>
+      <w:proofErr w:type="gramStart"/>
+      <w:r>
+        <w:t>report;</w:t>
+      </w:r>
+      <w:proofErr w:type="gramEnd"/>
+    </w:p>
+    <w:p>
+      <w:pPr>
+        <w:pStyle w:val="BodyText"/>
+        <w:numPr>
+          <w:ilvl w:val="1"/>
+          <w:numId w:val="8"/>
+        </w:numPr>
+        <w:spacing w:after="144"/>
+        <w:contextualSpacing/>
+      </w:pPr>
+      <w:r>
+        <w:t>The date and substance of any communications with the inspector or other representatives of the agency; and</w:t>
+      </w:r>
+    </w:p>
+    <w:p>
+      <w:pPr>
+        <w:pStyle w:val="BodyText"/>
+        <w:numPr>
+          <w:ilvl w:val="1"/>
+          <w:numId w:val="8"/>
+        </w:numPr>
+        <w:spacing w:after="144"/>
+        <w:contextualSpacing/>
+      </w:pPr>
+      <w:r>
+        <w:t>What, if anything, you did in response to the inspection.</w:t>
+      </w:r>
+    </w:p>
+    <w:p>
+      <w:pPr>
+        <w:pStyle w:val="BodyText"/>
+        <w:spacing w:after="144"/>
+        <w:contextualSpacing/>
+      </w:pPr>
+      <w:r>
+        <w:t>{%p endif %}</w:t>
+      </w:r>
+    </w:p>
+    <w:p>
+      <w:pPr>
+        <w:pStyle w:val="BodyText"/>
+        <w:spacing w:after="144"/>
+        <w:contextualSpacing/>
+      </w:pPr>
+      <w:r>
+        <w:t xml:space="preserve">{%p if </w:t>
+      </w:r>
+      <w:r>
+        <w:t>ints.get('</w:t>
+      </w:r>
+      <w:r>
+        <w:t>bad_conditions_prepurchase_inspections</w:t>
+      </w:r>
+      <w:proofErr w:type="gramStart"/>
+      <w:r>
+        <w:t>',DAEmpty</w:t>
+      </w:r>
+      <w:proofErr w:type="gramEnd"/>
+      <w:r>
+        <w:t>()).checked</w:t>
+      </w:r>
+      <w:r>
+        <w:t xml:space="preserve"> %}</w:t>
+      </w:r>
+    </w:p>
+    <w:p>
+      <w:pPr>
+        <w:pStyle w:val="BodyText"/>
+        <w:numPr>
+          <w:ilvl w:val="0"/>
+          <w:numId w:val="8"/>
+        </w:numPr>
+        <w:spacing w:after="144"/>
+        <w:contextualSpacing/>
+      </w:pPr>
+      <w:r>
+        <w:t>If the landlord before, at the time of, or immediately following the purchase or acquisition of the apartment or building, obtained any inspections, assessments or evaluations of the apartment and/or building, for each such inspection, assessment or evaluation state:</w:t>
+      </w:r>
+    </w:p>
+    <w:p>
+      <w:pPr>
+        <w:pStyle w:val="BodyText"/>
+        <w:numPr>
+          <w:ilvl w:val="1"/>
+          <w:numId w:val="8"/>
+        </w:numPr>
+        <w:spacing w:after="144"/>
+        <w:contextualSpacing/>
+      </w:pPr>
+      <w:r>
+        <w:t xml:space="preserve">The </w:t>
+      </w:r>
+      <w:proofErr w:type="gramStart"/>
+      <w:r>
+        <w:t>date;</w:t>
+      </w:r>
+      <w:proofErr w:type="gramEnd"/>
+    </w:p>
+    <w:p>
+      <w:pPr>
+        <w:pStyle w:val="BodyText"/>
+        <w:numPr>
+          <w:ilvl w:val="1"/>
+          <w:numId w:val="8"/>
+        </w:numPr>
+        <w:spacing w:after="144"/>
+        <w:contextualSpacing/>
+      </w:pPr>
+      <w:r>
+        <w:t xml:space="preserve">The name, address, </w:t>
+      </w:r>
+      <w:r>
+        <w:t xml:space="preserve">email </w:t>
+      </w:r>
+      <w:r>
+        <w:t xml:space="preserve">and telephone number of the person or agency who/that performed </w:t>
+      </w:r>
+      <w:proofErr w:type="gramStart"/>
+      <w:r>
+        <w:t>it;</w:t>
+      </w:r>
+      <w:proofErr w:type="gramEnd"/>
+    </w:p>
+    <w:p>
+      <w:pPr>
+        <w:pStyle w:val="BodyText"/>
+        <w:numPr>
+          <w:ilvl w:val="1"/>
+          <w:numId w:val="8"/>
+        </w:numPr>
+        <w:spacing w:after="144"/>
+        <w:contextualSpacing/>
+      </w:pPr>
+      <w:r>
+        <w:t xml:space="preserve">When you received or became aware of the inspection, assessment or </w:t>
+      </w:r>
+      <w:proofErr w:type="gramStart"/>
+      <w:r>
+        <w:t>evaluation;</w:t>
+      </w:r>
+      <w:proofErr w:type="gramEnd"/>
+    </w:p>
+    <w:p>
+      <w:pPr>
+        <w:pStyle w:val="BodyText"/>
+        <w:numPr>
+          <w:ilvl w:val="1"/>
+          <w:numId w:val="8"/>
+        </w:numPr>
+        <w:spacing w:after="144"/>
+        <w:contextualSpacing/>
+      </w:pPr>
+      <w:r>
+        <w:t>The contents thereof, stating specifically what problems or conditions were noted; and</w:t>
+      </w:r>
+    </w:p>
+    <w:p>
+      <w:pPr>
+        <w:pStyle w:val="BodyText"/>
+        <w:numPr>
+          <w:ilvl w:val="1"/>
+          <w:numId w:val="8"/>
+        </w:numPr>
+        <w:spacing w:after="144"/>
+        <w:contextualSpacing/>
+      </w:pPr>
+      <w:r>
+        <w:t>What, if anything, you did in response to such inspection, assessment, or evaluation.</w:t>
+      </w:r>
+    </w:p>
+    <w:p>
+      <w:pPr>
+        <w:pStyle w:val="BodyText"/>
+        <w:spacing w:after="144"/>
+        <w:contextualSpacing/>
+      </w:pPr>
+      <w:r>
+        <w:t>{%p endif %}</w:t>
+      </w:r>
+    </w:p>
+    <w:p>
+      <w:pPr>
+        <w:pStyle w:val="BodyText"/>
+        <w:spacing w:after="144"/>
+        <w:contextualSpacing/>
+      </w:pPr>
+      <w:r>
+        <w:t xml:space="preserve">{%p if </w:t>
+      </w:r>
+      <w:proofErr w:type="spellStart"/>
+      <w:r>
+        <w:t>ints.get</w:t>
+      </w:r>
+      <w:proofErr w:type="spellEnd"/>
+      <w:r>
+        <w:t>('</w:t>
+      </w:r>
+      <w:r>
+        <w:t>bad_conditions_attempted_repairs</w:t>
+      </w:r>
+      <w:proofErr w:type="gramStart"/>
+      <w:r>
+        <w:t>',</w:t>
+      </w:r>
+      <w:proofErr w:type="spellStart"/>
+      <w:r>
+        <w:t>DAEmpty</w:t>
+      </w:r>
+      <w:proofErr w:type="spellEnd"/>
+      <w:proofErr w:type="gramEnd"/>
+      <w:r>
+        <w:t>()).checked</w:t>
+      </w:r>
+      <w:r>
+        <w:t xml:space="preserve"> %}</w:t>
+      </w:r>
+    </w:p>
+    <w:p>
+      <w:pPr>
+        <w:pStyle w:val="BodyText"/>
+        <w:numPr>
+          <w:ilvl w:val="0"/>
+          <w:numId w:val="8"/>
+        </w:numPr>
+        <w:spacing w:after="144"/>
+        <w:contextualSpacing/>
+      </w:pPr>
+      <w:r>
+        <w:t>If the landlord has made or attempted to make inspections and/or repairs (including exterminations) to the tenant’s apartment and/or common areas and systems of the building</w:t>
+      </w:r>
+      <w:r>
+        <w:t xml:space="preserve"> </w:t>
+      </w:r>
+      <w:r>
+        <w:t>within the most recent 6 years of the tenant’s tenancy</w:t>
+      </w:r>
+      <w:r>
+        <w:t>, for each such inspection and/or repair (or attempt), including extermination, please state:</w:t>
+      </w:r>
+    </w:p>
+    <w:p>
+      <w:pPr>
+        <w:pStyle w:val="BodyText"/>
+        <w:numPr>
+          <w:ilvl w:val="1"/>
+          <w:numId w:val="8"/>
+        </w:numPr>
+        <w:spacing w:after="144"/>
+        <w:contextualSpacing/>
+      </w:pPr>
+      <w:r>
+        <w:t xml:space="preserve">A description of each inspection and/or </w:t>
+      </w:r>
+      <w:proofErr w:type="gramStart"/>
+      <w:r>
+        <w:t>repair;</w:t>
+      </w:r>
+      <w:proofErr w:type="gramEnd"/>
+    </w:p>
+    <w:p>
+      <w:pPr>
+        <w:pStyle w:val="BodyText"/>
+        <w:numPr>
+          <w:ilvl w:val="1"/>
+          <w:numId w:val="8"/>
+        </w:numPr>
+        <w:spacing w:after="144"/>
+        <w:contextualSpacing/>
+      </w:pPr>
+      <w:r>
+        <w:t>How and when you let the tenant know of your plan to inspect and/or to repair (including whether there was written notice to the tenant</w:t>
+      </w:r>
+      <w:proofErr w:type="gramStart"/>
+      <w:r>
+        <w:t>);</w:t>
+      </w:r>
+      <w:proofErr w:type="gramEnd"/>
+    </w:p>
+    <w:p>
+      <w:pPr>
+        <w:pStyle w:val="BodyText"/>
+        <w:numPr>
+          <w:ilvl w:val="1"/>
+          <w:numId w:val="8"/>
+        </w:numPr>
+        <w:spacing w:after="144"/>
+        <w:contextualSpacing/>
+      </w:pPr>
+      <w:r>
+        <w:t xml:space="preserve">The date of each inspection and/or </w:t>
+      </w:r>
+      <w:proofErr w:type="gramStart"/>
+      <w:r>
+        <w:t>repair;</w:t>
+      </w:r>
+      <w:proofErr w:type="gramEnd"/>
+    </w:p>
+    <w:p>
+      <w:pPr>
+        <w:pStyle w:val="BodyText"/>
+        <w:numPr>
+          <w:ilvl w:val="1"/>
+          <w:numId w:val="8"/>
+        </w:numPr>
+        <w:spacing w:after="144"/>
+        <w:contextualSpacing/>
+      </w:pPr>
+      <w:r>
+        <w:t xml:space="preserve">The name, address, and </w:t>
+      </w:r>
+      <w:r>
+        <w:t xml:space="preserve">email and </w:t>
+      </w:r>
+      <w:r>
+        <w:t>telephone number of the company/person who made each inspection and/or repair; and</w:t>
+      </w:r>
+    </w:p>
+    <w:p>
+      <w:pPr>
+        <w:pStyle w:val="BodyText"/>
+        <w:numPr>
+          <w:ilvl w:val="1"/>
+          <w:numId w:val="8"/>
+        </w:numPr>
+        <w:spacing w:after="144"/>
+        <w:contextualSpacing/>
+      </w:pPr>
+      <w:r>
+        <w:t>The cost of each repair, if applicable.</w:t>
+      </w:r>
+    </w:p>
+    <w:p>
+      <w:pPr>
+        <w:pStyle w:val="BodyText"/>
+        <w:numPr>
+          <w:ilvl w:val="1"/>
+          <w:numId w:val="8"/>
+        </w:numPr>
+        <w:spacing w:after="144"/>
+        <w:contextualSpacing/>
+      </w:pPr>
+      <w:r>
+        <w:t>For repairs, how and when you first knew of the condition that needed to be repaired.</w:t>
+      </w:r>
+    </w:p>
+    <w:p>
+      <w:pPr>
+        <w:pStyle w:val="BodyText"/>
+        <w:spacing w:after="144"/>
+        <w:contextualSpacing/>
+      </w:pPr>
+      <w:r>
+        <w:t>{%p endif %}</w:t>
+      </w:r>
+    </w:p>
+    <w:p>
+      <w:pPr>
+        <w:pStyle w:val="BodyText"/>
+        <w:spacing w:after="144"/>
+        <w:contextualSpacing/>
+      </w:pPr>
+      <w:r>
+        <w:t xml:space="preserve">{%p if </w:t>
+      </w:r>
+      <w:proofErr w:type="spellStart"/>
+      <w:r>
+        <w:t>ints.get</w:t>
+      </w:r>
+      <w:proofErr w:type="spellEnd"/>
+      <w:r>
+        <w:t>('</w:t>
+      </w:r>
+      <w:r>
+        <w:t>lead_paint</w:t>
+      </w:r>
+      <w:proofErr w:type="gramStart"/>
+      <w:r>
+        <w:t>',</w:t>
+      </w:r>
+      <w:proofErr w:type="spellStart"/>
+      <w:r>
+        <w:t>DAEmpty</w:t>
+      </w:r>
+      <w:proofErr w:type="spellEnd"/>
+      <w:proofErr w:type="gramEnd"/>
+      <w:r>
+        <w:t>()).checked</w:t>
+      </w:r>
+      <w:r>
+        <w:t xml:space="preserve"> %}</w:t>
+      </w:r>
+    </w:p>
+    <w:p>
+      <w:pPr>
+        <w:pStyle w:val="BodyText"/>
+        <w:numPr>
+          <w:ilvl w:val="0"/>
+          <w:numId w:val="8"/>
+        </w:numPr>
+        <w:spacing w:after="144"/>
+        <w:contextualSpacing/>
+      </w:pPr>
+      <w:r>
+        <w:t>If you have ever learned of or tried to discover whether there is lead paint in the tenant’s apartment and/or building, please provide:</w:t>
+      </w:r>
+    </w:p>
+    <w:p>
+      <w:pPr>
+        <w:pStyle w:val="BodyText"/>
+        <w:numPr>
+          <w:ilvl w:val="1"/>
+          <w:numId w:val="8"/>
+        </w:numPr>
+        <w:spacing w:after="144"/>
+        <w:contextualSpacing/>
+      </w:pPr>
+      <w:r>
+        <w:t>A full and complete description of your investigation and/or knowledge/information regarding the presence (or absence) of lead paint in the apartment and/or building, including, but not limited to:</w:t>
+      </w:r>
+    </w:p>
+    <w:p>
+      <w:pPr>
+        <w:pStyle w:val="BodyText"/>
+        <w:numPr>
+          <w:ilvl w:val="2"/>
+          <w:numId w:val="8"/>
+        </w:numPr>
+        <w:spacing w:after="144"/>
+        <w:contextualSpacing/>
+      </w:pPr>
+      <w:r>
+        <w:t>The substance of any inspections, investigation or knowledge/</w:t>
+      </w:r>
+      <w:proofErr w:type="gramStart"/>
+      <w:r>
+        <w:t>information;</w:t>
+      </w:r>
+      <w:proofErr w:type="gramEnd"/>
+    </w:p>
+    <w:p>
+      <w:pPr>
+        <w:pStyle w:val="BodyText"/>
+        <w:numPr>
+          <w:ilvl w:val="2"/>
+          <w:numId w:val="8"/>
+        </w:numPr>
+        <w:spacing w:after="144"/>
+        <w:contextualSpacing/>
+      </w:pPr>
+      <w:r>
+        <w:t xml:space="preserve">The name, address, </w:t>
+      </w:r>
+      <w:r>
+        <w:t xml:space="preserve">email </w:t>
+      </w:r>
+      <w:r>
+        <w:t xml:space="preserve">and telephone number of any person/company with </w:t>
+      </w:r>
+      <w:proofErr w:type="gramStart"/>
+      <w:r>
+        <w:t>information;</w:t>
+      </w:r>
+      <w:proofErr w:type="gramEnd"/>
+      <w:r>
+        <w:t xml:space="preserve"> </w:t>
+      </w:r>
+    </w:p>
+    <w:p>
+      <w:pPr>
+        <w:pStyle w:val="BodyText"/>
+        <w:numPr>
+          <w:ilvl w:val="2"/>
+          <w:numId w:val="8"/>
+        </w:numPr>
+        <w:spacing w:after="144"/>
+        <w:contextualSpacing/>
+      </w:pPr>
+      <w:r>
         <w:lastRenderedPageBreak/>
-        <w:t xml:space="preserve">The substance of the </w:t>
-      </w:r>
-      <w:proofErr w:type="gramStart"/>
-      <w:r>
-        <w:t>report;</w:t>
+        <w:t>The date(s) that you conducted such investigation or otherwise acquired such knowledge/</w:t>
+      </w:r>
+      <w:proofErr w:type="gramStart"/>
+      <w:r>
+        <w:t>information;</w:t>
       </w:r>
       <w:proofErr w:type="gramEnd"/>
     </w:p>
@@ -3341,7 +3854,167 @@
         <w:contextualSpacing/>
       </w:pPr>
       <w:r>
-        <w:t>The date and substance of any communications with the inspector or other representatives of the agency; and</w:t>
+        <w:t xml:space="preserve">A full and complete description of any steps you have taken regarding the presence of lead paint in the apartment and/or building (i.e., </w:t>
+      </w:r>
+      <w:proofErr w:type="gramStart"/>
+      <w:r>
+        <w:t>any and all</w:t>
+      </w:r>
+      <w:proofErr w:type="gramEnd"/>
+      <w:r>
+        <w:t xml:space="preserve"> inspections not identified above and/or abatement of any lead paint hazard), including, but not limited to:</w:t>
+      </w:r>
+    </w:p>
+    <w:p>
+      <w:pPr>
+        <w:pStyle w:val="BodyText"/>
+        <w:numPr>
+          <w:ilvl w:val="2"/>
+          <w:numId w:val="8"/>
+        </w:numPr>
+        <w:spacing w:after="144"/>
+        <w:contextualSpacing/>
+      </w:pPr>
+      <w:r>
+        <w:t xml:space="preserve">The substance of all action taken or work </w:t>
+      </w:r>
+      <w:proofErr w:type="gramStart"/>
+      <w:r>
+        <w:t>performed;</w:t>
+      </w:r>
+      <w:proofErr w:type="gramEnd"/>
+      <w:r>
+        <w:t xml:space="preserve"> </w:t>
+      </w:r>
+    </w:p>
+    <w:p>
+      <w:pPr>
+        <w:pStyle w:val="BodyText"/>
+        <w:numPr>
+          <w:ilvl w:val="2"/>
+          <w:numId w:val="8"/>
+        </w:numPr>
+        <w:spacing w:after="144"/>
+        <w:contextualSpacing/>
+      </w:pPr>
+      <w:r>
+        <w:t xml:space="preserve">The date(s) </w:t>
+      </w:r>
+      <w:proofErr w:type="gramStart"/>
+      <w:r>
+        <w:t>thereof;</w:t>
+      </w:r>
+      <w:proofErr w:type="gramEnd"/>
+      <w:r>
+        <w:t xml:space="preserve"> </w:t>
+      </w:r>
+    </w:p>
+    <w:p>
+      <w:pPr>
+        <w:pStyle w:val="BodyText"/>
+        <w:numPr>
+          <w:ilvl w:val="2"/>
+          <w:numId w:val="8"/>
+        </w:numPr>
+        <w:spacing w:after="144"/>
+        <w:contextualSpacing/>
+      </w:pPr>
+      <w:r>
+        <w:t xml:space="preserve">Who did what work (name, address, company, </w:t>
+      </w:r>
+      <w:r>
+        <w:t xml:space="preserve">email, </w:t>
+      </w:r>
+      <w:r>
+        <w:t xml:space="preserve">telephone number, and license number of the </w:t>
+      </w:r>
+      <w:proofErr w:type="spellStart"/>
+      <w:r>
+        <w:t>deleader</w:t>
+      </w:r>
+      <w:proofErr w:type="spellEnd"/>
+      <w:proofErr w:type="gramStart"/>
+      <w:r>
+        <w:t>);</w:t>
+      </w:r>
+      <w:proofErr w:type="gramEnd"/>
+      <w:r>
+        <w:t xml:space="preserve"> </w:t>
+      </w:r>
+    </w:p>
+    <w:p>
+      <w:pPr>
+        <w:pStyle w:val="BodyText"/>
+        <w:numPr>
+          <w:ilvl w:val="2"/>
+          <w:numId w:val="8"/>
+        </w:numPr>
+        <w:spacing w:after="144"/>
+        <w:contextualSpacing/>
+      </w:pPr>
+      <w:r>
+        <w:t>The details of any arrangements for relocation of the tenant during the abatement process (including where the tenant was relocated, how the tenant was relocated, and the payment of any costs associated with such relocation).</w:t>
+      </w:r>
+    </w:p>
+    <w:p>
+      <w:pPr>
+        <w:pStyle w:val="BodyText"/>
+        <w:spacing w:after="144"/>
+        <w:contextualSpacing/>
+      </w:pPr>
+      <w:r>
+        <w:t>{%p endif %}</w:t>
+      </w:r>
+    </w:p>
+    <w:p>
+      <w:pPr>
+        <w:pStyle w:val="BodyText"/>
+        <w:spacing w:after="144"/>
+        <w:contextualSpacing/>
+      </w:pPr>
+      <w:r>
+        <w:t xml:space="preserve">{%p if </w:t>
+      </w:r>
+      <w:proofErr w:type="spellStart"/>
+      <w:r>
+        <w:t>ints.get</w:t>
+      </w:r>
+      <w:proofErr w:type="spellEnd"/>
+      <w:r>
+        <w:t>('</w:t>
+      </w:r>
+      <w:r>
+        <w:t>bad_conditions_tenant_damaged</w:t>
+      </w:r>
+      <w:proofErr w:type="gramStart"/>
+      <w:r>
+        <w:t>',</w:t>
+      </w:r>
+      <w:proofErr w:type="spellStart"/>
+      <w:r>
+        <w:t>DAEmpty</w:t>
+      </w:r>
+      <w:proofErr w:type="spellEnd"/>
+      <w:proofErr w:type="gramEnd"/>
+      <w:r>
+        <w:t>()).checked</w:t>
+      </w:r>
+      <w:r>
+        <w:t xml:space="preserve"> %}</w:t>
+      </w:r>
+    </w:p>
+    <w:p>
+      <w:pPr>
+        <w:pStyle w:val="BodyText"/>
+        <w:numPr>
+          <w:ilvl w:val="0"/>
+          <w:numId w:val="8"/>
+        </w:numPr>
+        <w:spacing w:after="144"/>
+        <w:contextualSpacing/>
+      </w:pPr>
+      <w:r>
+        <w:t>If you claim that the tenant caused any damage to the apartment and/or building, please describe such damage in full and complete detail, including, but not limited to:</w:t>
       </w:r>
     </w:p>
     <w:p>
@@ -3355,7 +4028,73 @@
         <w:contextualSpacing/>
       </w:pPr>
       <w:r>
-        <w:t>What, if anything, you did in response to the inspection.</w:t>
+        <w:t xml:space="preserve">The substance of such </w:t>
+      </w:r>
+      <w:proofErr w:type="gramStart"/>
+      <w:r>
+        <w:t>damage;</w:t>
+      </w:r>
+      <w:proofErr w:type="gramEnd"/>
+      <w:r>
+        <w:t xml:space="preserve"> </w:t>
+      </w:r>
+    </w:p>
+    <w:p>
+      <w:pPr>
+        <w:pStyle w:val="BodyText"/>
+        <w:numPr>
+          <w:ilvl w:val="1"/>
+          <w:numId w:val="8"/>
+        </w:numPr>
+        <w:spacing w:after="144"/>
+        <w:contextualSpacing/>
+      </w:pPr>
+      <w:r>
+        <w:t xml:space="preserve">Why you believe the tenant caused the </w:t>
+      </w:r>
+      <w:proofErr w:type="gramStart"/>
+      <w:r>
+        <w:t>damage;</w:t>
+      </w:r>
+      <w:proofErr w:type="gramEnd"/>
+    </w:p>
+    <w:p>
+      <w:pPr>
+        <w:pStyle w:val="BodyText"/>
+        <w:numPr>
+          <w:ilvl w:val="1"/>
+          <w:numId w:val="8"/>
+        </w:numPr>
+        <w:spacing w:after="144"/>
+        <w:contextualSpacing/>
+      </w:pPr>
+      <w:r>
+        <w:t xml:space="preserve">What if any repairs were made to such damage, the date(s) of such repairs, and the costs of such </w:t>
+      </w:r>
+      <w:proofErr w:type="gramStart"/>
+      <w:r>
+        <w:t>repairs;</w:t>
+      </w:r>
+      <w:proofErr w:type="gramEnd"/>
+    </w:p>
+    <w:p>
+      <w:pPr>
+        <w:pStyle w:val="BodyText"/>
+        <w:numPr>
+          <w:ilvl w:val="1"/>
+          <w:numId w:val="8"/>
+        </w:numPr>
+        <w:spacing w:after="144"/>
+        <w:contextualSpacing/>
+      </w:pPr>
+      <w:r>
+        <w:t xml:space="preserve">The name(s), address(es), </w:t>
+      </w:r>
+      <w:r>
+        <w:t xml:space="preserve">email </w:t>
+      </w:r>
+      <w:r>
+        <w:t>and telephone number(s) of anyone with knowledge of such damage allegedly caused by the tenant.</w:t>
       </w:r>
     </w:p>
     <w:p>
@@ -3377,11 +4116,157 @@
       <w:r>
         <w:t xml:space="preserve">{%p if </w:t>
       </w:r>
+      <w:proofErr w:type="spellStart"/>
+      <w:r>
+        <w:t>ints.get</w:t>
+      </w:r>
+      <w:proofErr w:type="spellEnd"/>
+      <w:r>
+        <w:t>('</w:t>
+      </w:r>
+      <w:r>
+        <w:t>bad_conditions_tenant_hindered</w:t>
+      </w:r>
+      <w:proofErr w:type="gramStart"/>
+      <w:r>
+        <w:t>',</w:t>
+      </w:r>
+      <w:proofErr w:type="spellStart"/>
+      <w:r>
+        <w:t>DAEmpty</w:t>
+      </w:r>
+      <w:proofErr w:type="spellEnd"/>
+      <w:proofErr w:type="gramEnd"/>
+      <w:r>
+        <w:t>()).checked</w:t>
+      </w:r>
+      <w:r>
+        <w:t xml:space="preserve"> %}</w:t>
+      </w:r>
+    </w:p>
+    <w:p>
+      <w:pPr>
+        <w:pStyle w:val="BodyText"/>
+        <w:numPr>
+          <w:ilvl w:val="0"/>
+          <w:numId w:val="8"/>
+        </w:numPr>
+        <w:spacing w:after="144"/>
+        <w:contextualSpacing/>
+      </w:pPr>
+      <w:r>
+        <w:t>If you claim the tenant prevented or hindered you from inspecting the apartment and/or making repairs, for each attempt to inspect or make repairs, please describe:</w:t>
+      </w:r>
+    </w:p>
+    <w:p>
+      <w:pPr>
+        <w:pStyle w:val="BodyText"/>
+        <w:numPr>
+          <w:ilvl w:val="1"/>
+          <w:numId w:val="8"/>
+        </w:numPr>
+        <w:spacing w:after="144"/>
+        <w:contextualSpacing/>
+      </w:pPr>
+      <w:r>
+        <w:t xml:space="preserve">The date of the </w:t>
+      </w:r>
+      <w:proofErr w:type="gramStart"/>
+      <w:r>
+        <w:t>attempt;</w:t>
+      </w:r>
+      <w:proofErr w:type="gramEnd"/>
+    </w:p>
+    <w:p>
+      <w:pPr>
+        <w:pStyle w:val="BodyText"/>
+        <w:numPr>
+          <w:ilvl w:val="1"/>
+          <w:numId w:val="8"/>
+        </w:numPr>
+        <w:spacing w:after="144"/>
+        <w:contextualSpacing/>
+      </w:pPr>
+      <w:r>
+        <w:t xml:space="preserve">How and when you let the tenant know of your plan to inspect and/or to </w:t>
+      </w:r>
+      <w:proofErr w:type="gramStart"/>
+      <w:r>
+        <w:t>repair;</w:t>
+      </w:r>
+      <w:proofErr w:type="gramEnd"/>
+    </w:p>
+    <w:p>
+      <w:pPr>
+        <w:pStyle w:val="BodyText"/>
+        <w:numPr>
+          <w:ilvl w:val="1"/>
+          <w:numId w:val="8"/>
+        </w:numPr>
+        <w:spacing w:after="144"/>
+        <w:contextualSpacing/>
+      </w:pPr>
+      <w:r>
+        <w:t xml:space="preserve">What the tenant did or said to prevent or hinder the inspection or </w:t>
+      </w:r>
+      <w:proofErr w:type="gramStart"/>
+      <w:r>
+        <w:t>repair;</w:t>
+      </w:r>
+      <w:proofErr w:type="gramEnd"/>
+    </w:p>
+    <w:p>
+      <w:pPr>
+        <w:pStyle w:val="BodyText"/>
+        <w:numPr>
+          <w:ilvl w:val="1"/>
+          <w:numId w:val="8"/>
+        </w:numPr>
+        <w:spacing w:after="144"/>
+        <w:contextualSpacing/>
+      </w:pPr>
+      <w:r>
+        <w:t>The names and addresses of anyone present at the time who has information about the tenant’s interference with the inspection or repair; and</w:t>
+      </w:r>
+    </w:p>
+    <w:p>
+      <w:pPr>
+        <w:pStyle w:val="BodyText"/>
+        <w:numPr>
+          <w:ilvl w:val="1"/>
+          <w:numId w:val="8"/>
+        </w:numPr>
+        <w:spacing w:after="144"/>
+        <w:contextualSpacing/>
+      </w:pPr>
+      <w:r>
+        <w:t>Any financial or other loss suffered as a result of the tenant’s actions or inactions.</w:t>
+      </w:r>
+    </w:p>
+    <w:p>
+      <w:pPr>
+        <w:pStyle w:val="BodyText"/>
+        <w:spacing w:after="144"/>
+        <w:contextualSpacing/>
+      </w:pPr>
+      <w:r>
+        <w:t>{%p endif %}</w:t>
+      </w:r>
+    </w:p>
+    <w:p>
+      <w:pPr>
+        <w:pStyle w:val="BodyText"/>
+        <w:spacing w:after="144"/>
+        <w:contextualSpacing/>
+      </w:pPr>
+      <w:r>
+        <w:t xml:space="preserve">{%p if </w:t>
+      </w:r>
       <w:r>
         <w:t>ints.get('</w:t>
       </w:r>
       <w:r>
-        <w:t>bad_conditions_prepurchase_inspections</w:t>
+        <w:t>bad_conditions_landlord_entered_premises</w:t>
       </w:r>
       <w:proofErr w:type="gramStart"/>
       <w:r>
@@ -3406,98 +4291,13 @@
         <w:contextualSpacing/>
       </w:pPr>
       <w:r>
-        <w:t>If the landlord before, at the time of, or immediately following the purchase or acquisition of the apartment or building, obtained any inspections, assessments or evaluations of the apartment and/or building, for each such inspection, assessment or evaluation state:</w:t>
-      </w:r>
-    </w:p>
-    <w:p>
-      <w:pPr>
-        <w:pStyle w:val="BodyText"/>
-        <w:numPr>
-          <w:ilvl w:val="1"/>
-          <w:numId w:val="8"/>
-        </w:numPr>
-        <w:spacing w:after="144"/>
-        <w:contextualSpacing/>
-      </w:pPr>
-      <w:r>
-        <w:t xml:space="preserve">The </w:t>
-      </w:r>
-      <w:proofErr w:type="gramStart"/>
-      <w:r>
-        <w:t>date;</w:t>
-      </w:r>
-      <w:proofErr w:type="gramEnd"/>
-    </w:p>
-    <w:p>
-      <w:pPr>
-        <w:pStyle w:val="BodyText"/>
-        <w:numPr>
-          <w:ilvl w:val="1"/>
-          <w:numId w:val="8"/>
-        </w:numPr>
-        <w:spacing w:after="144"/>
-        <w:contextualSpacing/>
-      </w:pPr>
-      <w:r>
-        <w:t xml:space="preserve">The name, address, </w:t>
-      </w:r>
-      <w:r>
-        <w:t xml:space="preserve">email </w:t>
-      </w:r>
-      <w:r>
-        <w:t xml:space="preserve">and telephone number of the person or agency who/that performed </w:t>
-      </w:r>
-      <w:proofErr w:type="gramStart"/>
-      <w:r>
-        <w:t>it;</w:t>
-      </w:r>
-      <w:proofErr w:type="gramEnd"/>
-    </w:p>
-    <w:p>
-      <w:pPr>
-        <w:pStyle w:val="BodyText"/>
-        <w:numPr>
-          <w:ilvl w:val="1"/>
-          <w:numId w:val="8"/>
-        </w:numPr>
-        <w:spacing w:after="144"/>
-        <w:contextualSpacing/>
-      </w:pPr>
-      <w:r>
-        <w:t xml:space="preserve">When you received or became aware of the inspection, assessment or </w:t>
-      </w:r>
-      <w:proofErr w:type="gramStart"/>
-      <w:r>
-        <w:t>evaluation;</w:t>
-      </w:r>
-      <w:proofErr w:type="gramEnd"/>
-    </w:p>
-    <w:p>
-      <w:pPr>
-        <w:pStyle w:val="BodyText"/>
-        <w:numPr>
-          <w:ilvl w:val="1"/>
-          <w:numId w:val="8"/>
-        </w:numPr>
-        <w:spacing w:after="144"/>
-        <w:contextualSpacing/>
-      </w:pPr>
-      <w:r>
-        <w:t>The contents thereof, stating specifically what problems or conditions were noted; and</w:t>
-      </w:r>
-    </w:p>
-    <w:p>
-      <w:pPr>
-        <w:pStyle w:val="BodyText"/>
-        <w:numPr>
-          <w:ilvl w:val="1"/>
-          <w:numId w:val="8"/>
-        </w:numPr>
-        <w:spacing w:after="144"/>
-        <w:contextualSpacing/>
-      </w:pPr>
-      <w:r>
-        <w:t>What, if anything, you did in response to such inspection, assessment, or evaluation.</w:t>
+        <w:t xml:space="preserve">If you or anyone on your behalf has been inside the tenant’s apartment </w:t>
+      </w:r>
+      <w:r>
+        <w:t xml:space="preserve">within the most recent 6 years of the tenant’s tenancy </w:t>
+      </w:r>
+      <w:r>
+        <w:t>(or before the tenancy for the purpose of renting to/preparing the apartment for the tenant), please state who was inside the apartment, when, and why s/he was there.</w:t>
       </w:r>
     </w:p>
     <w:p>
@@ -3519,26 +4319,16 @@
       <w:r>
         <w:t xml:space="preserve">{%p if </w:t>
       </w:r>
-      <w:proofErr w:type="spellStart"/>
-      <w:r>
-        <w:t>ints.get</w:t>
-      </w:r>
-      <w:proofErr w:type="spellEnd"/>
-      <w:r>
-        <w:t>('</w:t>
-      </w:r>
-      <w:r>
-        <w:t>bad_conditions_attempted_repairs</w:t>
-      </w:r>
-      <w:proofErr w:type="gramStart"/>
-      <w:r>
-        <w:t>',</w:t>
-      </w:r>
-      <w:proofErr w:type="spellStart"/>
-      <w:r>
-        <w:t>DAEmpty</w:t>
-      </w:r>
-      <w:proofErr w:type="spellEnd"/>
+      <w:r>
+        <w:t>ints.get('</w:t>
+      </w:r>
+      <w:r>
+        <w:t>bad_conditions_describe_maintenance</w:t>
+      </w:r>
+      <w:proofErr w:type="gramStart"/>
+      <w:r>
+        <w:t>',DAEmpty</w:t>
+      </w:r>
       <w:proofErr w:type="gramEnd"/>
       <w:r>
         <w:t>()).checked</w:t>
@@ -3558,775 +4348,11 @@
         <w:contextualSpacing/>
       </w:pPr>
       <w:r>
-        <w:t>If the landlord has made or attempted to make inspections and/or repairs (including exterminations) to the tenant’s apartment and/or common areas and systems of the building</w:t>
-      </w:r>
-      <w:r>
-        <w:t xml:space="preserve"> </w:t>
-      </w:r>
-      <w:r>
-        <w:t>within the most recent 6 years of the tenant’s tenancy</w:t>
-      </w:r>
-      <w:r>
-        <w:t>, for each such inspection and/or repair (or attempt), including extermination, please state:</w:t>
-      </w:r>
-    </w:p>
-    <w:p>
-      <w:pPr>
-        <w:pStyle w:val="BodyText"/>
-        <w:numPr>
-          <w:ilvl w:val="1"/>
-          <w:numId w:val="8"/>
-        </w:numPr>
-        <w:spacing w:after="144"/>
-        <w:contextualSpacing/>
-      </w:pPr>
-      <w:r>
-        <w:t xml:space="preserve">A description of each inspection and/or </w:t>
-      </w:r>
-      <w:proofErr w:type="gramStart"/>
-      <w:r>
-        <w:t>repair;</w:t>
-      </w:r>
-      <w:proofErr w:type="gramEnd"/>
-    </w:p>
-    <w:p>
-      <w:pPr>
-        <w:pStyle w:val="BodyText"/>
-        <w:numPr>
-          <w:ilvl w:val="1"/>
-          <w:numId w:val="8"/>
-        </w:numPr>
-        <w:spacing w:after="144"/>
-        <w:contextualSpacing/>
-      </w:pPr>
-      <w:r>
-        <w:t>How and when you let the tenant know of your plan to inspect and/or to repair (including whether there was written notice to the tenant</w:t>
-      </w:r>
-      <w:proofErr w:type="gramStart"/>
-      <w:r>
-        <w:t>);</w:t>
-      </w:r>
-      <w:proofErr w:type="gramEnd"/>
-    </w:p>
-    <w:p>
-      <w:pPr>
-        <w:pStyle w:val="BodyText"/>
-        <w:numPr>
-          <w:ilvl w:val="1"/>
-          <w:numId w:val="8"/>
-        </w:numPr>
-        <w:spacing w:after="144"/>
-        <w:contextualSpacing/>
-      </w:pPr>
-      <w:r>
-        <w:t xml:space="preserve">The date of each inspection and/or </w:t>
-      </w:r>
-      <w:proofErr w:type="gramStart"/>
-      <w:r>
-        <w:t>repair;</w:t>
-      </w:r>
-      <w:proofErr w:type="gramEnd"/>
-    </w:p>
-    <w:p>
-      <w:pPr>
-        <w:pStyle w:val="BodyText"/>
-        <w:numPr>
-          <w:ilvl w:val="1"/>
-          <w:numId w:val="8"/>
-        </w:numPr>
-        <w:spacing w:after="144"/>
-        <w:contextualSpacing/>
-      </w:pPr>
-      <w:r>
-        <w:t xml:space="preserve">The name, address, and </w:t>
-      </w:r>
-      <w:r>
-        <w:t xml:space="preserve">email and </w:t>
-      </w:r>
-      <w:r>
-        <w:t>telephone number of the company/person who made each inspection and/or repair; and</w:t>
-      </w:r>
-    </w:p>
-    <w:p>
-      <w:pPr>
-        <w:pStyle w:val="BodyText"/>
-        <w:numPr>
-          <w:ilvl w:val="1"/>
-          <w:numId w:val="8"/>
-        </w:numPr>
-        <w:spacing w:after="144"/>
-        <w:contextualSpacing/>
-      </w:pPr>
-      <w:r>
-        <w:t>The cost of each repair, if applicable.</w:t>
-      </w:r>
-    </w:p>
-    <w:p>
-      <w:pPr>
-        <w:pStyle w:val="BodyText"/>
-        <w:numPr>
-          <w:ilvl w:val="1"/>
-          <w:numId w:val="8"/>
-        </w:numPr>
-        <w:spacing w:after="144"/>
-        <w:contextualSpacing/>
-      </w:pPr>
-      <w:r>
-        <w:t>For repairs, how and when you first knew of the condition that needed to be repaired.</w:t>
-      </w:r>
-    </w:p>
-    <w:p>
-      <w:pPr>
-        <w:pStyle w:val="BodyText"/>
-        <w:spacing w:after="144"/>
-        <w:contextualSpacing/>
-      </w:pPr>
-      <w:r>
-        <w:t>{%p endif %}</w:t>
-      </w:r>
-    </w:p>
-    <w:p>
-      <w:pPr>
-        <w:pStyle w:val="BodyText"/>
-        <w:spacing w:after="144"/>
-        <w:contextualSpacing/>
-      </w:pPr>
-      <w:r>
-        <w:t xml:space="preserve">{%p if </w:t>
-      </w:r>
-      <w:proofErr w:type="spellStart"/>
-      <w:r>
-        <w:t>ints.get</w:t>
-      </w:r>
-      <w:proofErr w:type="spellEnd"/>
-      <w:r>
-        <w:t>('</w:t>
-      </w:r>
-      <w:r>
-        <w:t>lead_paint</w:t>
-      </w:r>
-      <w:proofErr w:type="gramStart"/>
-      <w:r>
-        <w:t>',</w:t>
-      </w:r>
-      <w:proofErr w:type="spellStart"/>
-      <w:r>
-        <w:t>DAEmpty</w:t>
-      </w:r>
-      <w:proofErr w:type="spellEnd"/>
-      <w:proofErr w:type="gramEnd"/>
-      <w:r>
-        <w:t>()).checked</w:t>
-      </w:r>
-      <w:r>
-        <w:t xml:space="preserve"> %}</w:t>
-      </w:r>
-    </w:p>
-    <w:p>
-      <w:pPr>
-        <w:pStyle w:val="BodyText"/>
-        <w:numPr>
-          <w:ilvl w:val="0"/>
-          <w:numId w:val="8"/>
-        </w:numPr>
-        <w:spacing w:after="144"/>
-        <w:contextualSpacing/>
-      </w:pPr>
-      <w:r>
-        <w:t>If you have ever learned of or tried to discover whether there is lead paint in the tenant’s apartment and/or building, please provide:</w:t>
-      </w:r>
-    </w:p>
-    <w:p>
-      <w:pPr>
-        <w:pStyle w:val="BodyText"/>
-        <w:numPr>
-          <w:ilvl w:val="1"/>
-          <w:numId w:val="8"/>
-        </w:numPr>
-        <w:spacing w:after="144"/>
-        <w:contextualSpacing/>
-      </w:pPr>
-      <w:r>
-        <w:t>A full and complete description of your investigation and/or knowledge/information regarding the presence (or absence) of lead paint in the apartment and/or building, including, but not limited to:</w:t>
-      </w:r>
-    </w:p>
-    <w:p>
-      <w:pPr>
-        <w:pStyle w:val="BodyText"/>
-        <w:numPr>
-          <w:ilvl w:val="2"/>
-          <w:numId w:val="8"/>
-        </w:numPr>
-        <w:spacing w:after="144"/>
-        <w:contextualSpacing/>
-      </w:pPr>
-      <w:r>
-        <w:t>The substance of any inspections, investigation or knowledge/</w:t>
-      </w:r>
-      <w:proofErr w:type="gramStart"/>
-      <w:r>
-        <w:t>information;</w:t>
-      </w:r>
-      <w:proofErr w:type="gramEnd"/>
-    </w:p>
-    <w:p>
-      <w:pPr>
-        <w:pStyle w:val="BodyText"/>
-        <w:numPr>
-          <w:ilvl w:val="2"/>
-          <w:numId w:val="8"/>
-        </w:numPr>
-        <w:spacing w:after="144"/>
-        <w:contextualSpacing/>
-      </w:pPr>
-      <w:r>
-        <w:t xml:space="preserve">The name, address, </w:t>
-      </w:r>
-      <w:r>
-        <w:t xml:space="preserve">email </w:t>
-      </w:r>
-      <w:r>
-        <w:t xml:space="preserve">and telephone number of any person/company with </w:t>
-      </w:r>
-      <w:proofErr w:type="gramStart"/>
-      <w:r>
-        <w:t>information;</w:t>
-      </w:r>
-      <w:proofErr w:type="gramEnd"/>
-      <w:r>
-        <w:t xml:space="preserve"> </w:t>
-      </w:r>
-    </w:p>
-    <w:p>
-      <w:pPr>
-        <w:pStyle w:val="BodyText"/>
-        <w:numPr>
-          <w:ilvl w:val="2"/>
-          <w:numId w:val="8"/>
-        </w:numPr>
-        <w:spacing w:after="144"/>
-        <w:contextualSpacing/>
-      </w:pPr>
-      <w:r>
-        <w:t>The date(s) that you conducted such investigation or otherwise acquired such knowledge/</w:t>
-      </w:r>
-      <w:proofErr w:type="gramStart"/>
-      <w:r>
-        <w:t>information;</w:t>
-      </w:r>
-      <w:proofErr w:type="gramEnd"/>
-    </w:p>
-    <w:p>
-      <w:pPr>
-        <w:pStyle w:val="BodyText"/>
-        <w:numPr>
-          <w:ilvl w:val="1"/>
-          <w:numId w:val="8"/>
-        </w:numPr>
-        <w:spacing w:after="144"/>
-        <w:contextualSpacing/>
-      </w:pPr>
+        <w:t xml:space="preserve">Please describe in full and complete detail the maintenance and management of the apartment and/or building during the tenancy, including, but not limited to, the name of the management </w:t>
+      </w:r>
       <w:r>
         <w:lastRenderedPageBreak/>
-        <w:t xml:space="preserve">A full and complete description of any steps you have taken regarding the presence of lead paint in the apartment and/or building (i.e., </w:t>
-      </w:r>
-      <w:proofErr w:type="gramStart"/>
-      <w:r>
-        <w:t>any and all</w:t>
-      </w:r>
-      <w:proofErr w:type="gramEnd"/>
-      <w:r>
-        <w:t xml:space="preserve"> inspections not identified above and/or abatement of any lead paint hazard), including, but not limited to:</w:t>
-      </w:r>
-    </w:p>
-    <w:p>
-      <w:pPr>
-        <w:pStyle w:val="BodyText"/>
-        <w:numPr>
-          <w:ilvl w:val="2"/>
-          <w:numId w:val="8"/>
-        </w:numPr>
-        <w:spacing w:after="144"/>
-        <w:contextualSpacing/>
-      </w:pPr>
-      <w:r>
-        <w:t xml:space="preserve">The substance of all action taken or work </w:t>
-      </w:r>
-      <w:proofErr w:type="gramStart"/>
-      <w:r>
-        <w:t>performed;</w:t>
-      </w:r>
-      <w:proofErr w:type="gramEnd"/>
-      <w:r>
-        <w:t xml:space="preserve"> </w:t>
-      </w:r>
-    </w:p>
-    <w:p>
-      <w:pPr>
-        <w:pStyle w:val="BodyText"/>
-        <w:numPr>
-          <w:ilvl w:val="2"/>
-          <w:numId w:val="8"/>
-        </w:numPr>
-        <w:spacing w:after="144"/>
-        <w:contextualSpacing/>
-      </w:pPr>
-      <w:r>
-        <w:t xml:space="preserve">The date(s) </w:t>
-      </w:r>
-      <w:proofErr w:type="gramStart"/>
-      <w:r>
-        <w:t>thereof;</w:t>
-      </w:r>
-      <w:proofErr w:type="gramEnd"/>
-      <w:r>
-        <w:t xml:space="preserve"> </w:t>
-      </w:r>
-    </w:p>
-    <w:p>
-      <w:pPr>
-        <w:pStyle w:val="BodyText"/>
-        <w:numPr>
-          <w:ilvl w:val="2"/>
-          <w:numId w:val="8"/>
-        </w:numPr>
-        <w:spacing w:after="144"/>
-        <w:contextualSpacing/>
-      </w:pPr>
-      <w:r>
-        <w:t xml:space="preserve">Who did what work (name, address, company, </w:t>
-      </w:r>
-      <w:r>
-        <w:t xml:space="preserve">email, </w:t>
-      </w:r>
-      <w:r>
-        <w:t xml:space="preserve">telephone number, and license number of the </w:t>
-      </w:r>
-      <w:proofErr w:type="spellStart"/>
-      <w:r>
-        <w:t>deleader</w:t>
-      </w:r>
-      <w:proofErr w:type="spellEnd"/>
-      <w:proofErr w:type="gramStart"/>
-      <w:r>
-        <w:t>);</w:t>
-      </w:r>
-      <w:proofErr w:type="gramEnd"/>
-      <w:r>
-        <w:t xml:space="preserve"> </w:t>
-      </w:r>
-    </w:p>
-    <w:p>
-      <w:pPr>
-        <w:pStyle w:val="BodyText"/>
-        <w:numPr>
-          <w:ilvl w:val="2"/>
-          <w:numId w:val="8"/>
-        </w:numPr>
-        <w:spacing w:after="144"/>
-        <w:contextualSpacing/>
-      </w:pPr>
-      <w:r>
-        <w:t>The details of any arrangements for relocation of the tenant during the abatement process (including where the tenant was relocated, how the tenant was relocated, and the payment of any costs associated with such relocation).</w:t>
-      </w:r>
-    </w:p>
-    <w:p>
-      <w:pPr>
-        <w:pStyle w:val="BodyText"/>
-        <w:spacing w:after="144"/>
-        <w:contextualSpacing/>
-      </w:pPr>
-      <w:r>
-        <w:t>{%p endif %}</w:t>
-      </w:r>
-    </w:p>
-    <w:p>
-      <w:pPr>
-        <w:pStyle w:val="BodyText"/>
-        <w:spacing w:after="144"/>
-        <w:contextualSpacing/>
-      </w:pPr>
-      <w:r>
-        <w:t xml:space="preserve">{%p if </w:t>
-      </w:r>
-      <w:proofErr w:type="spellStart"/>
-      <w:r>
-        <w:t>ints.get</w:t>
-      </w:r>
-      <w:proofErr w:type="spellEnd"/>
-      <w:r>
-        <w:t>('</w:t>
-      </w:r>
-      <w:r>
-        <w:t>bad_conditions_tenant_damaged</w:t>
-      </w:r>
-      <w:proofErr w:type="gramStart"/>
-      <w:r>
-        <w:t>',</w:t>
-      </w:r>
-      <w:proofErr w:type="spellStart"/>
-      <w:r>
-        <w:t>DAEmpty</w:t>
-      </w:r>
-      <w:proofErr w:type="spellEnd"/>
-      <w:proofErr w:type="gramEnd"/>
-      <w:r>
-        <w:t>()).checked</w:t>
-      </w:r>
-      <w:r>
-        <w:t xml:space="preserve"> %}</w:t>
-      </w:r>
-    </w:p>
-    <w:p>
-      <w:pPr>
-        <w:pStyle w:val="BodyText"/>
-        <w:numPr>
-          <w:ilvl w:val="0"/>
-          <w:numId w:val="8"/>
-        </w:numPr>
-        <w:spacing w:after="144"/>
-        <w:contextualSpacing/>
-      </w:pPr>
-      <w:r>
-        <w:t>If you claim that the tenant caused any damage to the apartment and/or building, please describe such damage in full and complete detail, including, but not limited to:</w:t>
-      </w:r>
-    </w:p>
-    <w:p>
-      <w:pPr>
-        <w:pStyle w:val="BodyText"/>
-        <w:numPr>
-          <w:ilvl w:val="1"/>
-          <w:numId w:val="8"/>
-        </w:numPr>
-        <w:spacing w:after="144"/>
-        <w:contextualSpacing/>
-      </w:pPr>
-      <w:r>
-        <w:t xml:space="preserve">The substance of such </w:t>
-      </w:r>
-      <w:proofErr w:type="gramStart"/>
-      <w:r>
-        <w:t>damage;</w:t>
-      </w:r>
-      <w:proofErr w:type="gramEnd"/>
-      <w:r>
-        <w:t xml:space="preserve"> </w:t>
-      </w:r>
-    </w:p>
-    <w:p>
-      <w:pPr>
-        <w:pStyle w:val="BodyText"/>
-        <w:numPr>
-          <w:ilvl w:val="1"/>
-          <w:numId w:val="8"/>
-        </w:numPr>
-        <w:spacing w:after="144"/>
-        <w:contextualSpacing/>
-      </w:pPr>
-      <w:r>
-        <w:t xml:space="preserve">Why you believe the tenant caused the </w:t>
-      </w:r>
-      <w:proofErr w:type="gramStart"/>
-      <w:r>
-        <w:t>damage;</w:t>
-      </w:r>
-      <w:proofErr w:type="gramEnd"/>
-    </w:p>
-    <w:p>
-      <w:pPr>
-        <w:pStyle w:val="BodyText"/>
-        <w:numPr>
-          <w:ilvl w:val="1"/>
-          <w:numId w:val="8"/>
-        </w:numPr>
-        <w:spacing w:after="144"/>
-        <w:contextualSpacing/>
-      </w:pPr>
-      <w:r>
-        <w:t xml:space="preserve">What if any repairs were made to such damage, the date(s) of such repairs, and the costs of such </w:t>
-      </w:r>
-      <w:proofErr w:type="gramStart"/>
-      <w:r>
-        <w:t>repairs;</w:t>
-      </w:r>
-      <w:proofErr w:type="gramEnd"/>
-    </w:p>
-    <w:p>
-      <w:pPr>
-        <w:pStyle w:val="BodyText"/>
-        <w:numPr>
-          <w:ilvl w:val="1"/>
-          <w:numId w:val="8"/>
-        </w:numPr>
-        <w:spacing w:after="144"/>
-        <w:contextualSpacing/>
-      </w:pPr>
-      <w:r>
-        <w:t xml:space="preserve">The name(s), address(es), </w:t>
-      </w:r>
-      <w:r>
-        <w:t xml:space="preserve">email </w:t>
-      </w:r>
-      <w:r>
-        <w:t>and telephone number(s) of anyone with knowledge of such damage allegedly caused by the tenant.</w:t>
-      </w:r>
-    </w:p>
-    <w:p>
-      <w:pPr>
-        <w:pStyle w:val="BodyText"/>
-        <w:spacing w:after="144"/>
-        <w:contextualSpacing/>
-      </w:pPr>
-      <w:r>
-        <w:t>{%p endif %}</w:t>
-      </w:r>
-    </w:p>
-    <w:p>
-      <w:pPr>
-        <w:pStyle w:val="BodyText"/>
-        <w:spacing w:after="144"/>
-        <w:contextualSpacing/>
-      </w:pPr>
-      <w:r>
-        <w:t xml:space="preserve">{%p if </w:t>
-      </w:r>
-      <w:proofErr w:type="spellStart"/>
-      <w:r>
-        <w:t>ints.get</w:t>
-      </w:r>
-      <w:proofErr w:type="spellEnd"/>
-      <w:r>
-        <w:t>('</w:t>
-      </w:r>
-      <w:r>
-        <w:t>bad_conditions_tenant_hindered</w:t>
-      </w:r>
-      <w:proofErr w:type="gramStart"/>
-      <w:r>
-        <w:t>',</w:t>
-      </w:r>
-      <w:proofErr w:type="spellStart"/>
-      <w:r>
-        <w:t>DAEmpty</w:t>
-      </w:r>
-      <w:proofErr w:type="spellEnd"/>
-      <w:proofErr w:type="gramEnd"/>
-      <w:r>
-        <w:t>()).checked</w:t>
-      </w:r>
-      <w:r>
-        <w:t xml:space="preserve"> %}</w:t>
-      </w:r>
-    </w:p>
-    <w:p>
-      <w:pPr>
-        <w:pStyle w:val="BodyText"/>
-        <w:numPr>
-          <w:ilvl w:val="0"/>
-          <w:numId w:val="8"/>
-        </w:numPr>
-        <w:spacing w:after="144"/>
-        <w:contextualSpacing/>
-      </w:pPr>
-      <w:r>
-        <w:t>If you claim the tenant prevented or hindered you from inspecting the apartment and/or making repairs, for each attempt to inspect or make repairs, please describe:</w:t>
-      </w:r>
-    </w:p>
-    <w:p>
-      <w:pPr>
-        <w:pStyle w:val="BodyText"/>
-        <w:numPr>
-          <w:ilvl w:val="1"/>
-          <w:numId w:val="8"/>
-        </w:numPr>
-        <w:spacing w:after="144"/>
-        <w:contextualSpacing/>
-      </w:pPr>
-      <w:r>
-        <w:t xml:space="preserve">The date of the </w:t>
-      </w:r>
-      <w:proofErr w:type="gramStart"/>
-      <w:r>
-        <w:t>attempt;</w:t>
-      </w:r>
-      <w:proofErr w:type="gramEnd"/>
-    </w:p>
-    <w:p>
-      <w:pPr>
-        <w:pStyle w:val="BodyText"/>
-        <w:numPr>
-          <w:ilvl w:val="1"/>
-          <w:numId w:val="8"/>
-        </w:numPr>
-        <w:spacing w:after="144"/>
-        <w:contextualSpacing/>
-      </w:pPr>
-      <w:r>
-        <w:t xml:space="preserve">How and when you let the tenant know of your plan to inspect and/or to </w:t>
-      </w:r>
-      <w:proofErr w:type="gramStart"/>
-      <w:r>
-        <w:t>repair;</w:t>
-      </w:r>
-      <w:proofErr w:type="gramEnd"/>
-    </w:p>
-    <w:p>
-      <w:pPr>
-        <w:pStyle w:val="BodyText"/>
-        <w:numPr>
-          <w:ilvl w:val="1"/>
-          <w:numId w:val="8"/>
-        </w:numPr>
-        <w:spacing w:after="144"/>
-        <w:contextualSpacing/>
-      </w:pPr>
-      <w:r>
-        <w:t xml:space="preserve">What the tenant did or said to prevent or hinder the inspection or </w:t>
-      </w:r>
-      <w:proofErr w:type="gramStart"/>
-      <w:r>
-        <w:t>repair;</w:t>
-      </w:r>
-      <w:proofErr w:type="gramEnd"/>
-    </w:p>
-    <w:p>
-      <w:pPr>
-        <w:pStyle w:val="BodyText"/>
-        <w:numPr>
-          <w:ilvl w:val="1"/>
-          <w:numId w:val="8"/>
-        </w:numPr>
-        <w:spacing w:after="144"/>
-        <w:contextualSpacing/>
-      </w:pPr>
-      <w:r>
-        <w:t>The names and addresses of anyone present at the time who has information about the tenant’s interference with the inspection or repair; and</w:t>
-      </w:r>
-    </w:p>
-    <w:p>
-      <w:pPr>
-        <w:pStyle w:val="BodyText"/>
-        <w:numPr>
-          <w:ilvl w:val="1"/>
-          <w:numId w:val="8"/>
-        </w:numPr>
-        <w:spacing w:after="144"/>
-        <w:contextualSpacing/>
-      </w:pPr>
-      <w:r>
-        <w:t>Any financial or other loss suffered as a result of the tenant’s actions or inactions.</w:t>
-      </w:r>
-    </w:p>
-    <w:p>
-      <w:pPr>
-        <w:pStyle w:val="BodyText"/>
-        <w:spacing w:after="144"/>
-        <w:contextualSpacing/>
-      </w:pPr>
-      <w:r>
-        <w:t>{%p endif %}</w:t>
-      </w:r>
-    </w:p>
-    <w:p>
-      <w:pPr>
-        <w:pStyle w:val="BodyText"/>
-        <w:spacing w:after="144"/>
-        <w:contextualSpacing/>
-      </w:pPr>
-      <w:r>
-        <w:t xml:space="preserve">{%p if </w:t>
-      </w:r>
-      <w:r>
-        <w:t>ints.get('</w:t>
-      </w:r>
-      <w:r>
-        <w:t>bad_conditions_landlord_entered_premises</w:t>
-      </w:r>
-      <w:proofErr w:type="gramStart"/>
-      <w:r>
-        <w:t>',DAEmpty</w:t>
-      </w:r>
-      <w:proofErr w:type="gramEnd"/>
-      <w:r>
-        <w:t>()).checked</w:t>
-      </w:r>
-      <w:r>
-        <w:t xml:space="preserve"> %}</w:t>
-      </w:r>
-    </w:p>
-    <w:p>
-      <w:pPr>
-        <w:pStyle w:val="BodyText"/>
-        <w:numPr>
-          <w:ilvl w:val="0"/>
-          <w:numId w:val="8"/>
-        </w:numPr>
-        <w:spacing w:after="144"/>
-        <w:contextualSpacing/>
-      </w:pPr>
-      <w:r>
-        <w:t xml:space="preserve">If you or anyone on your behalf has been inside the tenant’s apartment </w:t>
-      </w:r>
-      <w:r>
-        <w:t xml:space="preserve">within the most recent 6 years of the tenant’s tenancy </w:t>
-      </w:r>
-      <w:r>
-        <w:t>(or before the tenancy for the purpose of renting to/preparing the apartment for the tenant), please state who was inside the apartment, when, and why s/he was there.</w:t>
-      </w:r>
-    </w:p>
-    <w:p>
-      <w:pPr>
-        <w:pStyle w:val="BodyText"/>
-        <w:spacing w:after="144"/>
-        <w:contextualSpacing/>
-      </w:pPr>
-      <w:r>
-        <w:t>{%p endif %}</w:t>
-      </w:r>
-    </w:p>
-    <w:p>
-      <w:pPr>
-        <w:pStyle w:val="BodyText"/>
-        <w:spacing w:after="144"/>
-        <w:contextualSpacing/>
-      </w:pPr>
-      <w:r>
-        <w:t xml:space="preserve">{%p if </w:t>
-      </w:r>
-      <w:r>
-        <w:t>ints.get('</w:t>
-      </w:r>
-      <w:r>
-        <w:t>bad_conditions_describe_maintenance</w:t>
-      </w:r>
-      <w:proofErr w:type="gramStart"/>
-      <w:r>
-        <w:t>',DAEmpty</w:t>
-      </w:r>
-      <w:proofErr w:type="gramEnd"/>
-      <w:r>
-        <w:t>()).checked</w:t>
-      </w:r>
-      <w:r>
-        <w:t xml:space="preserve"> %}</w:t>
-      </w:r>
-    </w:p>
-    <w:p>
-      <w:pPr>
-        <w:pStyle w:val="BodyText"/>
-        <w:numPr>
-          <w:ilvl w:val="0"/>
-          <w:numId w:val="8"/>
-        </w:numPr>
-        <w:spacing w:after="144"/>
-        <w:contextualSpacing/>
-      </w:pPr>
-      <w:r>
-        <w:t xml:space="preserve">Please describe in full and complete detail the maintenance and management of the apartment and/or building during the tenancy, including, but not limited to, the name of the management company, the identity (by name and address) of each responsible person, a description of each </w:t>
-      </w:r>
-      <w:r>
-        <w:lastRenderedPageBreak/>
-        <w:t>such person’s duties, for how long s/he has managed and/or maintained the building, and his or her job training/experience/qualifications.</w:t>
+        <w:t>company, the identity (by name and address) of each responsible person, a description of each such person’s duties, for how long s/he has managed and/or maintained the building, and his or her job training/experience/qualifications.</w:t>
       </w:r>
     </w:p>
     <w:p>
@@ -4853,6 +4879,7 @@
         <w:contextualSpacing/>
       </w:pPr>
       <w:r>
+        <w:lastRenderedPageBreak/>
         <w:t>{%p endif %}</w:t>
       </w:r>
     </w:p>
@@ -4863,7 +4890,6 @@
         <w:contextualSpacing/>
       </w:pPr>
       <w:r>
-        <w:lastRenderedPageBreak/>
         <w:t xml:space="preserve">{%p if </w:t>
       </w:r>
       <w:proofErr w:type="spellStart"/>
@@ -5369,7 +5395,7 @@
         <w:pStyle w:val="CenterTitle"/>
         <w:spacing w:line="360" w:lineRule="auto"/>
         <w:rPr>
-          <w:rFonts w:ascii="Times New Roman;serif" w:hAnsi="Times New Roman;serif"/>
+          <w:rFonts w:ascii="Times New Roman;serif" w:hAnsi="Times New Roman;serif" w:hint="eastAsia"/>
         </w:rPr>
       </w:pPr>
       <w:r>
@@ -5446,11 +5472,8 @@
         <w:contextualSpacing/>
       </w:pPr>
       <w:r>
-        <w:t xml:space="preserve">Please describe in full detail your knowledge, belief, and/or information, at any time through and including the date of your interrogatory responses, that the Tenant or a household member has a mental and/or physical disability of any kind, including but not limited to the substance of, and </w:t>
-      </w:r>
-      <w:r>
         <w:lastRenderedPageBreak/>
-        <w:t>the factual basis for, such knowledge, information and/or belief (including, for example, reports, observations, and communication with others).</w:t>
+        <w:t>Please describe in full detail your knowledge, belief, and/or information, at any time through and including the date of your interrogatory responses, that the Tenant or a household member has a mental and/or physical disability of any kind, including but not limited to the substance of, and the factual basis for, such knowledge, information and/or belief (including, for example, reports, observations, and communication with others).</w:t>
       </w:r>
     </w:p>
     <w:p>
@@ -5814,6 +5837,7 @@
         </w:rPr>
       </w:pPr>
       <w:r>
+        <w:lastRenderedPageBreak/>
         <w:t xml:space="preserve">{%p if </w:t>
       </w:r>
       <w:proofErr w:type="spellStart"/>
@@ -5869,7 +5893,6 @@
         <w:rPr>
           <w:rFonts w:eastAsia="Times New Roman" w:cs="Times New Roman"/>
         </w:rPr>
-        <w:lastRenderedPageBreak/>
         <w:t>{%p endif %}</w:t>
       </w:r>
     </w:p>
@@ -6426,6 +6449,7 @@
         <w:contextualSpacing/>
       </w:pPr>
       <w:r>
+        <w:lastRenderedPageBreak/>
         <w:t>{%p endif %}</w:t>
       </w:r>
     </w:p>
@@ -6491,7 +6515,6 @@
         <w:contextualSpacing/>
       </w:pPr>
       <w:r>
-        <w:lastRenderedPageBreak/>
         <w:t xml:space="preserve">(i.e., for how much you could rent the apartment in good condition) for each year of the tenant’s </w:t>
       </w:r>
       <w:proofErr w:type="gramStart"/>
@@ -7416,10 +7439,7 @@
         </w:numPr>
       </w:pPr>
       <w:r>
-        <w:t xml:space="preserve">All documents related to rental assistance (or other subsidy or financial assistance, whether from RAFT or other any program) for the tenant's rent/use and occupancy for the apartment, including e.g. documents reflecting request(s), your response(s), or other communications, and any documents exchanged concerning such </w:t>
-      </w:r>
-      <w:r>
-        <w:t>assistance.</w:t>
+        <w:t>All documents related to rental assistance (or other subsidy or financial assistance, whether from RAFT or other any program) for the tenant's rent/use and occupancy for the apartment, including e.g. documents reflecting request(s), your response(s), or other communications, and any documents exchanged concerning such assistance.</w:t>
       </w:r>
     </w:p>
     <w:p>
@@ -7545,6 +7565,7 @@
         <w:pStyle w:val="BodyText"/>
       </w:pPr>
       <w:r>
+        <w:lastRenderedPageBreak/>
         <w:t>{%p endif %}</w:t>
       </w:r>
     </w:p>
@@ -7553,7 +7574,6 @@
         <w:pStyle w:val="BodyText"/>
       </w:pPr>
       <w:r>
-        <w:lastRenderedPageBreak/>
         <w:t xml:space="preserve">{%p if </w:t>
       </w:r>
       <w:proofErr w:type="spellStart"/>
@@ -8020,6 +8040,7 @@
         <w:pStyle w:val="BodyText"/>
       </w:pPr>
       <w:r>
+        <w:lastRenderedPageBreak/>
         <w:t xml:space="preserve">{%p if </w:t>
       </w:r>
       <w:proofErr w:type="spellStart"/>
@@ -8059,7 +8080,6 @@
         </w:numPr>
       </w:pPr>
       <w:r>
-        <w:lastRenderedPageBreak/>
         <w:t>All documents related to any informal conference and/or grievance hearings during the tenancy.</w:t>
       </w:r>
     </w:p>
@@ -8451,6 +8471,7 @@
         <w:pStyle w:val="BodyText"/>
       </w:pPr>
       <w:r>
+        <w:lastRenderedPageBreak/>
         <w:t xml:space="preserve">{%p if </w:t>
       </w:r>
       <w:proofErr w:type="spellStart"/>
@@ -8490,7 +8511,6 @@
         </w:numPr>
       </w:pPr>
       <w:r>
-        <w:lastRenderedPageBreak/>
         <w:t>All documents concerning conditions in the tenant’s apartment and/or in the common areas or systems of the building, including complaints, inspection reports and requests for repairs by the tenant or any other person or agency.</w:t>
       </w:r>
     </w:p>
@@ -8862,6 +8882,7 @@
         <w:pStyle w:val="BodyText"/>
       </w:pPr>
       <w:r>
+        <w:lastRenderedPageBreak/>
         <w:t xml:space="preserve">{%p if </w:t>
       </w:r>
       <w:proofErr w:type="spellStart"/>
@@ -8901,7 +8922,6 @@
         </w:numPr>
       </w:pPr>
       <w:r>
-        <w:lastRenderedPageBreak/>
         <w:t>Any documents concerning accounts that the landlord has or has had for common area water and other utility usage in the building.</w:t>
       </w:r>
     </w:p>
@@ -9261,6 +9281,7 @@
         <w:pStyle w:val="BodyText"/>
       </w:pPr>
       <w:r>
+        <w:lastRenderedPageBreak/>
         <w:t xml:space="preserve">{%p if </w:t>
       </w:r>
       <w:proofErr w:type="spellStart"/>
@@ -9300,7 +9321,6 @@
         </w:numPr>
       </w:pPr>
       <w:r>
-        <w:lastRenderedPageBreak/>
         <w:t xml:space="preserve">Any documents concerning any incident(s)of domestic violence against the tenant or a household member at in the apartment including but not limited to police reports, restraining orders, requests for lock changes for safety reasons and/or and early lease termination of the tenancy agreement. </w:t>
       </w:r>
     </w:p>

</xml_diff>